<commit_message>
Updated Ved's Age to 6
</commit_message>
<xml_diff>
--- a/The_A_Shorts/2. Vyuthi/Vyuthi - Screenplay.docx
+++ b/The_A_Shorts/2. Vyuthi/Vyuthi - Screenplay.docx
@@ -959,7 +959,23 @@
           <w:b/>
           <w:bCs/>
         </w:rPr>
-        <w:t>Ved (12)</w:t>
+        <w:t>Ved (</w:t>
+      </w:r>
+      <w:r>
+        <w:rPr>
+          <w:rFonts w:ascii="Courier New" w:hAnsi="Courier New" w:cs="Courier New"/>
+          <w:b/>
+          <w:bCs/>
+        </w:rPr>
+        <w:t>6</w:t>
+      </w:r>
+      <w:r>
+        <w:rPr>
+          <w:rFonts w:ascii="Courier New" w:hAnsi="Courier New" w:cs="Courier New"/>
+          <w:b/>
+          <w:bCs/>
+        </w:rPr>
+        <w:t>)</w:t>
       </w:r>
       <w:r>
         <w:rPr>
@@ -25730,13 +25746,7 @@
         <w:rPr>
           <w:rFonts w:ascii="Courier New" w:hAnsi="Courier New" w:cs="Courier New"/>
         </w:rPr>
-        <w:t>in front of him</w:t>
-      </w:r>
-      <w:r>
-        <w:rPr>
-          <w:rFonts w:ascii="Courier New" w:hAnsi="Courier New" w:cs="Courier New"/>
-        </w:rPr>
-        <w:t>. H</w:t>
+        <w:t>in front of him. H</w:t>
       </w:r>
       <w:r>
         <w:rPr>
@@ -25825,13 +25835,7 @@
         <w:rPr>
           <w:rFonts w:ascii="Courier New" w:hAnsi="Courier New" w:cs="Courier New"/>
         </w:rPr>
-        <w:t>holding a card</w:t>
-      </w:r>
-      <w:r>
-        <w:rPr>
-          <w:rFonts w:ascii="Courier New" w:hAnsi="Courier New" w:cs="Courier New"/>
-        </w:rPr>
-        <w:t xml:space="preserve"> extends </w:t>
+        <w:t xml:space="preserve">holding a card extends </w:t>
       </w:r>
       <w:r>
         <w:rPr>
@@ -25997,19 +26001,7 @@
         <w:rPr>
           <w:rFonts w:ascii="Courier New" w:hAnsi="Courier New" w:cs="Courier New"/>
         </w:rPr>
-        <w:t xml:space="preserve">He gets </w:t>
-      </w:r>
-      <w:r>
-        <w:rPr>
-          <w:rFonts w:ascii="Courier New" w:hAnsi="Courier New" w:cs="Courier New"/>
-        </w:rPr>
-        <w:t xml:space="preserve">terrified </w:t>
-      </w:r>
-      <w:r>
-        <w:rPr>
-          <w:rFonts w:ascii="Courier New" w:hAnsi="Courier New" w:cs="Courier New"/>
-        </w:rPr>
-        <w:t>and t</w:t>
+        <w:t>He gets terrified and t</w:t>
       </w:r>
       <w:r>
         <w:rPr>

</xml_diff>

<commit_message>
Vyuthi Screenplay Redo - S28
</commit_message>
<xml_diff>
--- a/The_A_Shorts/2. Vyuthi/Vyuthi - Screenplay.docx
+++ b/The_A_Shorts/2. Vyuthi/Vyuthi - Screenplay.docx
@@ -27033,6 +27033,7 @@
         </w:rPr>
         <w:t xml:space="preserve">- </w:t>
       </w:r>
+      <w:proofErr w:type="gramStart"/>
       <w:r>
         <w:rPr>
           <w:rFonts w:ascii="Courier New" w:hAnsi="Courier New" w:cs="Courier New"/>
@@ -27063,6 +27064,7 @@
         </w:rPr>
         <w:t>ff</w:t>
       </w:r>
+      <w:proofErr w:type="gramEnd"/>
       <w:r>
         <w:rPr>
           <w:rFonts w:ascii="Courier New" w:hAnsi="Courier New" w:cs="Courier New"/>
@@ -31952,16 +31954,100 @@
         <w:rPr>
           <w:rFonts w:ascii="Courier New" w:hAnsi="Courier New" w:cs="Courier New"/>
         </w:rPr>
-        <w:t>hellscape.</w:t>
-      </w:r>
-    </w:p>
-    <w:p>
-      <w:pPr>
-        <w:spacing w:line="240" w:lineRule="auto"/>
-        <w:rPr>
-          <w:rFonts w:ascii="Courier New" w:hAnsi="Courier New" w:cs="Courier New"/>
-        </w:rPr>
-      </w:pPr>
+        <w:t>hellscape</w:t>
+      </w:r>
+      <w:r>
+        <w:rPr>
+          <w:rFonts w:ascii="Courier New" w:hAnsi="Courier New" w:cs="Courier New"/>
+        </w:rPr>
+        <w:t>.</w:t>
+      </w:r>
+    </w:p>
+    <w:p>
+      <w:pPr>
+        <w:spacing w:line="240" w:lineRule="auto"/>
+        <w:rPr>
+          <w:rFonts w:ascii="Courier New" w:hAnsi="Courier New" w:cs="Courier New"/>
+        </w:rPr>
+      </w:pPr>
+      <w:r>
+        <w:rPr>
+          <w:rFonts w:ascii="Courier New" w:hAnsi="Courier New" w:cs="Courier New"/>
+        </w:rPr>
+        <w:t>W</w:t>
+      </w:r>
+      <w:r>
+        <w:rPr>
+          <w:rFonts w:ascii="Courier New" w:hAnsi="Courier New" w:cs="Courier New"/>
+        </w:rPr>
+        <w:t>ith</w:t>
+      </w:r>
+      <w:r>
+        <w:rPr>
+          <w:rFonts w:ascii="Courier New" w:hAnsi="Courier New" w:cs="Courier New"/>
+        </w:rPr>
+        <w:t xml:space="preserve"> t</w:t>
+      </w:r>
+      <w:r>
+        <w:rPr>
+          <w:rFonts w:ascii="Courier New" w:hAnsi="Courier New" w:cs="Courier New"/>
+        </w:rPr>
+        <w:t>wo RED SUNS in the blood-colored sky</w:t>
+      </w:r>
+      <w:r>
+        <w:rPr>
+          <w:rFonts w:ascii="Courier New" w:hAnsi="Courier New" w:cs="Courier New"/>
+        </w:rPr>
+        <w:t xml:space="preserve"> and a</w:t>
+      </w:r>
+      <w:r>
+        <w:rPr>
+          <w:rFonts w:ascii="Courier New" w:hAnsi="Courier New" w:cs="Courier New"/>
+        </w:rPr>
+        <w:t xml:space="preserve"> swirling </w:t>
+      </w:r>
+      <w:r>
+        <w:rPr>
+          <w:rFonts w:ascii="Courier New" w:hAnsi="Courier New" w:cs="Courier New"/>
+        </w:rPr>
+        <w:t xml:space="preserve">dark vortex </w:t>
+      </w:r>
+      <w:r>
+        <w:rPr>
+          <w:rFonts w:ascii="Courier New" w:hAnsi="Courier New" w:cs="Courier New"/>
+        </w:rPr>
+        <w:t>spin</w:t>
+      </w:r>
+      <w:r>
+        <w:rPr>
+          <w:rFonts w:ascii="Courier New" w:hAnsi="Courier New" w:cs="Courier New"/>
+        </w:rPr>
+        <w:t>ning</w:t>
+      </w:r>
+      <w:r>
+        <w:rPr>
+          <w:rFonts w:ascii="Courier New" w:hAnsi="Courier New" w:cs="Courier New"/>
+        </w:rPr>
+        <w:t xml:space="preserve"> </w:t>
+      </w:r>
+      <w:r>
+        <w:rPr>
+          <w:rFonts w:ascii="Courier New" w:hAnsi="Courier New" w:cs="Courier New"/>
+        </w:rPr>
+        <w:t>eating the space</w:t>
+      </w:r>
+      <w:r>
+        <w:rPr>
+          <w:rFonts w:ascii="Courier New" w:hAnsi="Courier New" w:cs="Courier New"/>
+        </w:rPr>
+        <w:t xml:space="preserve"> itself.</w:t>
+      </w:r>
+      <w:r>
+        <w:rPr>
+          <w:rFonts w:ascii="Courier New" w:hAnsi="Courier New" w:cs="Courier New"/>
+        </w:rPr>
+        <w:t xml:space="preserve"> </w:t>
+      </w:r>
       <w:r>
         <w:rPr>
           <w:rFonts w:ascii="Courier New" w:hAnsi="Courier New" w:cs="Courier New"/>
@@ -32040,13 +32126,39 @@
         <w:rPr>
           <w:rFonts w:ascii="Courier New" w:hAnsi="Courier New" w:cs="Courier New"/>
         </w:rPr>
-        <w:t>Looks around and hides</w:t>
-      </w:r>
-      <w:r>
-        <w:rPr>
-          <w:rFonts w:ascii="Courier New" w:hAnsi="Courier New" w:cs="Courier New"/>
-        </w:rPr>
-        <w:t>. G</w:t>
+        <w:t>l</w:t>
+      </w:r>
+      <w:r>
+        <w:rPr>
+          <w:rFonts w:ascii="Courier New" w:hAnsi="Courier New" w:cs="Courier New"/>
+        </w:rPr>
+        <w:t>ooks around and hides</w:t>
+      </w:r>
+      <w:r>
+        <w:rPr>
+          <w:rFonts w:ascii="Courier New" w:hAnsi="Courier New" w:cs="Courier New"/>
+        </w:rPr>
+        <w:t xml:space="preserve">. </w:t>
+      </w:r>
+    </w:p>
+    <w:p>
+      <w:pPr>
+        <w:spacing w:line="240" w:lineRule="auto"/>
+        <w:rPr>
+          <w:rFonts w:ascii="Courier New" w:hAnsi="Courier New" w:cs="Courier New"/>
+        </w:rPr>
+      </w:pPr>
+      <w:r>
+        <w:rPr>
+          <w:rFonts w:ascii="Courier New" w:hAnsi="Courier New" w:cs="Courier New"/>
+        </w:rPr>
+        <w:t xml:space="preserve">He is attentive. </w:t>
+      </w:r>
+      <w:r>
+        <w:rPr>
+          <w:rFonts w:ascii="Courier New" w:hAnsi="Courier New" w:cs="Courier New"/>
+        </w:rPr>
+        <w:t>G</w:t>
       </w:r>
       <w:r>
         <w:rPr>
@@ -32084,25 +32196,11 @@
         </w:rPr>
         <w:t>.</w:t>
       </w:r>
-    </w:p>
-    <w:p>
-      <w:pPr>
-        <w:spacing w:line="240" w:lineRule="auto"/>
-        <w:rPr>
-          <w:rFonts w:ascii="Courier New" w:hAnsi="Courier New" w:cs="Courier New"/>
-        </w:rPr>
-      </w:pPr>
-      <w:r>
-        <w:rPr>
-          <w:rFonts w:ascii="Courier New" w:hAnsi="Courier New" w:cs="Courier New"/>
-        </w:rPr>
-        <w:t xml:space="preserve">He is </w:t>
-      </w:r>
-      <w:r>
-        <w:rPr>
-          <w:rFonts w:ascii="Courier New" w:hAnsi="Courier New" w:cs="Courier New"/>
-        </w:rPr>
-        <w:t xml:space="preserve">Attentive. </w:t>
+      <w:r>
+        <w:rPr>
+          <w:rFonts w:ascii="Courier New" w:hAnsi="Courier New" w:cs="Courier New"/>
+        </w:rPr>
+        <w:t xml:space="preserve"> </w:t>
       </w:r>
       <w:r>
         <w:rPr>
@@ -32190,31 +32288,61 @@
         </w:rPr>
         <w:t>.</w:t>
       </w:r>
-      <w:r>
-        <w:rPr>
-          <w:rFonts w:ascii="Courier New" w:hAnsi="Courier New" w:cs="Courier New"/>
-        </w:rPr>
-        <w:t xml:space="preserve"> Suddenly-</w:t>
-      </w:r>
-      <w:r>
-        <w:rPr>
-          <w:rFonts w:ascii="Courier New" w:hAnsi="Courier New" w:cs="Courier New"/>
-        </w:rPr>
-        <w:t xml:space="preserve"> </w:t>
-      </w:r>
-    </w:p>
-    <w:p>
-      <w:pPr>
-        <w:spacing w:line="240" w:lineRule="auto"/>
-        <w:rPr>
-          <w:rFonts w:ascii="Courier New" w:hAnsi="Courier New" w:cs="Courier New"/>
-        </w:rPr>
-      </w:pPr>
-      <w:r>
-        <w:rPr>
-          <w:rFonts w:ascii="Courier New" w:hAnsi="Courier New" w:cs="Courier New"/>
-        </w:rPr>
-        <w:t xml:space="preserve">They grip his face, arms, chest, smothering </w:t>
+    </w:p>
+    <w:p>
+      <w:pPr>
+        <w:spacing w:line="240" w:lineRule="auto"/>
+        <w:rPr>
+          <w:rFonts w:ascii="Courier New" w:hAnsi="Courier New" w:cs="Courier New"/>
+        </w:rPr>
+      </w:pPr>
+      <w:r>
+        <w:rPr>
+          <w:rFonts w:ascii="Courier New" w:hAnsi="Courier New" w:cs="Courier New"/>
+        </w:rPr>
+        <w:t>GRAB</w:t>
+      </w:r>
+      <w:r>
+        <w:rPr>
+          <w:rFonts w:ascii="Courier New" w:hAnsi="Courier New" w:cs="Courier New"/>
+        </w:rPr>
+        <w:t>-</w:t>
+      </w:r>
+      <w:r>
+        <w:rPr>
+          <w:rFonts w:ascii="Courier New" w:hAnsi="Courier New" w:cs="Courier New"/>
+        </w:rPr>
+        <w:t xml:space="preserve"> </w:t>
+      </w:r>
+      <w:r>
+        <w:rPr>
+          <w:rFonts w:ascii="Courier New" w:hAnsi="Courier New" w:cs="Courier New"/>
+        </w:rPr>
+        <w:t>The</w:t>
+      </w:r>
+      <w:r>
+        <w:rPr>
+          <w:rFonts w:ascii="Courier New" w:hAnsi="Courier New" w:cs="Courier New"/>
+        </w:rPr>
+        <w:t xml:space="preserve"> hands </w:t>
+      </w:r>
+      <w:r>
+        <w:rPr>
+          <w:rFonts w:ascii="Courier New" w:hAnsi="Courier New" w:cs="Courier New"/>
+        </w:rPr>
+        <w:t>grip his face, arms</w:t>
+      </w:r>
+      <w:r>
+        <w:rPr>
+          <w:rFonts w:ascii="Courier New" w:hAnsi="Courier New" w:cs="Courier New"/>
+        </w:rPr>
+        <w:t xml:space="preserve"> and </w:t>
+      </w:r>
+      <w:r>
+        <w:rPr>
+          <w:rFonts w:ascii="Courier New" w:hAnsi="Courier New" w:cs="Courier New"/>
+        </w:rPr>
+        <w:t xml:space="preserve">chest, smothering </w:t>
       </w:r>
       <w:r>
         <w:rPr>
@@ -32226,14 +32354,28 @@
         <w:rPr>
           <w:rFonts w:ascii="Courier New" w:hAnsi="Courier New" w:cs="Courier New"/>
         </w:rPr>
-        <w:t>him.</w:t>
-      </w:r>
-      <w:r>
-        <w:rPr>
-          <w:rFonts w:ascii="Courier New" w:hAnsi="Courier New" w:cs="Courier New"/>
-        </w:rPr>
-        <w:t xml:space="preserve"> </w:t>
-      </w:r>
+        <w:t>him</w:t>
+      </w:r>
+      <w:r>
+        <w:rPr>
+          <w:rFonts w:ascii="Courier New" w:hAnsi="Courier New" w:cs="Courier New"/>
+        </w:rPr>
+        <w:t>.</w:t>
+      </w:r>
+      <w:r>
+        <w:rPr>
+          <w:rFonts w:ascii="Courier New" w:hAnsi="Courier New" w:cs="Courier New"/>
+        </w:rPr>
+        <w:t xml:space="preserve"> </w:t>
+      </w:r>
+    </w:p>
+    <w:p>
+      <w:pPr>
+        <w:spacing w:line="240" w:lineRule="auto"/>
+        <w:rPr>
+          <w:rFonts w:ascii="Courier New" w:hAnsi="Courier New" w:cs="Courier New"/>
+        </w:rPr>
+      </w:pPr>
       <w:r>
         <w:rPr>
           <w:rFonts w:ascii="Courier New" w:hAnsi="Courier New" w:cs="Courier New"/>
@@ -32256,7 +32398,7 @@
         <w:rPr>
           <w:rFonts w:ascii="Courier New" w:hAnsi="Courier New" w:cs="Courier New"/>
         </w:rPr>
-        <w:t>hold</w:t>
+        <w:t>pull</w:t>
       </w:r>
       <w:r>
         <w:rPr>
@@ -32268,7 +32410,141 @@
         <w:rPr>
           <w:rFonts w:ascii="Courier New" w:hAnsi="Courier New" w:cs="Courier New"/>
         </w:rPr>
-        <w:t xml:space="preserve"> and pull</w:t>
+        <w:t xml:space="preserve"> his head back</w:t>
+      </w:r>
+      <w:r>
+        <w:rPr>
+          <w:rFonts w:ascii="Courier New" w:hAnsi="Courier New" w:cs="Courier New"/>
+        </w:rPr>
+        <w:t>ward</w:t>
+      </w:r>
+      <w:r>
+        <w:rPr>
+          <w:rFonts w:ascii="Courier New" w:hAnsi="Courier New" w:cs="Courier New"/>
+        </w:rPr>
+        <w:t xml:space="preserve">, </w:t>
+      </w:r>
+      <w:r>
+        <w:rPr>
+          <w:rFonts w:ascii="Courier New" w:hAnsi="Courier New" w:cs="Courier New"/>
+        </w:rPr>
+        <w:t>a</w:t>
+      </w:r>
+      <w:r>
+        <w:rPr>
+          <w:rFonts w:ascii="Courier New" w:hAnsi="Courier New" w:cs="Courier New"/>
+        </w:rPr>
+        <w:t xml:space="preserve">nother </w:t>
+      </w:r>
+      <w:r>
+        <w:rPr>
+          <w:rFonts w:ascii="Courier New" w:hAnsi="Courier New" w:cs="Courier New"/>
+        </w:rPr>
+        <w:t>grabs his face</w:t>
+      </w:r>
+      <w:r>
+        <w:rPr>
+          <w:rFonts w:ascii="Courier New" w:hAnsi="Courier New" w:cs="Courier New"/>
+        </w:rPr>
+        <w:t xml:space="preserve"> and a</w:t>
+      </w:r>
+      <w:r>
+        <w:rPr>
+          <w:rFonts w:ascii="Courier New" w:hAnsi="Courier New" w:cs="Courier New"/>
+        </w:rPr>
+        <w:t>nother</w:t>
+      </w:r>
+      <w:r>
+        <w:rPr>
+          <w:rFonts w:ascii="Courier New" w:hAnsi="Courier New" w:cs="Courier New"/>
+        </w:rPr>
+        <w:t xml:space="preserve"> </w:t>
+      </w:r>
+      <w:r>
+        <w:rPr>
+          <w:rFonts w:ascii="Courier New" w:hAnsi="Courier New" w:cs="Courier New"/>
+        </w:rPr>
+        <w:t>holds his arms</w:t>
+      </w:r>
+      <w:r>
+        <w:rPr>
+          <w:rFonts w:ascii="Courier New" w:hAnsi="Courier New" w:cs="Courier New"/>
+        </w:rPr>
+        <w:t xml:space="preserve"> </w:t>
+      </w:r>
+      <w:r>
+        <w:rPr>
+          <w:rFonts w:ascii="Courier New" w:hAnsi="Courier New" w:cs="Courier New"/>
+        </w:rPr>
+        <w:t xml:space="preserve">and burns </w:t>
+      </w:r>
+      <w:r>
+        <w:rPr>
+          <w:rFonts w:ascii="Courier New" w:hAnsi="Courier New" w:cs="Courier New"/>
+        </w:rPr>
+        <w:t>it</w:t>
+      </w:r>
+      <w:r>
+        <w:rPr>
+          <w:rFonts w:ascii="Courier New" w:hAnsi="Courier New" w:cs="Courier New"/>
+        </w:rPr>
+        <w:t>.</w:t>
+      </w:r>
+    </w:p>
+    <w:p>
+      <w:pPr>
+        <w:spacing w:line="240" w:lineRule="auto"/>
+        <w:rPr>
+          <w:rFonts w:ascii="Courier New" w:hAnsi="Courier New" w:cs="Courier New"/>
+        </w:rPr>
+      </w:pPr>
+      <w:r>
+        <w:rPr>
+          <w:rFonts w:ascii="Courier New" w:hAnsi="Courier New" w:cs="Courier New"/>
+        </w:rPr>
+        <w:t>C</w:t>
+      </w:r>
+      <w:r>
+        <w:rPr>
+          <w:rFonts w:ascii="Courier New" w:hAnsi="Courier New" w:cs="Courier New"/>
+        </w:rPr>
+        <w:t>hoking</w:t>
+      </w:r>
+      <w:r>
+        <w:rPr>
+          <w:rFonts w:ascii="Courier New" w:hAnsi="Courier New" w:cs="Courier New"/>
+        </w:rPr>
+        <w:t xml:space="preserve"> and </w:t>
+      </w:r>
+      <w:r>
+        <w:rPr>
+          <w:rFonts w:ascii="Courier New" w:hAnsi="Courier New" w:cs="Courier New"/>
+        </w:rPr>
+        <w:t xml:space="preserve">struggling, </w:t>
+      </w:r>
+      <w:r>
+        <w:rPr>
+          <w:rFonts w:ascii="Courier New" w:hAnsi="Courier New" w:cs="Courier New"/>
+        </w:rPr>
+        <w:t>w</w:t>
+      </w:r>
+      <w:r>
+        <w:rPr>
+          <w:rFonts w:ascii="Courier New" w:hAnsi="Courier New" w:cs="Courier New"/>
+        </w:rPr>
+        <w:t xml:space="preserve">ith all his might, </w:t>
+      </w:r>
+      <w:r>
+        <w:rPr>
+          <w:rFonts w:ascii="Courier New" w:hAnsi="Courier New" w:cs="Courier New"/>
+        </w:rPr>
+        <w:t xml:space="preserve">he grabs </w:t>
+      </w:r>
+      <w:r>
+        <w:rPr>
+          <w:rFonts w:ascii="Courier New" w:hAnsi="Courier New" w:cs="Courier New"/>
+        </w:rPr>
+        <w:t>the hand</w:t>
       </w:r>
       <w:r>
         <w:rPr>
@@ -32280,75 +32556,233 @@
         <w:rPr>
           <w:rFonts w:ascii="Courier New" w:hAnsi="Courier New" w:cs="Courier New"/>
         </w:rPr>
-        <w:t xml:space="preserve"> his head back</w:t>
-      </w:r>
-      <w:r>
-        <w:rPr>
-          <w:rFonts w:ascii="Courier New" w:hAnsi="Courier New" w:cs="Courier New"/>
-        </w:rPr>
-        <w:t xml:space="preserve"> while</w:t>
-      </w:r>
-      <w:r>
-        <w:rPr>
-          <w:rFonts w:ascii="Courier New" w:hAnsi="Courier New" w:cs="Courier New"/>
-        </w:rPr>
-        <w:t xml:space="preserve"> </w:t>
-      </w:r>
-      <w:r>
-        <w:rPr>
-          <w:rFonts w:ascii="Courier New" w:hAnsi="Courier New" w:cs="Courier New"/>
-        </w:rPr>
-        <w:t>a</w:t>
-      </w:r>
-      <w:r>
-        <w:rPr>
-          <w:rFonts w:ascii="Courier New" w:hAnsi="Courier New" w:cs="Courier New"/>
-        </w:rPr>
-        <w:t>nother holds and burns his arms.</w:t>
-      </w:r>
-    </w:p>
-    <w:p>
-      <w:pPr>
-        <w:spacing w:line="240" w:lineRule="auto"/>
-        <w:rPr>
-          <w:rFonts w:ascii="Courier New" w:hAnsi="Courier New" w:cs="Courier New"/>
-        </w:rPr>
-      </w:pPr>
-      <w:r>
-        <w:rPr>
-          <w:rFonts w:ascii="Courier New" w:hAnsi="Courier New" w:cs="Courier New"/>
-        </w:rPr>
-        <w:t xml:space="preserve">He </w:t>
-      </w:r>
-      <w:r>
-        <w:rPr>
-          <w:rFonts w:ascii="Courier New" w:hAnsi="Courier New" w:cs="Courier New"/>
-        </w:rPr>
-        <w:t xml:space="preserve">struggles— </w:t>
-      </w:r>
-      <w:r>
-        <w:rPr>
-          <w:rFonts w:ascii="Courier New" w:hAnsi="Courier New" w:cs="Courier New"/>
-        </w:rPr>
-        <w:t>C</w:t>
-      </w:r>
-      <w:r>
-        <w:rPr>
-          <w:rFonts w:ascii="Courier New" w:hAnsi="Courier New" w:cs="Courier New"/>
-        </w:rPr>
-        <w:t>hoking</w:t>
-      </w:r>
-      <w:r>
-        <w:rPr>
-          <w:rFonts w:ascii="Courier New" w:hAnsi="Courier New" w:cs="Courier New"/>
-        </w:rPr>
-        <w:t xml:space="preserve"> and </w:t>
-      </w:r>
-      <w:r>
-        <w:rPr>
-          <w:rFonts w:ascii="Courier New" w:hAnsi="Courier New" w:cs="Courier New"/>
-        </w:rPr>
-        <w:t>suffocating</w:t>
+        <w:t xml:space="preserve"> over his </w:t>
+      </w:r>
+      <w:r>
+        <w:rPr>
+          <w:rFonts w:ascii="Courier New" w:hAnsi="Courier New" w:cs="Courier New"/>
+        </w:rPr>
+        <w:t>face</w:t>
+      </w:r>
+      <w:r>
+        <w:rPr>
+          <w:rFonts w:ascii="Courier New" w:hAnsi="Courier New" w:cs="Courier New"/>
+        </w:rPr>
+        <w:t xml:space="preserve"> </w:t>
+      </w:r>
+      <w:r>
+        <w:rPr>
+          <w:rFonts w:ascii="Courier New" w:hAnsi="Courier New" w:cs="Courier New"/>
+        </w:rPr>
+        <w:t xml:space="preserve">and </w:t>
+      </w:r>
+      <w:r>
+        <w:rPr>
+          <w:rFonts w:ascii="Courier New" w:hAnsi="Courier New" w:cs="Courier New"/>
+        </w:rPr>
+        <w:t xml:space="preserve">rips </w:t>
+      </w:r>
+      <w:r>
+        <w:rPr>
+          <w:rFonts w:ascii="Courier New" w:hAnsi="Courier New" w:cs="Courier New"/>
+        </w:rPr>
+        <w:t xml:space="preserve">it </w:t>
+      </w:r>
+      <w:r>
+        <w:rPr>
+          <w:rFonts w:ascii="Courier New" w:hAnsi="Courier New" w:cs="Courier New"/>
+        </w:rPr>
+        <w:t>off, freeing himself.</w:t>
+      </w:r>
+      <w:r>
+        <w:rPr>
+          <w:rFonts w:ascii="Courier New" w:hAnsi="Courier New" w:cs="Courier New"/>
+        </w:rPr>
+        <w:t xml:space="preserve"> He gets up and sprints across the field.</w:t>
+      </w:r>
+      <w:r>
+        <w:rPr>
+          <w:rFonts w:ascii="Courier New" w:hAnsi="Courier New" w:cs="Courier New"/>
+        </w:rPr>
+        <w:t xml:space="preserve"> </w:t>
+      </w:r>
+    </w:p>
+    <w:p>
+      <w:pPr>
+        <w:spacing w:line="240" w:lineRule="auto"/>
+        <w:rPr>
+          <w:rFonts w:ascii="Courier New" w:hAnsi="Courier New" w:cs="Courier New"/>
+        </w:rPr>
+      </w:pPr>
+      <w:r>
+        <w:rPr>
+          <w:rFonts w:ascii="Courier New" w:hAnsi="Courier New" w:cs="Courier New"/>
+        </w:rPr>
+        <w:t>As he runs, h</w:t>
+      </w:r>
+      <w:r>
+        <w:rPr>
+          <w:rFonts w:ascii="Courier New" w:hAnsi="Courier New" w:cs="Courier New"/>
+        </w:rPr>
+        <w:t xml:space="preserve">e </w:t>
+      </w:r>
+      <w:r>
+        <w:rPr>
+          <w:rFonts w:ascii="Courier New" w:hAnsi="Courier New" w:cs="Courier New"/>
+        </w:rPr>
+        <w:t>turns</w:t>
+      </w:r>
+      <w:r>
+        <w:rPr>
+          <w:rFonts w:ascii="Courier New" w:hAnsi="Courier New" w:cs="Courier New"/>
+        </w:rPr>
+        <w:t xml:space="preserve"> back </w:t>
+      </w:r>
+      <w:r>
+        <w:rPr>
+          <w:rFonts w:ascii="Courier New" w:hAnsi="Courier New" w:cs="Courier New"/>
+        </w:rPr>
+        <w:t>to have a looksee</w:t>
+      </w:r>
+      <w:r>
+        <w:rPr>
+          <w:rFonts w:ascii="Courier New" w:hAnsi="Courier New" w:cs="Courier New"/>
+        </w:rPr>
+        <w:t xml:space="preserve">- </w:t>
+      </w:r>
+      <w:r>
+        <w:rPr>
+          <w:rFonts w:ascii="Courier New" w:hAnsi="Courier New" w:cs="Courier New"/>
+        </w:rPr>
+        <w:t>BHAM!</w:t>
+      </w:r>
+      <w:r>
+        <w:rPr>
+          <w:rFonts w:ascii="Courier New" w:hAnsi="Courier New" w:cs="Courier New"/>
+        </w:rPr>
+        <w:t xml:space="preserve"> </w:t>
+      </w:r>
+      <w:r>
+        <w:rPr>
+          <w:rFonts w:ascii="Courier New" w:hAnsi="Courier New" w:cs="Courier New"/>
+        </w:rPr>
+        <w:t>H</w:t>
+      </w:r>
+      <w:r>
+        <w:rPr>
+          <w:rFonts w:ascii="Courier New" w:hAnsi="Courier New" w:cs="Courier New"/>
+        </w:rPr>
+        <w:t>e tumbles into a huge tree in the middle of the field</w:t>
+      </w:r>
+      <w:r>
+        <w:rPr>
+          <w:rFonts w:ascii="Courier New" w:hAnsi="Courier New" w:cs="Courier New"/>
+        </w:rPr>
+        <w:t>. H</w:t>
+      </w:r>
+      <w:r>
+        <w:rPr>
+          <w:rFonts w:ascii="Courier New" w:hAnsi="Courier New" w:cs="Courier New"/>
+        </w:rPr>
+        <w:t>it</w:t>
+      </w:r>
+      <w:r>
+        <w:rPr>
+          <w:rFonts w:ascii="Courier New" w:hAnsi="Courier New" w:cs="Courier New"/>
+        </w:rPr>
+        <w:t xml:space="preserve">s </w:t>
+      </w:r>
+      <w:r>
+        <w:rPr>
+          <w:rFonts w:ascii="Courier New" w:hAnsi="Courier New" w:cs="Courier New"/>
+        </w:rPr>
+        <w:t>his face</w:t>
+      </w:r>
+      <w:r>
+        <w:rPr>
+          <w:rFonts w:ascii="Courier New" w:hAnsi="Courier New" w:cs="Courier New"/>
+        </w:rPr>
+        <w:t xml:space="preserve"> and falls </w:t>
+      </w:r>
+      <w:r>
+        <w:rPr>
+          <w:rFonts w:ascii="Courier New" w:hAnsi="Courier New" w:cs="Courier New"/>
+        </w:rPr>
+        <w:t xml:space="preserve">to the </w:t>
+      </w:r>
+      <w:r>
+        <w:rPr>
+          <w:rFonts w:ascii="Courier New" w:hAnsi="Courier New" w:cs="Courier New"/>
+        </w:rPr>
+        <w:t>ground.</w:t>
+      </w:r>
+    </w:p>
+    <w:p>
+      <w:pPr>
+        <w:spacing w:line="240" w:lineRule="auto"/>
+        <w:rPr>
+          <w:rFonts w:ascii="Courier New" w:hAnsi="Courier New" w:cs="Courier New"/>
+        </w:rPr>
+      </w:pPr>
+      <w:r>
+        <w:rPr>
+          <w:rFonts w:ascii="Courier New" w:hAnsi="Courier New" w:cs="Courier New"/>
+        </w:rPr>
+        <w:t xml:space="preserve">A </w:t>
+      </w:r>
+      <w:r>
+        <w:rPr>
+          <w:rFonts w:ascii="Courier New" w:hAnsi="Courier New" w:cs="Courier New"/>
+        </w:rPr>
+        <w:t xml:space="preserve">loud </w:t>
+      </w:r>
+      <w:r>
+        <w:rPr>
+          <w:rFonts w:ascii="Courier New" w:hAnsi="Courier New" w:cs="Courier New"/>
+        </w:rPr>
+        <w:t>t</w:t>
+      </w:r>
+      <w:r>
+        <w:rPr>
+          <w:rFonts w:ascii="Courier New" w:hAnsi="Courier New" w:cs="Courier New"/>
+        </w:rPr>
+        <w:t>hunder</w:t>
+      </w:r>
+      <w:r>
+        <w:rPr>
+          <w:rFonts w:ascii="Courier New" w:hAnsi="Courier New" w:cs="Courier New"/>
+        </w:rPr>
+        <w:t xml:space="preserve"> </w:t>
+      </w:r>
+      <w:r>
+        <w:rPr>
+          <w:rFonts w:ascii="Courier New" w:hAnsi="Courier New" w:cs="Courier New"/>
+        </w:rPr>
+        <w:t xml:space="preserve">jolts </w:t>
+      </w:r>
+      <w:r>
+        <w:rPr>
+          <w:rFonts w:ascii="Courier New" w:hAnsi="Courier New" w:cs="Courier New"/>
+        </w:rPr>
+        <w:t>him up</w:t>
+      </w:r>
+      <w:r>
+        <w:rPr>
+          <w:rFonts w:ascii="Courier New" w:hAnsi="Courier New" w:cs="Courier New"/>
+        </w:rPr>
+        <w:t>. He s</w:t>
+      </w:r>
+      <w:r>
+        <w:rPr>
+          <w:rFonts w:ascii="Courier New" w:hAnsi="Courier New" w:cs="Courier New"/>
+        </w:rPr>
+        <w:t>lowly stands up</w:t>
+      </w:r>
+      <w:r>
+        <w:rPr>
+          <w:rFonts w:ascii="Courier New" w:hAnsi="Courier New" w:cs="Courier New"/>
+        </w:rPr>
+        <w:t xml:space="preserve"> and looks around</w:t>
       </w:r>
       <w:r>
         <w:rPr>
@@ -32366,276 +32800,6 @@
         <w:rPr>
           <w:rFonts w:ascii="Courier New" w:hAnsi="Courier New" w:cs="Courier New"/>
         </w:rPr>
-        <w:t xml:space="preserve">With all his might, </w:t>
-      </w:r>
-      <w:r>
-        <w:rPr>
-          <w:rFonts w:ascii="Courier New" w:hAnsi="Courier New" w:cs="Courier New"/>
-        </w:rPr>
-        <w:t xml:space="preserve">he grabs </w:t>
-      </w:r>
-      <w:r>
-        <w:rPr>
-          <w:rFonts w:ascii="Courier New" w:hAnsi="Courier New" w:cs="Courier New"/>
-        </w:rPr>
-        <w:t xml:space="preserve">the hands and </w:t>
-      </w:r>
-      <w:r>
-        <w:rPr>
-          <w:rFonts w:ascii="Courier New" w:hAnsi="Courier New" w:cs="Courier New"/>
-        </w:rPr>
-        <w:t>rips them off</w:t>
-      </w:r>
-      <w:r>
-        <w:rPr>
-          <w:rFonts w:ascii="Courier New" w:hAnsi="Courier New" w:cs="Courier New"/>
-        </w:rPr>
-        <w:t xml:space="preserve"> his face</w:t>
-      </w:r>
-      <w:r>
-        <w:rPr>
-          <w:rFonts w:ascii="Courier New" w:hAnsi="Courier New" w:cs="Courier New"/>
-        </w:rPr>
-        <w:t>, freeing himself.</w:t>
-      </w:r>
-    </w:p>
-    <w:p>
-      <w:pPr>
-        <w:spacing w:line="240" w:lineRule="auto"/>
-        <w:rPr>
-          <w:rFonts w:ascii="Courier New" w:hAnsi="Courier New" w:cs="Courier New"/>
-        </w:rPr>
-      </w:pPr>
-      <w:r>
-        <w:rPr>
-          <w:rFonts w:ascii="Courier New" w:hAnsi="Courier New" w:cs="Courier New"/>
-        </w:rPr>
-        <w:t xml:space="preserve">Panting, he gets up and sprints </w:t>
-      </w:r>
-      <w:r>
-        <w:rPr>
-          <w:rFonts w:ascii="Courier New" w:hAnsi="Courier New" w:cs="Courier New"/>
-        </w:rPr>
-        <w:t xml:space="preserve">across </w:t>
-      </w:r>
-      <w:r>
-        <w:rPr>
-          <w:rFonts w:ascii="Courier New" w:hAnsi="Courier New" w:cs="Courier New"/>
-        </w:rPr>
-        <w:t>the red field</w:t>
-      </w:r>
-      <w:r>
-        <w:rPr>
-          <w:rFonts w:ascii="Courier New" w:hAnsi="Courier New" w:cs="Courier New"/>
-        </w:rPr>
-        <w:t>- With t</w:t>
-      </w:r>
-      <w:r>
-        <w:rPr>
-          <w:rFonts w:ascii="Courier New" w:hAnsi="Courier New" w:cs="Courier New"/>
-        </w:rPr>
-        <w:t>wo RED SUNS in the blood-colored sky</w:t>
-      </w:r>
-      <w:r>
-        <w:rPr>
-          <w:rFonts w:ascii="Courier New" w:hAnsi="Courier New" w:cs="Courier New"/>
-        </w:rPr>
-        <w:t>- And a</w:t>
-      </w:r>
-      <w:r>
-        <w:rPr>
-          <w:rFonts w:ascii="Courier New" w:hAnsi="Courier New" w:cs="Courier New"/>
-        </w:rPr>
-        <w:t xml:space="preserve"> swirling </w:t>
-      </w:r>
-      <w:r>
-        <w:rPr>
-          <w:rFonts w:ascii="Courier New" w:hAnsi="Courier New" w:cs="Courier New"/>
-        </w:rPr>
-        <w:t xml:space="preserve">dark vortex </w:t>
-      </w:r>
-      <w:r>
-        <w:rPr>
-          <w:rFonts w:ascii="Courier New" w:hAnsi="Courier New" w:cs="Courier New"/>
-        </w:rPr>
-        <w:t>spin</w:t>
-      </w:r>
-      <w:r>
-        <w:rPr>
-          <w:rFonts w:ascii="Courier New" w:hAnsi="Courier New" w:cs="Courier New"/>
-        </w:rPr>
-        <w:t>ning</w:t>
-      </w:r>
-      <w:r>
-        <w:rPr>
-          <w:rFonts w:ascii="Courier New" w:hAnsi="Courier New" w:cs="Courier New"/>
-        </w:rPr>
-        <w:t xml:space="preserve"> </w:t>
-      </w:r>
-      <w:r>
-        <w:rPr>
-          <w:rFonts w:ascii="Courier New" w:hAnsi="Courier New" w:cs="Courier New"/>
-        </w:rPr>
-        <w:t xml:space="preserve">eating </w:t>
-      </w:r>
-      <w:r>
-        <w:rPr>
-          <w:rFonts w:ascii="Courier New" w:hAnsi="Courier New" w:cs="Courier New"/>
-        </w:rPr>
-        <w:t>the space</w:t>
-      </w:r>
-      <w:r>
-        <w:rPr>
-          <w:rFonts w:ascii="Courier New" w:hAnsi="Courier New" w:cs="Courier New"/>
-        </w:rPr>
-        <w:t xml:space="preserve"> itself.</w:t>
-      </w:r>
-    </w:p>
-    <w:p>
-      <w:pPr>
-        <w:spacing w:line="240" w:lineRule="auto"/>
-        <w:rPr>
-          <w:rFonts w:ascii="Courier New" w:hAnsi="Courier New" w:cs="Courier New"/>
-        </w:rPr>
-      </w:pPr>
-      <w:r>
-        <w:rPr>
-          <w:rFonts w:ascii="Courier New" w:hAnsi="Courier New" w:cs="Courier New"/>
-        </w:rPr>
-        <w:t xml:space="preserve">He </w:t>
-      </w:r>
-      <w:r>
-        <w:rPr>
-          <w:rFonts w:ascii="Courier New" w:hAnsi="Courier New" w:cs="Courier New"/>
-        </w:rPr>
-        <w:t xml:space="preserve">looks back while running breathless- </w:t>
-      </w:r>
-      <w:r>
-        <w:rPr>
-          <w:rFonts w:ascii="Courier New" w:hAnsi="Courier New" w:cs="Courier New"/>
-        </w:rPr>
-        <w:t>Suddenly</w:t>
-      </w:r>
-      <w:r>
-        <w:rPr>
-          <w:rFonts w:ascii="Courier New" w:hAnsi="Courier New" w:cs="Courier New"/>
-        </w:rPr>
-        <w:t>, h</w:t>
-      </w:r>
-      <w:r>
-        <w:rPr>
-          <w:rFonts w:ascii="Courier New" w:hAnsi="Courier New" w:cs="Courier New"/>
-        </w:rPr>
-        <w:t>e tumbles into a huge tree in the middle of the field</w:t>
-      </w:r>
-      <w:r>
-        <w:rPr>
-          <w:rFonts w:ascii="Courier New" w:hAnsi="Courier New" w:cs="Courier New"/>
-        </w:rPr>
-        <w:t>. H</w:t>
-      </w:r>
-      <w:r>
-        <w:rPr>
-          <w:rFonts w:ascii="Courier New" w:hAnsi="Courier New" w:cs="Courier New"/>
-        </w:rPr>
-        <w:t>it</w:t>
-      </w:r>
-      <w:r>
-        <w:rPr>
-          <w:rFonts w:ascii="Courier New" w:hAnsi="Courier New" w:cs="Courier New"/>
-        </w:rPr>
-        <w:t xml:space="preserve">s </w:t>
-      </w:r>
-      <w:r>
-        <w:rPr>
-          <w:rFonts w:ascii="Courier New" w:hAnsi="Courier New" w:cs="Courier New"/>
-        </w:rPr>
-        <w:t>his face</w:t>
-      </w:r>
-      <w:r>
-        <w:rPr>
-          <w:rFonts w:ascii="Courier New" w:hAnsi="Courier New" w:cs="Courier New"/>
-        </w:rPr>
-        <w:t xml:space="preserve"> and falls </w:t>
-      </w:r>
-      <w:r>
-        <w:rPr>
-          <w:rFonts w:ascii="Courier New" w:hAnsi="Courier New" w:cs="Courier New"/>
-        </w:rPr>
-        <w:t xml:space="preserve">to the </w:t>
-      </w:r>
-      <w:r>
-        <w:rPr>
-          <w:rFonts w:ascii="Courier New" w:hAnsi="Courier New" w:cs="Courier New"/>
-        </w:rPr>
-        <w:t>ground.</w:t>
-      </w:r>
-    </w:p>
-    <w:p>
-      <w:pPr>
-        <w:spacing w:line="240" w:lineRule="auto"/>
-        <w:rPr>
-          <w:rFonts w:ascii="Courier New" w:hAnsi="Courier New" w:cs="Courier New"/>
-        </w:rPr>
-      </w:pPr>
-      <w:r>
-        <w:rPr>
-          <w:rFonts w:ascii="Courier New" w:hAnsi="Courier New" w:cs="Courier New"/>
-        </w:rPr>
-        <w:t>A t</w:t>
-      </w:r>
-      <w:r>
-        <w:rPr>
-          <w:rFonts w:ascii="Courier New" w:hAnsi="Courier New" w:cs="Courier New"/>
-        </w:rPr>
-        <w:t>hunder</w:t>
-      </w:r>
-      <w:r>
-        <w:rPr>
-          <w:rFonts w:ascii="Courier New" w:hAnsi="Courier New" w:cs="Courier New"/>
-        </w:rPr>
-        <w:t xml:space="preserve"> wakes him up.</w:t>
-      </w:r>
-      <w:r>
-        <w:rPr>
-          <w:rFonts w:ascii="Courier New" w:hAnsi="Courier New" w:cs="Courier New"/>
-        </w:rPr>
-        <w:t xml:space="preserve"> </w:t>
-      </w:r>
-      <w:r>
-        <w:rPr>
-          <w:rFonts w:ascii="Courier New" w:hAnsi="Courier New" w:cs="Courier New"/>
-        </w:rPr>
-        <w:t>S</w:t>
-      </w:r>
-      <w:r>
-        <w:rPr>
-          <w:rFonts w:ascii="Courier New" w:hAnsi="Courier New" w:cs="Courier New"/>
-        </w:rPr>
-        <w:t>lowly</w:t>
-      </w:r>
-      <w:r>
-        <w:rPr>
-          <w:rFonts w:ascii="Courier New" w:hAnsi="Courier New" w:cs="Courier New"/>
-        </w:rPr>
-        <w:t>, he gets up s</w:t>
-      </w:r>
-      <w:r>
-        <w:rPr>
-          <w:rFonts w:ascii="Courier New" w:hAnsi="Courier New" w:cs="Courier New"/>
-        </w:rPr>
-        <w:t>cared and confused.</w:t>
-      </w:r>
-      <w:r>
-        <w:rPr>
-          <w:rFonts w:ascii="Courier New" w:hAnsi="Courier New" w:cs="Courier New"/>
-        </w:rPr>
-        <w:t xml:space="preserve"> </w:t>
-      </w:r>
-      <w:r>
-        <w:rPr>
-          <w:rFonts w:ascii="Courier New" w:hAnsi="Courier New" w:cs="Courier New"/>
-        </w:rPr>
         <w:t xml:space="preserve">In the distance— ghostly </w:t>
       </w:r>
       <w:bookmarkStart w:id="11" w:name="_Hlk215254318"/>
@@ -33036,7 +33200,7 @@
         <w:rPr>
           <w:rFonts w:ascii="Courier New" w:hAnsi="Courier New" w:cs="Courier New"/>
         </w:rPr>
-        <w:br/>
+        <w:t xml:space="preserve"> </w:t>
       </w:r>
       <w:proofErr w:type="spellStart"/>
       <w:r>
@@ -33771,14 +33935,12 @@
         </w:rPr>
         <w:t>.</w:t>
       </w:r>
-    </w:p>
-    <w:p>
-      <w:pPr>
-        <w:spacing w:line="240" w:lineRule="auto"/>
-        <w:rPr>
-          <w:rFonts w:ascii="Courier New" w:hAnsi="Courier New" w:cs="Courier New"/>
-        </w:rPr>
-      </w:pPr>
+      <w:r>
+        <w:rPr>
+          <w:rFonts w:ascii="Courier New" w:hAnsi="Courier New" w:cs="Courier New"/>
+        </w:rPr>
+        <w:t xml:space="preserve"> </w:t>
+      </w:r>
       <w:r>
         <w:rPr>
           <w:rFonts w:ascii="Courier New" w:hAnsi="Courier New" w:cs="Courier New"/>
@@ -33795,13 +33957,13 @@
         <w:rPr>
           <w:rFonts w:ascii="Courier New" w:hAnsi="Courier New" w:cs="Courier New"/>
         </w:rPr>
-        <w:t>Finally,</w:t>
-      </w:r>
-      <w:r>
-        <w:rPr>
-          <w:rFonts w:ascii="Courier New" w:hAnsi="Courier New" w:cs="Courier New"/>
-        </w:rPr>
-        <w:t xml:space="preserve"> he</w:t>
+        <w:t>H</w:t>
+      </w:r>
+      <w:r>
+        <w:rPr>
+          <w:rFonts w:ascii="Courier New" w:hAnsi="Courier New" w:cs="Courier New"/>
+        </w:rPr>
+        <w:t>e</w:t>
       </w:r>
       <w:r>
         <w:rPr>
@@ -33922,42 +34084,46 @@
         <w:rPr>
           <w:rFonts w:ascii="Courier New" w:hAnsi="Courier New" w:cs="Courier New"/>
         </w:rPr>
+        <w:t xml:space="preserve"> </w:t>
+      </w:r>
+      <w:proofErr w:type="spellStart"/>
+      <w:r>
+        <w:rPr>
+          <w:rFonts w:ascii="Courier New" w:hAnsi="Courier New" w:cs="Courier New"/>
+        </w:rPr>
+        <w:t>innu</w:t>
+      </w:r>
+      <w:proofErr w:type="spellEnd"/>
+      <w:r>
+        <w:rPr>
+          <w:rFonts w:ascii="Courier New" w:hAnsi="Courier New" w:cs="Courier New"/>
+        </w:rPr>
         <w:br/>
       </w:r>
-      <w:proofErr w:type="spellStart"/>
-      <w:r>
-        <w:rPr>
-          <w:rFonts w:ascii="Courier New" w:hAnsi="Courier New" w:cs="Courier New"/>
-        </w:rPr>
-        <w:t>innu</w:t>
-      </w:r>
-      <w:proofErr w:type="spellEnd"/>
-      <w:r>
-        <w:rPr>
-          <w:rFonts w:ascii="Courier New" w:hAnsi="Courier New" w:cs="Courier New"/>
-        </w:rPr>
-        <w:t xml:space="preserve"> </w:t>
-      </w:r>
-      <w:proofErr w:type="spellStart"/>
-      <w:r>
-        <w:rPr>
-          <w:rFonts w:ascii="Courier New" w:hAnsi="Courier New" w:cs="Courier New"/>
-        </w:rPr>
-        <w:t>ondu</w:t>
-      </w:r>
-      <w:proofErr w:type="spellEnd"/>
-      <w:r>
-        <w:rPr>
-          <w:rFonts w:ascii="Courier New" w:hAnsi="Courier New" w:cs="Courier New"/>
-        </w:rPr>
-        <w:t xml:space="preserve"> </w:t>
-      </w:r>
-      <w:proofErr w:type="spellStart"/>
-      <w:r>
-        <w:rPr>
-          <w:rFonts w:ascii="Courier New" w:hAnsi="Courier New" w:cs="Courier New"/>
-        </w:rPr>
-        <w:t>Samvatsara</w:t>
+      <w:r>
+        <w:rPr>
+          <w:rFonts w:ascii="Courier New" w:hAnsi="Courier New" w:cs="Courier New"/>
+        </w:rPr>
+        <w:t>eka</w:t>
+      </w:r>
+      <w:r>
+        <w:rPr>
+          <w:rFonts w:ascii="Courier New" w:hAnsi="Courier New" w:cs="Courier New"/>
+        </w:rPr>
+        <w:t xml:space="preserve"> </w:t>
+      </w:r>
+      <w:proofErr w:type="spellStart"/>
+      <w:r>
+        <w:rPr>
+          <w:rFonts w:ascii="Courier New" w:hAnsi="Courier New" w:cs="Courier New"/>
+        </w:rPr>
+        <w:t>s</w:t>
+      </w:r>
+      <w:r>
+        <w:rPr>
+          <w:rFonts w:ascii="Courier New" w:hAnsi="Courier New" w:cs="Courier New"/>
+        </w:rPr>
+        <w:t>amvatsara</w:t>
       </w:r>
       <w:r>
         <w:rPr>
@@ -34076,68 +34242,9 @@
         <w:rPr>
           <w:rFonts w:ascii="Courier New" w:hAnsi="Courier New" w:cs="Courier New"/>
         </w:rPr>
-        <w:t>idu</w:t>
-      </w:r>
-      <w:proofErr w:type="spellEnd"/>
-      <w:r>
-        <w:rPr>
-          <w:rFonts w:ascii="Courier New" w:hAnsi="Courier New" w:cs="Courier New"/>
-        </w:rPr>
-        <w:t>?</w:t>
-      </w:r>
-    </w:p>
-    <w:p>
-      <w:pPr>
-        <w:spacing w:line="240" w:lineRule="auto"/>
-        <w:jc w:val="center"/>
-        <w:rPr>
-          <w:rFonts w:ascii="Courier New" w:hAnsi="Courier New" w:cs="Courier New"/>
-          <w:b/>
-          <w:bCs/>
-        </w:rPr>
-      </w:pPr>
-      <w:r>
-        <w:rPr>
-          <w:rFonts w:ascii="Courier New" w:hAnsi="Courier New" w:cs="Courier New"/>
-          <w:b/>
-          <w:bCs/>
-        </w:rPr>
-        <w:t>VASU</w:t>
-      </w:r>
-      <w:r>
-        <w:rPr>
-          <w:rFonts w:ascii="Courier New" w:hAnsi="Courier New" w:cs="Courier New"/>
-        </w:rPr>
-        <w:br/>
-      </w:r>
-      <w:proofErr w:type="spellStart"/>
-      <w:r>
-        <w:rPr>
-          <w:rFonts w:ascii="Courier New" w:hAnsi="Courier New" w:cs="Courier New"/>
-        </w:rPr>
-        <w:t>Idu</w:t>
-      </w:r>
-      <w:proofErr w:type="spellEnd"/>
-      <w:r>
-        <w:rPr>
-          <w:rFonts w:ascii="Courier New" w:hAnsi="Courier New" w:cs="Courier New"/>
-        </w:rPr>
-        <w:t xml:space="preserve"> </w:t>
-      </w:r>
-      <w:proofErr w:type="spellStart"/>
-      <w:r>
-        <w:rPr>
-          <w:rFonts w:ascii="Courier New" w:hAnsi="Courier New" w:cs="Courier New"/>
-        </w:rPr>
-        <w:t>Pitru</w:t>
-      </w:r>
-      <w:proofErr w:type="spellEnd"/>
-      <w:r>
-        <w:rPr>
-          <w:rFonts w:ascii="Courier New" w:hAnsi="Courier New" w:cs="Courier New"/>
-        </w:rPr>
-        <w:t xml:space="preserve"> Loka</w:t>
-      </w:r>
+        <w:t>idu?</w:t>
+      </w:r>
+      <w:proofErr w:type="spellEnd"/>
     </w:p>
     <w:p>
       <w:pPr>
@@ -34301,15 +34408,15 @@
           <w:i/>
           <w:iCs/>
         </w:rPr>
-        <w:t>s</w:t>
-      </w:r>
-      <w:r>
-        <w:rPr>
-          <w:rFonts w:ascii="Courier New" w:hAnsi="Courier New" w:cs="Courier New"/>
-          <w:i/>
-          <w:iCs/>
-        </w:rPr>
-        <w:t>houts)</w:t>
+        <w:t>louder</w:t>
+      </w:r>
+      <w:r>
+        <w:rPr>
+          <w:rFonts w:ascii="Courier New" w:hAnsi="Courier New" w:cs="Courier New"/>
+          <w:i/>
+          <w:iCs/>
+        </w:rPr>
+        <w:t>)</w:t>
       </w:r>
       <w:r>
         <w:rPr>
@@ -34540,6 +34647,12 @@
         </w:rPr>
         <w:t xml:space="preserve"> </w:t>
       </w:r>
+      <w:r>
+        <w:rPr>
+          <w:rFonts w:ascii="Courier New" w:hAnsi="Courier New" w:cs="Courier New"/>
+        </w:rPr>
+        <w:t xml:space="preserve">al </w:t>
+      </w:r>
       <w:proofErr w:type="spellStart"/>
       <w:r>
         <w:rPr>
@@ -34589,6 +34702,12 @@
         </w:rPr>
         <w:t xml:space="preserve"> </w:t>
       </w:r>
+      <w:r>
+        <w:rPr>
+          <w:rFonts w:ascii="Courier New" w:hAnsi="Courier New" w:cs="Courier New"/>
+        </w:rPr>
+        <w:t xml:space="preserve">il </w:t>
+      </w:r>
       <w:proofErr w:type="spellStart"/>
       <w:r>
         <w:rPr>
@@ -34631,7 +34750,27 @@
           <w:rFonts w:ascii="Courier New" w:hAnsi="Courier New" w:cs="Courier New"/>
         </w:rPr>
         <w:br/>
-        <w:t xml:space="preserve">Munde Nin </w:t>
+        <w:t xml:space="preserve">Munde </w:t>
+      </w:r>
+      <w:proofErr w:type="spellStart"/>
+      <w:r>
+        <w:rPr>
+          <w:rFonts w:ascii="Courier New" w:hAnsi="Courier New" w:cs="Courier New"/>
+        </w:rPr>
+        <w:t>n</w:t>
+      </w:r>
+      <w:r>
+        <w:rPr>
+          <w:rFonts w:ascii="Courier New" w:hAnsi="Courier New" w:cs="Courier New"/>
+        </w:rPr>
+        <w:t>in</w:t>
+      </w:r>
+      <w:proofErr w:type="spellEnd"/>
+      <w:r>
+        <w:rPr>
+          <w:rFonts w:ascii="Courier New" w:hAnsi="Courier New" w:cs="Courier New"/>
+        </w:rPr>
+        <w:t xml:space="preserve"> </w:t>
       </w:r>
       <w:proofErr w:type="spellStart"/>
       <w:r>
@@ -34956,7 +35095,13 @@
         <w:rPr>
           <w:rFonts w:ascii="Courier New" w:hAnsi="Courier New" w:cs="Courier New"/>
         </w:rPr>
-        <w:t>sigtini</w:t>
+        <w:t>sig</w:t>
+      </w:r>
+      <w:r>
+        <w:rPr>
+          <w:rFonts w:ascii="Courier New" w:hAnsi="Courier New" w:cs="Courier New"/>
+        </w:rPr>
+        <w:t>uva</w:t>
       </w:r>
       <w:proofErr w:type="spellEnd"/>
     </w:p>
@@ -35003,6 +35148,14 @@
         </w:rPr>
         <w:t xml:space="preserve"> </w:t>
       </w:r>
+    </w:p>
+    <w:p>
+      <w:pPr>
+        <w:spacing w:line="240" w:lineRule="auto"/>
+        <w:rPr>
+          <w:rFonts w:ascii="Courier New" w:hAnsi="Courier New" w:cs="Courier New"/>
+        </w:rPr>
+      </w:pPr>
       <w:r>
         <w:rPr>
           <w:rFonts w:ascii="Courier New" w:hAnsi="Courier New" w:cs="Courier New"/>
@@ -35073,7 +35226,39 @@
         <w:rPr>
           <w:rFonts w:ascii="Courier New" w:hAnsi="Courier New" w:cs="Courier New"/>
         </w:rPr>
-        <w:t>. Expanding into a long red beam of light</w:t>
+        <w:t xml:space="preserve">. </w:t>
+      </w:r>
+    </w:p>
+    <w:p>
+      <w:pPr>
+        <w:spacing w:line="240" w:lineRule="auto"/>
+        <w:rPr>
+          <w:rFonts w:ascii="Courier New" w:hAnsi="Courier New" w:cs="Courier New"/>
+        </w:rPr>
+      </w:pPr>
+      <w:r>
+        <w:rPr>
+          <w:rFonts w:ascii="Courier New" w:hAnsi="Courier New" w:cs="Courier New"/>
+        </w:rPr>
+        <w:t>The flash e</w:t>
+      </w:r>
+      <w:r>
+        <w:rPr>
+          <w:rFonts w:ascii="Courier New" w:hAnsi="Courier New" w:cs="Courier New"/>
+        </w:rPr>
+        <w:t>xpand</w:t>
+      </w:r>
+      <w:r>
+        <w:rPr>
+          <w:rFonts w:ascii="Courier New" w:hAnsi="Courier New" w:cs="Courier New"/>
+        </w:rPr>
+        <w:t>s</w:t>
+      </w:r>
+      <w:r>
+        <w:rPr>
+          <w:rFonts w:ascii="Courier New" w:hAnsi="Courier New" w:cs="Courier New"/>
+        </w:rPr>
+        <w:t xml:space="preserve"> into a long red beam of light</w:t>
       </w:r>
       <w:r>
         <w:rPr>
@@ -35146,46 +35331,22 @@
       <w:r>
         <w:rPr>
           <w:rFonts w:ascii="Courier New" w:hAnsi="Courier New" w:cs="Courier New"/>
-        </w:rPr>
-        <w:t xml:space="preserve">Adi is back inside the unknown dark </w:t>
-      </w:r>
-      <w:r>
-        <w:rPr>
-          <w:rFonts w:ascii="Courier New" w:hAnsi="Courier New" w:cs="Courier New"/>
+          <w:i/>
+          <w:iCs/>
+        </w:rPr>
+        <w:t xml:space="preserve">[DN: Plan-B is to transport Adi back to the </w:t>
+      </w:r>
+      <w:r>
+        <w:rPr>
+          <w:rFonts w:ascii="Courier New" w:hAnsi="Courier New" w:cs="Courier New"/>
+          <w:i/>
+          <w:iCs/>
         </w:rPr>
         <w:t>void</w:t>
       </w:r>
       <w:r>
         <w:rPr>
           <w:rFonts w:ascii="Courier New" w:hAnsi="Courier New" w:cs="Courier New"/>
-        </w:rPr>
-        <w:t>.</w:t>
-      </w:r>
-      <w:r>
-        <w:rPr>
-          <w:rFonts w:ascii="Courier New" w:hAnsi="Courier New" w:cs="Courier New"/>
-        </w:rPr>
-        <w:br/>
-      </w:r>
-      <w:r>
-        <w:rPr>
-          <w:rFonts w:ascii="Courier New" w:hAnsi="Courier New" w:cs="Courier New"/>
-          <w:i/>
-          <w:iCs/>
-        </w:rPr>
-        <w:t xml:space="preserve">[DN: Plan-B is to transport Adi back to the </w:t>
-      </w:r>
-      <w:r>
-        <w:rPr>
-          <w:rFonts w:ascii="Courier New" w:hAnsi="Courier New" w:cs="Courier New"/>
-          <w:i/>
-          <w:iCs/>
-        </w:rPr>
-        <w:t>void</w:t>
-      </w:r>
-      <w:r>
-        <w:rPr>
-          <w:rFonts w:ascii="Courier New" w:hAnsi="Courier New" w:cs="Courier New"/>
           <w:i/>
           <w:iCs/>
         </w:rPr>
@@ -35234,6 +35395,17 @@
         </w:rPr>
         <w:t>FLASH CUT TO:</w:t>
       </w:r>
+    </w:p>
+    <w:p>
+      <w:pPr>
+        <w:spacing w:line="240" w:lineRule="auto"/>
+        <w:jc w:val="right"/>
+        <w:rPr>
+          <w:rFonts w:ascii="Courier New" w:hAnsi="Courier New" w:cs="Courier New"/>
+          <w:b/>
+          <w:bCs/>
+        </w:rPr>
+      </w:pPr>
     </w:p>
     <w:p>
       <w:pPr>

</xml_diff>

<commit_message>
Changed the door loop sequence
</commit_message>
<xml_diff>
--- a/The_A_Shorts/2. Vyuthi/Vyuthi - Screenplay.docx
+++ b/The_A_Shorts/2. Vyuthi/Vyuthi - Screenplay.docx
@@ -12111,25 +12111,79 @@
         <w:rPr>
           <w:rFonts w:ascii="Courier New" w:hAnsi="Courier New" w:cs="Courier New"/>
         </w:rPr>
-        <w:t>Terrified</w:t>
-      </w:r>
-      <w:r>
-        <w:rPr>
-          <w:rFonts w:ascii="Courier New" w:hAnsi="Courier New" w:cs="Courier New"/>
-        </w:rPr>
-        <w:t xml:space="preserve">, </w:t>
-      </w:r>
-      <w:r>
-        <w:rPr>
-          <w:rFonts w:ascii="Courier New" w:hAnsi="Courier New" w:cs="Courier New"/>
-        </w:rPr>
-        <w:t>Adi drops the phone.</w:t>
-      </w:r>
-      <w:r>
-        <w:rPr>
-          <w:rFonts w:ascii="Courier New" w:hAnsi="Courier New" w:cs="Courier New"/>
-        </w:rPr>
-        <w:t xml:space="preserve"> The handle </w:t>
+        <w:t>Adi is t</w:t>
+      </w:r>
+      <w:r>
+        <w:rPr>
+          <w:rFonts w:ascii="Courier New" w:hAnsi="Courier New" w:cs="Courier New"/>
+        </w:rPr>
+        <w:t>errified</w:t>
+      </w:r>
+      <w:r>
+        <w:rPr>
+          <w:rFonts w:ascii="Courier New" w:hAnsi="Courier New" w:cs="Courier New"/>
+        </w:rPr>
+        <w:t>.</w:t>
+      </w:r>
+      <w:r>
+        <w:rPr>
+          <w:rFonts w:ascii="Courier New" w:hAnsi="Courier New" w:cs="Courier New"/>
+        </w:rPr>
+        <w:t xml:space="preserve"> </w:t>
+      </w:r>
+      <w:r>
+        <w:rPr>
+          <w:rFonts w:ascii="Courier New" w:hAnsi="Courier New" w:cs="Courier New"/>
+        </w:rPr>
+        <w:t>T</w:t>
+      </w:r>
+      <w:r>
+        <w:rPr>
+          <w:rFonts w:ascii="Courier New" w:hAnsi="Courier New" w:cs="Courier New"/>
+        </w:rPr>
+        <w:t xml:space="preserve">he </w:t>
+      </w:r>
+      <w:r>
+        <w:rPr>
+          <w:rFonts w:ascii="Courier New" w:hAnsi="Courier New" w:cs="Courier New"/>
+        </w:rPr>
+        <w:t>tele</w:t>
+      </w:r>
+      <w:r>
+        <w:rPr>
+          <w:rFonts w:ascii="Courier New" w:hAnsi="Courier New" w:cs="Courier New"/>
+        </w:rPr>
+        <w:t>phone</w:t>
+      </w:r>
+      <w:r>
+        <w:rPr>
+          <w:rFonts w:ascii="Courier New" w:hAnsi="Courier New" w:cs="Courier New"/>
+        </w:rPr>
+        <w:t xml:space="preserve"> drops from his hand</w:t>
+      </w:r>
+      <w:r>
+        <w:rPr>
+          <w:rFonts w:ascii="Courier New" w:hAnsi="Courier New" w:cs="Courier New"/>
+        </w:rPr>
+        <w:t>.</w:t>
+      </w:r>
+      <w:r>
+        <w:rPr>
+          <w:rFonts w:ascii="Courier New" w:hAnsi="Courier New" w:cs="Courier New"/>
+        </w:rPr>
+        <w:t xml:space="preserve"> The </w:t>
+      </w:r>
+      <w:r>
+        <w:rPr>
+          <w:rFonts w:ascii="Courier New" w:hAnsi="Courier New" w:cs="Courier New"/>
+        </w:rPr>
+        <w:t xml:space="preserve">phone’s </w:t>
+      </w:r>
+      <w:r>
+        <w:rPr>
+          <w:rFonts w:ascii="Courier New" w:hAnsi="Courier New" w:cs="Courier New"/>
+        </w:rPr>
+        <w:t xml:space="preserve">handle </w:t>
       </w:r>
       <w:r>
         <w:rPr>
@@ -12395,40 +12449,6 @@
     <w:p>
       <w:pPr>
         <w:spacing w:line="240" w:lineRule="auto"/>
-        <w:jc w:val="right"/>
-        <w:rPr>
-          <w:rFonts w:ascii="Courier New" w:hAnsi="Courier New" w:cs="Courier New"/>
-          <w:b/>
-          <w:bCs/>
-        </w:rPr>
-      </w:pPr>
-    </w:p>
-    <w:p>
-      <w:pPr>
-        <w:spacing w:line="240" w:lineRule="auto"/>
-        <w:jc w:val="right"/>
-        <w:rPr>
-          <w:rFonts w:ascii="Courier New" w:hAnsi="Courier New" w:cs="Courier New"/>
-          <w:b/>
-          <w:bCs/>
-        </w:rPr>
-      </w:pPr>
-    </w:p>
-    <w:p>
-      <w:pPr>
-        <w:spacing w:line="240" w:lineRule="auto"/>
-        <w:jc w:val="right"/>
-        <w:rPr>
-          <w:rFonts w:ascii="Courier New" w:hAnsi="Courier New" w:cs="Courier New"/>
-          <w:b/>
-          <w:bCs/>
-        </w:rPr>
-      </w:pPr>
-    </w:p>
-    <w:p>
-      <w:pPr>
-        <w:spacing w:line="240" w:lineRule="auto"/>
-        <w:jc w:val="right"/>
         <w:rPr>
           <w:rFonts w:ascii="Courier New" w:hAnsi="Courier New" w:cs="Courier New"/>
           <w:b/>
@@ -12456,6 +12476,7 @@
           <w:b/>
           <w:bCs/>
         </w:rPr>
+        <w:lastRenderedPageBreak/>
         <w:t xml:space="preserve">INT. BEDROOM – </w:t>
       </w:r>
       <w:r>
@@ -14075,7 +14096,6 @@
         <w:rPr>
           <w:rFonts w:ascii="Courier New" w:hAnsi="Courier New" w:cs="Courier New"/>
         </w:rPr>
-        <w:lastRenderedPageBreak/>
         <w:t xml:space="preserve">He turns towards </w:t>
       </w:r>
       <w:r>
@@ -14232,6 +14252,7 @@
           <w:b/>
           <w:bCs/>
         </w:rPr>
+        <w:lastRenderedPageBreak/>
         <w:t>INT. HALLWAY – CONTINUOUS</w:t>
       </w:r>
     </w:p>
@@ -15591,6 +15612,7 @@
           <w:b/>
           <w:bCs/>
         </w:rPr>
+        <w:lastRenderedPageBreak/>
         <w:t xml:space="preserve">INT. </w:t>
       </w:r>
       <w:r>
@@ -16882,341 +16904,341 @@
           <w:b/>
           <w:bCs/>
         </w:rPr>
+        <w:t>ADI</w:t>
+      </w:r>
+      <w:r>
+        <w:rPr>
+          <w:rFonts w:ascii="Courier New" w:hAnsi="Courier New" w:cs="Courier New"/>
+          <w:b/>
+          <w:bCs/>
+        </w:rPr>
+        <w:t xml:space="preserve"> </w:t>
+      </w:r>
+      <w:r>
+        <w:rPr>
+          <w:rFonts w:ascii="Courier New" w:hAnsi="Courier New" w:cs="Courier New"/>
+          <w:i/>
+          <w:iCs/>
+        </w:rPr>
+        <w:t>(</w:t>
+      </w:r>
+      <w:r>
+        <w:rPr>
+          <w:rFonts w:ascii="Courier New" w:hAnsi="Courier New" w:cs="Courier New"/>
+          <w:i/>
+          <w:iCs/>
+        </w:rPr>
+        <w:t>smiles like a</w:t>
+      </w:r>
+      <w:r>
+        <w:rPr>
+          <w:rFonts w:ascii="Courier New" w:hAnsi="Courier New" w:cs="Courier New"/>
+          <w:i/>
+          <w:iCs/>
+        </w:rPr>
+        <w:t xml:space="preserve"> fool</w:t>
+      </w:r>
+      <w:r>
+        <w:rPr>
+          <w:rFonts w:ascii="Courier New" w:hAnsi="Courier New" w:cs="Courier New"/>
+          <w:i/>
+          <w:iCs/>
+        </w:rPr>
+        <w:t>)</w:t>
+      </w:r>
+      <w:r>
+        <w:rPr>
+          <w:rFonts w:ascii="Courier New" w:hAnsi="Courier New" w:cs="Courier New"/>
+          <w:b/>
+          <w:bCs/>
+        </w:rPr>
+        <w:br/>
+      </w:r>
+      <w:r>
+        <w:rPr>
+          <w:rFonts w:ascii="Courier New" w:hAnsi="Courier New" w:cs="Courier New"/>
+        </w:rPr>
+        <w:t xml:space="preserve">En </w:t>
+      </w:r>
+      <w:proofErr w:type="spellStart"/>
+      <w:r>
+        <w:rPr>
+          <w:rFonts w:ascii="Courier New" w:hAnsi="Courier New" w:cs="Courier New"/>
+        </w:rPr>
+        <w:t>vichitra</w:t>
+      </w:r>
+      <w:proofErr w:type="spellEnd"/>
+      <w:r>
+        <w:rPr>
+          <w:rFonts w:ascii="Courier New" w:hAnsi="Courier New" w:cs="Courier New"/>
+        </w:rPr>
+        <w:t xml:space="preserve"> </w:t>
+      </w:r>
+      <w:proofErr w:type="spellStart"/>
+      <w:r>
+        <w:rPr>
+          <w:rFonts w:ascii="Courier New" w:hAnsi="Courier New" w:cs="Courier New"/>
+        </w:rPr>
+        <w:t>kans</w:t>
+      </w:r>
+      <w:proofErr w:type="spellEnd"/>
+      <w:r>
+        <w:rPr>
+          <w:rFonts w:ascii="Courier New" w:hAnsi="Courier New" w:cs="Courier New"/>
+        </w:rPr>
+        <w:t xml:space="preserve"> guru</w:t>
+      </w:r>
+      <w:r>
+        <w:rPr>
+          <w:rFonts w:ascii="Courier New" w:hAnsi="Courier New" w:cs="Courier New"/>
+        </w:rPr>
+        <w:t>!</w:t>
+      </w:r>
+    </w:p>
+    <w:p>
+      <w:pPr>
+        <w:spacing w:line="240" w:lineRule="auto"/>
+        <w:rPr>
+          <w:rFonts w:ascii="Courier New" w:hAnsi="Courier New" w:cs="Courier New"/>
+        </w:rPr>
+      </w:pPr>
+      <w:r>
+        <w:rPr>
+          <w:rFonts w:ascii="Courier New" w:hAnsi="Courier New" w:cs="Courier New"/>
+        </w:rPr>
+        <w:t xml:space="preserve">He </w:t>
+      </w:r>
+      <w:r>
+        <w:rPr>
+          <w:rFonts w:ascii="Courier New" w:hAnsi="Courier New" w:cs="Courier New"/>
+        </w:rPr>
+        <w:t xml:space="preserve">pulls </w:t>
+      </w:r>
+      <w:r>
+        <w:rPr>
+          <w:rFonts w:ascii="Courier New" w:hAnsi="Courier New" w:cs="Courier New"/>
+        </w:rPr>
+        <w:t xml:space="preserve">a </w:t>
+      </w:r>
+      <w:r>
+        <w:rPr>
+          <w:rFonts w:ascii="Courier New" w:hAnsi="Courier New" w:cs="Courier New"/>
+          <w:b/>
+          <w:bCs/>
+        </w:rPr>
+        <w:t>cigarette</w:t>
+      </w:r>
+      <w:r>
+        <w:rPr>
+          <w:rFonts w:ascii="Courier New" w:hAnsi="Courier New" w:cs="Courier New"/>
+        </w:rPr>
+        <w:t xml:space="preserve"> </w:t>
+      </w:r>
+      <w:r>
+        <w:rPr>
+          <w:rFonts w:ascii="Courier New" w:hAnsi="Courier New" w:cs="Courier New"/>
+        </w:rPr>
+        <w:t xml:space="preserve">from a </w:t>
+      </w:r>
+      <w:r>
+        <w:rPr>
+          <w:rFonts w:ascii="Courier New" w:hAnsi="Courier New" w:cs="Courier New"/>
+        </w:rPr>
+        <w:t>pack</w:t>
+      </w:r>
+      <w:r>
+        <w:rPr>
+          <w:rFonts w:ascii="Courier New" w:hAnsi="Courier New" w:cs="Courier New"/>
+        </w:rPr>
+        <w:t>,</w:t>
+      </w:r>
+      <w:r>
+        <w:rPr>
+          <w:rFonts w:ascii="Courier New" w:hAnsi="Courier New" w:cs="Courier New"/>
+        </w:rPr>
+        <w:t xml:space="preserve"> </w:t>
+      </w:r>
+      <w:r>
+        <w:rPr>
+          <w:rFonts w:ascii="Courier New" w:hAnsi="Courier New" w:cs="Courier New"/>
+        </w:rPr>
+        <w:t xml:space="preserve">pops </w:t>
+      </w:r>
+      <w:r>
+        <w:rPr>
+          <w:rFonts w:ascii="Courier New" w:hAnsi="Courier New" w:cs="Courier New"/>
+        </w:rPr>
+        <w:t>it in his mouth</w:t>
+      </w:r>
+      <w:r>
+        <w:rPr>
+          <w:rFonts w:ascii="Courier New" w:hAnsi="Courier New" w:cs="Courier New"/>
+        </w:rPr>
+        <w:t xml:space="preserve"> and looks for </w:t>
+      </w:r>
+      <w:r>
+        <w:rPr>
+          <w:rFonts w:ascii="Courier New" w:hAnsi="Courier New" w:cs="Courier New"/>
+        </w:rPr>
+        <w:t xml:space="preserve">a </w:t>
+      </w:r>
+      <w:r>
+        <w:rPr>
+          <w:rFonts w:ascii="Courier New" w:hAnsi="Courier New" w:cs="Courier New"/>
+          <w:b/>
+          <w:bCs/>
+        </w:rPr>
+        <w:t>match</w:t>
+      </w:r>
+      <w:r>
+        <w:rPr>
+          <w:rFonts w:ascii="Courier New" w:hAnsi="Courier New" w:cs="Courier New"/>
+        </w:rPr>
+        <w:t>.</w:t>
+      </w:r>
+    </w:p>
+    <w:p>
+      <w:pPr>
+        <w:spacing w:line="240" w:lineRule="auto"/>
+        <w:jc w:val="center"/>
+        <w:rPr>
+          <w:rFonts w:ascii="Courier New" w:hAnsi="Courier New" w:cs="Courier New"/>
+        </w:rPr>
+      </w:pPr>
+      <w:r>
+        <w:rPr>
+          <w:rFonts w:ascii="Courier New" w:hAnsi="Courier New" w:cs="Courier New"/>
+          <w:b/>
+          <w:bCs/>
+        </w:rPr>
+        <w:t>FRIEND-4</w:t>
+      </w:r>
+      <w:r>
+        <w:rPr>
+          <w:rFonts w:ascii="Courier New" w:hAnsi="Courier New" w:cs="Courier New"/>
+          <w:b/>
+          <w:bCs/>
+        </w:rPr>
+        <w:br/>
+      </w:r>
+      <w:r>
+        <w:rPr>
+          <w:rFonts w:ascii="Courier New" w:hAnsi="Courier New" w:cs="Courier New"/>
+        </w:rPr>
+        <w:t>Est</w:t>
+      </w:r>
+      <w:r>
+        <w:rPr>
+          <w:rFonts w:ascii="Courier New" w:hAnsi="Courier New" w:cs="Courier New"/>
+        </w:rPr>
+        <w:t>o</w:t>
+      </w:r>
+      <w:r>
+        <w:rPr>
+          <w:rFonts w:ascii="Courier New" w:hAnsi="Courier New" w:cs="Courier New"/>
+        </w:rPr>
+        <w:t xml:space="preserve"> </w:t>
+      </w:r>
+      <w:proofErr w:type="spellStart"/>
+      <w:r>
+        <w:rPr>
+          <w:rFonts w:ascii="Courier New" w:hAnsi="Courier New" w:cs="Courier New"/>
+        </w:rPr>
+        <w:t>dum</w:t>
+      </w:r>
+      <w:proofErr w:type="spellEnd"/>
+      <w:r>
+        <w:rPr>
+          <w:rFonts w:ascii="Courier New" w:hAnsi="Courier New" w:cs="Courier New"/>
+        </w:rPr>
+        <w:t xml:space="preserve"> </w:t>
+      </w:r>
+      <w:proofErr w:type="spellStart"/>
+      <w:r>
+        <w:rPr>
+          <w:rFonts w:ascii="Courier New" w:hAnsi="Courier New" w:cs="Courier New"/>
+        </w:rPr>
+        <w:t>hodity</w:t>
+      </w:r>
+      <w:r>
+        <w:rPr>
+          <w:rFonts w:ascii="Courier New" w:hAnsi="Courier New" w:cs="Courier New"/>
+        </w:rPr>
+        <w:t>a</w:t>
+      </w:r>
+      <w:proofErr w:type="spellEnd"/>
+      <w:r>
+        <w:rPr>
+          <w:rFonts w:ascii="Courier New" w:hAnsi="Courier New" w:cs="Courier New"/>
+        </w:rPr>
+        <w:t xml:space="preserve">? </w:t>
+      </w:r>
+      <w:r>
+        <w:rPr>
+          <w:rFonts w:ascii="Courier New" w:hAnsi="Courier New" w:cs="Courier New"/>
+        </w:rPr>
+        <w:t>B</w:t>
+      </w:r>
+      <w:r>
+        <w:rPr>
+          <w:rFonts w:ascii="Courier New" w:hAnsi="Courier New" w:cs="Courier New"/>
+        </w:rPr>
+        <w:t xml:space="preserve">rain cells </w:t>
+      </w:r>
+      <w:proofErr w:type="spellStart"/>
+      <w:r>
+        <w:rPr>
+          <w:rFonts w:ascii="Courier New" w:hAnsi="Courier New" w:cs="Courier New"/>
+        </w:rPr>
+        <w:t>ella</w:t>
+      </w:r>
+      <w:proofErr w:type="spellEnd"/>
+      <w:r>
+        <w:rPr>
+          <w:rFonts w:ascii="Courier New" w:hAnsi="Courier New" w:cs="Courier New"/>
+        </w:rPr>
+        <w:t xml:space="preserve"> </w:t>
+      </w:r>
+      <w:proofErr w:type="spellStart"/>
+      <w:r>
+        <w:rPr>
+          <w:rFonts w:ascii="Courier New" w:hAnsi="Courier New" w:cs="Courier New"/>
+        </w:rPr>
+        <w:t>sathuguth</w:t>
+      </w:r>
+      <w:proofErr w:type="spellEnd"/>
+      <w:r>
+        <w:rPr>
+          <w:rFonts w:ascii="Courier New" w:hAnsi="Courier New" w:cs="Courier New"/>
+        </w:rPr>
+        <w:t xml:space="preserve"> </w:t>
+      </w:r>
+      <w:proofErr w:type="spellStart"/>
+      <w:r>
+        <w:rPr>
+          <w:rFonts w:ascii="Courier New" w:hAnsi="Courier New" w:cs="Courier New"/>
+        </w:rPr>
+        <w:t>aste</w:t>
+      </w:r>
+      <w:proofErr w:type="spellEnd"/>
+    </w:p>
+    <w:p>
+      <w:pPr>
+        <w:spacing w:line="240" w:lineRule="auto"/>
+        <w:jc w:val="center"/>
+        <w:rPr>
+          <w:rFonts w:ascii="Courier New" w:hAnsi="Courier New" w:cs="Courier New"/>
+          <w:i/>
+          <w:iCs/>
+        </w:rPr>
+      </w:pPr>
+      <w:r>
+        <w:rPr>
+          <w:rFonts w:ascii="Courier New" w:hAnsi="Courier New" w:cs="Courier New"/>
+          <w:b/>
+          <w:bCs/>
+        </w:rPr>
         <w:lastRenderedPageBreak/>
-        <w:t>ADI</w:t>
-      </w:r>
-      <w:r>
-        <w:rPr>
-          <w:rFonts w:ascii="Courier New" w:hAnsi="Courier New" w:cs="Courier New"/>
-          <w:b/>
-          <w:bCs/>
-        </w:rPr>
-        <w:t xml:space="preserve"> </w:t>
-      </w:r>
-      <w:r>
-        <w:rPr>
-          <w:rFonts w:ascii="Courier New" w:hAnsi="Courier New" w:cs="Courier New"/>
-          <w:i/>
-          <w:iCs/>
-        </w:rPr>
-        <w:t>(</w:t>
-      </w:r>
-      <w:r>
-        <w:rPr>
-          <w:rFonts w:ascii="Courier New" w:hAnsi="Courier New" w:cs="Courier New"/>
-          <w:i/>
-          <w:iCs/>
-        </w:rPr>
-        <w:t>smiles like a</w:t>
-      </w:r>
-      <w:r>
-        <w:rPr>
-          <w:rFonts w:ascii="Courier New" w:hAnsi="Courier New" w:cs="Courier New"/>
-          <w:i/>
-          <w:iCs/>
-        </w:rPr>
-        <w:t xml:space="preserve"> fool</w:t>
-      </w:r>
-      <w:r>
-        <w:rPr>
-          <w:rFonts w:ascii="Courier New" w:hAnsi="Courier New" w:cs="Courier New"/>
-          <w:i/>
-          <w:iCs/>
-        </w:rPr>
-        <w:t>)</w:t>
-      </w:r>
-      <w:r>
-        <w:rPr>
-          <w:rFonts w:ascii="Courier New" w:hAnsi="Courier New" w:cs="Courier New"/>
-          <w:b/>
-          <w:bCs/>
-        </w:rPr>
-        <w:br/>
-      </w:r>
-      <w:r>
-        <w:rPr>
-          <w:rFonts w:ascii="Courier New" w:hAnsi="Courier New" w:cs="Courier New"/>
-        </w:rPr>
-        <w:t xml:space="preserve">En </w:t>
-      </w:r>
-      <w:proofErr w:type="spellStart"/>
-      <w:r>
-        <w:rPr>
-          <w:rFonts w:ascii="Courier New" w:hAnsi="Courier New" w:cs="Courier New"/>
-        </w:rPr>
-        <w:t>vichitra</w:t>
-      </w:r>
-      <w:proofErr w:type="spellEnd"/>
-      <w:r>
-        <w:rPr>
-          <w:rFonts w:ascii="Courier New" w:hAnsi="Courier New" w:cs="Courier New"/>
-        </w:rPr>
-        <w:t xml:space="preserve"> </w:t>
-      </w:r>
-      <w:proofErr w:type="spellStart"/>
-      <w:r>
-        <w:rPr>
-          <w:rFonts w:ascii="Courier New" w:hAnsi="Courier New" w:cs="Courier New"/>
-        </w:rPr>
-        <w:t>kans</w:t>
-      </w:r>
-      <w:proofErr w:type="spellEnd"/>
-      <w:r>
-        <w:rPr>
-          <w:rFonts w:ascii="Courier New" w:hAnsi="Courier New" w:cs="Courier New"/>
-        </w:rPr>
-        <w:t xml:space="preserve"> guru</w:t>
-      </w:r>
-      <w:r>
-        <w:rPr>
-          <w:rFonts w:ascii="Courier New" w:hAnsi="Courier New" w:cs="Courier New"/>
-        </w:rPr>
-        <w:t>!</w:t>
-      </w:r>
-    </w:p>
-    <w:p>
-      <w:pPr>
-        <w:spacing w:line="240" w:lineRule="auto"/>
-        <w:rPr>
-          <w:rFonts w:ascii="Courier New" w:hAnsi="Courier New" w:cs="Courier New"/>
-        </w:rPr>
-      </w:pPr>
-      <w:r>
-        <w:rPr>
-          <w:rFonts w:ascii="Courier New" w:hAnsi="Courier New" w:cs="Courier New"/>
-        </w:rPr>
-        <w:t xml:space="preserve">He </w:t>
-      </w:r>
-      <w:r>
-        <w:rPr>
-          <w:rFonts w:ascii="Courier New" w:hAnsi="Courier New" w:cs="Courier New"/>
-        </w:rPr>
-        <w:t xml:space="preserve">pulls </w:t>
-      </w:r>
-      <w:r>
-        <w:rPr>
-          <w:rFonts w:ascii="Courier New" w:hAnsi="Courier New" w:cs="Courier New"/>
-        </w:rPr>
-        <w:t xml:space="preserve">a </w:t>
-      </w:r>
-      <w:r>
-        <w:rPr>
-          <w:rFonts w:ascii="Courier New" w:hAnsi="Courier New" w:cs="Courier New"/>
-          <w:b/>
-          <w:bCs/>
-        </w:rPr>
-        <w:t>cigarette</w:t>
-      </w:r>
-      <w:r>
-        <w:rPr>
-          <w:rFonts w:ascii="Courier New" w:hAnsi="Courier New" w:cs="Courier New"/>
-        </w:rPr>
-        <w:t xml:space="preserve"> </w:t>
-      </w:r>
-      <w:r>
-        <w:rPr>
-          <w:rFonts w:ascii="Courier New" w:hAnsi="Courier New" w:cs="Courier New"/>
-        </w:rPr>
-        <w:t xml:space="preserve">from a </w:t>
-      </w:r>
-      <w:r>
-        <w:rPr>
-          <w:rFonts w:ascii="Courier New" w:hAnsi="Courier New" w:cs="Courier New"/>
-        </w:rPr>
-        <w:t>pack</w:t>
-      </w:r>
-      <w:r>
-        <w:rPr>
-          <w:rFonts w:ascii="Courier New" w:hAnsi="Courier New" w:cs="Courier New"/>
-        </w:rPr>
-        <w:t>,</w:t>
-      </w:r>
-      <w:r>
-        <w:rPr>
-          <w:rFonts w:ascii="Courier New" w:hAnsi="Courier New" w:cs="Courier New"/>
-        </w:rPr>
-        <w:t xml:space="preserve"> </w:t>
-      </w:r>
-      <w:r>
-        <w:rPr>
-          <w:rFonts w:ascii="Courier New" w:hAnsi="Courier New" w:cs="Courier New"/>
-        </w:rPr>
-        <w:t xml:space="preserve">pops </w:t>
-      </w:r>
-      <w:r>
-        <w:rPr>
-          <w:rFonts w:ascii="Courier New" w:hAnsi="Courier New" w:cs="Courier New"/>
-        </w:rPr>
-        <w:t>it in his mouth</w:t>
-      </w:r>
-      <w:r>
-        <w:rPr>
-          <w:rFonts w:ascii="Courier New" w:hAnsi="Courier New" w:cs="Courier New"/>
-        </w:rPr>
-        <w:t xml:space="preserve"> and looks for </w:t>
-      </w:r>
-      <w:r>
-        <w:rPr>
-          <w:rFonts w:ascii="Courier New" w:hAnsi="Courier New" w:cs="Courier New"/>
-        </w:rPr>
-        <w:t xml:space="preserve">a </w:t>
-      </w:r>
-      <w:r>
-        <w:rPr>
-          <w:rFonts w:ascii="Courier New" w:hAnsi="Courier New" w:cs="Courier New"/>
-          <w:b/>
-          <w:bCs/>
-        </w:rPr>
-        <w:t>match</w:t>
-      </w:r>
-      <w:r>
-        <w:rPr>
-          <w:rFonts w:ascii="Courier New" w:hAnsi="Courier New" w:cs="Courier New"/>
-        </w:rPr>
-        <w:t>.</w:t>
-      </w:r>
-    </w:p>
-    <w:p>
-      <w:pPr>
-        <w:spacing w:line="240" w:lineRule="auto"/>
-        <w:jc w:val="center"/>
-        <w:rPr>
-          <w:rFonts w:ascii="Courier New" w:hAnsi="Courier New" w:cs="Courier New"/>
-        </w:rPr>
-      </w:pPr>
-      <w:r>
-        <w:rPr>
-          <w:rFonts w:ascii="Courier New" w:hAnsi="Courier New" w:cs="Courier New"/>
-          <w:b/>
-          <w:bCs/>
-        </w:rPr>
-        <w:t>FRIEND-4</w:t>
-      </w:r>
-      <w:r>
-        <w:rPr>
-          <w:rFonts w:ascii="Courier New" w:hAnsi="Courier New" w:cs="Courier New"/>
-          <w:b/>
-          <w:bCs/>
-        </w:rPr>
-        <w:br/>
-      </w:r>
-      <w:r>
-        <w:rPr>
-          <w:rFonts w:ascii="Courier New" w:hAnsi="Courier New" w:cs="Courier New"/>
-        </w:rPr>
-        <w:t>Est</w:t>
-      </w:r>
-      <w:r>
-        <w:rPr>
-          <w:rFonts w:ascii="Courier New" w:hAnsi="Courier New" w:cs="Courier New"/>
-        </w:rPr>
-        <w:t>o</w:t>
-      </w:r>
-      <w:r>
-        <w:rPr>
-          <w:rFonts w:ascii="Courier New" w:hAnsi="Courier New" w:cs="Courier New"/>
-        </w:rPr>
-        <w:t xml:space="preserve"> </w:t>
-      </w:r>
-      <w:proofErr w:type="spellStart"/>
-      <w:r>
-        <w:rPr>
-          <w:rFonts w:ascii="Courier New" w:hAnsi="Courier New" w:cs="Courier New"/>
-        </w:rPr>
-        <w:t>dum</w:t>
-      </w:r>
-      <w:proofErr w:type="spellEnd"/>
-      <w:r>
-        <w:rPr>
-          <w:rFonts w:ascii="Courier New" w:hAnsi="Courier New" w:cs="Courier New"/>
-        </w:rPr>
-        <w:t xml:space="preserve"> </w:t>
-      </w:r>
-      <w:proofErr w:type="spellStart"/>
-      <w:r>
-        <w:rPr>
-          <w:rFonts w:ascii="Courier New" w:hAnsi="Courier New" w:cs="Courier New"/>
-        </w:rPr>
-        <w:t>hodity</w:t>
-      </w:r>
-      <w:r>
-        <w:rPr>
-          <w:rFonts w:ascii="Courier New" w:hAnsi="Courier New" w:cs="Courier New"/>
-        </w:rPr>
-        <w:t>a</w:t>
-      </w:r>
-      <w:proofErr w:type="spellEnd"/>
-      <w:r>
-        <w:rPr>
-          <w:rFonts w:ascii="Courier New" w:hAnsi="Courier New" w:cs="Courier New"/>
-        </w:rPr>
-        <w:t xml:space="preserve">? </w:t>
-      </w:r>
-      <w:r>
-        <w:rPr>
-          <w:rFonts w:ascii="Courier New" w:hAnsi="Courier New" w:cs="Courier New"/>
-        </w:rPr>
-        <w:t>B</w:t>
-      </w:r>
-      <w:r>
-        <w:rPr>
-          <w:rFonts w:ascii="Courier New" w:hAnsi="Courier New" w:cs="Courier New"/>
-        </w:rPr>
-        <w:t xml:space="preserve">rain cells </w:t>
-      </w:r>
-      <w:proofErr w:type="spellStart"/>
-      <w:r>
-        <w:rPr>
-          <w:rFonts w:ascii="Courier New" w:hAnsi="Courier New" w:cs="Courier New"/>
-        </w:rPr>
-        <w:t>ella</w:t>
-      </w:r>
-      <w:proofErr w:type="spellEnd"/>
-      <w:r>
-        <w:rPr>
-          <w:rFonts w:ascii="Courier New" w:hAnsi="Courier New" w:cs="Courier New"/>
-        </w:rPr>
-        <w:t xml:space="preserve"> </w:t>
-      </w:r>
-      <w:proofErr w:type="spellStart"/>
-      <w:r>
-        <w:rPr>
-          <w:rFonts w:ascii="Courier New" w:hAnsi="Courier New" w:cs="Courier New"/>
-        </w:rPr>
-        <w:t>sathuguth</w:t>
-      </w:r>
-      <w:proofErr w:type="spellEnd"/>
-      <w:r>
-        <w:rPr>
-          <w:rFonts w:ascii="Courier New" w:hAnsi="Courier New" w:cs="Courier New"/>
-        </w:rPr>
-        <w:t xml:space="preserve"> </w:t>
-      </w:r>
-      <w:proofErr w:type="spellStart"/>
-      <w:r>
-        <w:rPr>
-          <w:rFonts w:ascii="Courier New" w:hAnsi="Courier New" w:cs="Courier New"/>
-        </w:rPr>
-        <w:t>aste</w:t>
-      </w:r>
-      <w:proofErr w:type="spellEnd"/>
-    </w:p>
-    <w:p>
-      <w:pPr>
-        <w:spacing w:line="240" w:lineRule="auto"/>
-        <w:jc w:val="center"/>
-        <w:rPr>
-          <w:rFonts w:ascii="Courier New" w:hAnsi="Courier New" w:cs="Courier New"/>
-          <w:i/>
-          <w:iCs/>
-        </w:rPr>
-      </w:pPr>
-      <w:r>
-        <w:rPr>
-          <w:rFonts w:ascii="Courier New" w:hAnsi="Courier New" w:cs="Courier New"/>
-          <w:b/>
-          <w:bCs/>
-        </w:rPr>
         <w:t>ADI</w:t>
       </w:r>
       <w:r>
@@ -19299,7 +19321,6 @@
         <w:rPr>
           <w:rFonts w:ascii="Courier New" w:hAnsi="Courier New" w:cs="Courier New"/>
         </w:rPr>
-        <w:lastRenderedPageBreak/>
         <w:t>Adi picks up the pill bottle.</w:t>
       </w:r>
       <w:r>
@@ -19490,6 +19511,7 @@
           <w:b/>
           <w:bCs/>
         </w:rPr>
+        <w:lastRenderedPageBreak/>
         <w:t xml:space="preserve">INT. </w:t>
       </w:r>
       <w:r>
@@ -21532,7 +21554,6 @@
         <w:rPr>
           <w:rFonts w:ascii="Courier New" w:hAnsi="Courier New" w:cs="Courier New"/>
         </w:rPr>
-        <w:lastRenderedPageBreak/>
         <w:t xml:space="preserve">He sits on the bed- Lifts his leg but not even a scratch. </w:t>
       </w:r>
       <w:r>
@@ -21782,6 +21803,7 @@
           <w:b/>
           <w:bCs/>
         </w:rPr>
+        <w:lastRenderedPageBreak/>
         <w:t xml:space="preserve">INT. </w:t>
       </w:r>
       <w:r>
@@ -23366,190 +23388,190 @@
         <w:rPr>
           <w:rFonts w:ascii="Courier New" w:hAnsi="Courier New" w:cs="Courier New"/>
         </w:rPr>
+        <w:t>He presses his palm on his face. Suddenly, a high pitch ring begins. His heart pounds. He starts losing focus. He is having a seizure and freezes like a statue.</w:t>
+      </w:r>
+    </w:p>
+    <w:p>
+      <w:pPr>
+        <w:spacing w:line="240" w:lineRule="auto"/>
+        <w:rPr>
+          <w:rFonts w:ascii="Courier New" w:hAnsi="Courier New" w:cs="Courier New"/>
+        </w:rPr>
+      </w:pPr>
+      <w:r>
+        <w:rPr>
+          <w:rFonts w:ascii="Courier New" w:hAnsi="Courier New" w:cs="Courier New"/>
+        </w:rPr>
+        <w:t xml:space="preserve">Suddenly, </w:t>
+      </w:r>
+      <w:r>
+        <w:rPr>
+          <w:rFonts w:ascii="Courier New" w:hAnsi="Courier New" w:cs="Courier New"/>
+        </w:rPr>
+        <w:t xml:space="preserve">he </w:t>
+      </w:r>
+      <w:r>
+        <w:rPr>
+          <w:rFonts w:ascii="Courier New" w:hAnsi="Courier New" w:cs="Courier New"/>
+        </w:rPr>
+        <w:t xml:space="preserve">is in the shadows </w:t>
+      </w:r>
+      <w:r>
+        <w:rPr>
+          <w:rFonts w:ascii="Courier New" w:hAnsi="Courier New" w:cs="Courier New"/>
+        </w:rPr>
+        <w:t>look</w:t>
+      </w:r>
+      <w:r>
+        <w:rPr>
+          <w:rFonts w:ascii="Courier New" w:hAnsi="Courier New" w:cs="Courier New"/>
+        </w:rPr>
+        <w:t>ing</w:t>
+      </w:r>
+      <w:r>
+        <w:rPr>
+          <w:rFonts w:ascii="Courier New" w:hAnsi="Courier New" w:cs="Courier New"/>
+        </w:rPr>
+        <w:t xml:space="preserve"> at himself and Kriti. </w:t>
+      </w:r>
+      <w:r>
+        <w:rPr>
+          <w:rFonts w:ascii="Courier New" w:hAnsi="Courier New" w:cs="Courier New"/>
+        </w:rPr>
+        <w:t>He tries to move</w:t>
+      </w:r>
+      <w:r>
+        <w:rPr>
+          <w:rFonts w:ascii="Courier New" w:hAnsi="Courier New" w:cs="Courier New"/>
+        </w:rPr>
+        <w:t xml:space="preserve"> but cannot</w:t>
+      </w:r>
+      <w:r>
+        <w:rPr>
+          <w:rFonts w:ascii="Courier New" w:hAnsi="Courier New" w:cs="Courier New"/>
+        </w:rPr>
+        <w:t xml:space="preserve">. </w:t>
+      </w:r>
+      <w:r>
+        <w:rPr>
+          <w:rFonts w:ascii="Courier New" w:hAnsi="Courier New" w:cs="Courier New"/>
+        </w:rPr>
+        <w:t xml:space="preserve">He is the </w:t>
+      </w:r>
+      <w:r>
+        <w:rPr>
+          <w:rFonts w:ascii="Courier New" w:hAnsi="Courier New" w:cs="Courier New"/>
+        </w:rPr>
+        <w:t xml:space="preserve">shadow </w:t>
+      </w:r>
+      <w:r>
+        <w:rPr>
+          <w:rFonts w:ascii="Courier New" w:hAnsi="Courier New" w:cs="Courier New"/>
+        </w:rPr>
+        <w:t xml:space="preserve">figure from Scene-7. </w:t>
+      </w:r>
+      <w:r>
+        <w:rPr>
+          <w:rFonts w:ascii="Courier New" w:hAnsi="Courier New" w:cs="Courier New"/>
+        </w:rPr>
+        <w:t>With difficulty h</w:t>
+      </w:r>
+      <w:r>
+        <w:rPr>
+          <w:rFonts w:ascii="Courier New" w:hAnsi="Courier New" w:cs="Courier New"/>
+        </w:rPr>
+        <w:t xml:space="preserve">e </w:t>
+      </w:r>
+      <w:r>
+        <w:rPr>
+          <w:rFonts w:ascii="Courier New" w:hAnsi="Courier New" w:cs="Courier New"/>
+        </w:rPr>
+        <w:t xml:space="preserve">lifts </w:t>
+      </w:r>
+      <w:r>
+        <w:rPr>
+          <w:rFonts w:ascii="Courier New" w:hAnsi="Courier New" w:cs="Courier New"/>
+        </w:rPr>
+        <w:t>his hand</w:t>
+      </w:r>
+      <w:r>
+        <w:rPr>
+          <w:rFonts w:ascii="Courier New" w:hAnsi="Courier New" w:cs="Courier New"/>
+        </w:rPr>
+        <w:t xml:space="preserve">. </w:t>
+      </w:r>
+      <w:r>
+        <w:rPr>
+          <w:rFonts w:ascii="Courier New" w:hAnsi="Courier New" w:cs="Courier New"/>
+        </w:rPr>
+        <w:t>WHOOSH</w:t>
+      </w:r>
+      <w:r>
+        <w:rPr>
+          <w:rFonts w:ascii="Courier New" w:hAnsi="Courier New" w:cs="Courier New"/>
+        </w:rPr>
+        <w:t>!</w:t>
+      </w:r>
+      <w:r>
+        <w:rPr>
+          <w:rFonts w:ascii="Courier New" w:hAnsi="Courier New" w:cs="Courier New"/>
+        </w:rPr>
+        <w:t xml:space="preserve"> </w:t>
+      </w:r>
+      <w:r>
+        <w:rPr>
+          <w:rFonts w:ascii="Courier New" w:hAnsi="Courier New" w:cs="Courier New"/>
+        </w:rPr>
+        <w:t>A dark cloud h</w:t>
+      </w:r>
+      <w:r>
+        <w:rPr>
+          <w:rFonts w:ascii="Courier New" w:hAnsi="Courier New" w:cs="Courier New"/>
+        </w:rPr>
+        <w:t xml:space="preserve">is vision </w:t>
+      </w:r>
+      <w:r>
+        <w:rPr>
+          <w:rFonts w:ascii="Courier New" w:hAnsi="Courier New" w:cs="Courier New"/>
+        </w:rPr>
+        <w:t xml:space="preserve">making it </w:t>
+      </w:r>
+      <w:r>
+        <w:rPr>
+          <w:rFonts w:ascii="Courier New" w:hAnsi="Courier New" w:cs="Courier New"/>
+        </w:rPr>
+        <w:t>fade</w:t>
+      </w:r>
+      <w:r>
+        <w:rPr>
+          <w:rFonts w:ascii="Courier New" w:hAnsi="Courier New" w:cs="Courier New"/>
+        </w:rPr>
+        <w:t xml:space="preserve"> </w:t>
+      </w:r>
+      <w:r>
+        <w:rPr>
+          <w:rFonts w:ascii="Courier New" w:hAnsi="Courier New" w:cs="Courier New"/>
+        </w:rPr>
+        <w:t>away.</w:t>
+      </w:r>
+    </w:p>
+    <w:p>
+      <w:pPr>
+        <w:spacing w:line="240" w:lineRule="auto"/>
+        <w:jc w:val="right"/>
+        <w:rPr>
+          <w:rFonts w:ascii="Courier New" w:hAnsi="Courier New" w:cs="Courier New"/>
+          <w:b/>
+          <w:bCs/>
+        </w:rPr>
+      </w:pPr>
+      <w:r>
+        <w:rPr>
+          <w:rFonts w:ascii="Courier New" w:hAnsi="Courier New" w:cs="Courier New"/>
+          <w:b/>
+          <w:bCs/>
+        </w:rPr>
         <w:lastRenderedPageBreak/>
-        <w:t>He presses his palm on his face. Suddenly, a high pitch ring begins. His heart pounds. He starts losing focus. He is having a seizure and freezes like a statue.</w:t>
-      </w:r>
-    </w:p>
-    <w:p>
-      <w:pPr>
-        <w:spacing w:line="240" w:lineRule="auto"/>
-        <w:rPr>
-          <w:rFonts w:ascii="Courier New" w:hAnsi="Courier New" w:cs="Courier New"/>
-        </w:rPr>
-      </w:pPr>
-      <w:r>
-        <w:rPr>
-          <w:rFonts w:ascii="Courier New" w:hAnsi="Courier New" w:cs="Courier New"/>
-        </w:rPr>
-        <w:t xml:space="preserve">Suddenly, </w:t>
-      </w:r>
-      <w:r>
-        <w:rPr>
-          <w:rFonts w:ascii="Courier New" w:hAnsi="Courier New" w:cs="Courier New"/>
-        </w:rPr>
-        <w:t xml:space="preserve">he </w:t>
-      </w:r>
-      <w:r>
-        <w:rPr>
-          <w:rFonts w:ascii="Courier New" w:hAnsi="Courier New" w:cs="Courier New"/>
-        </w:rPr>
-        <w:t xml:space="preserve">is in the shadows </w:t>
-      </w:r>
-      <w:r>
-        <w:rPr>
-          <w:rFonts w:ascii="Courier New" w:hAnsi="Courier New" w:cs="Courier New"/>
-        </w:rPr>
-        <w:t>look</w:t>
-      </w:r>
-      <w:r>
-        <w:rPr>
-          <w:rFonts w:ascii="Courier New" w:hAnsi="Courier New" w:cs="Courier New"/>
-        </w:rPr>
-        <w:t>ing</w:t>
-      </w:r>
-      <w:r>
-        <w:rPr>
-          <w:rFonts w:ascii="Courier New" w:hAnsi="Courier New" w:cs="Courier New"/>
-        </w:rPr>
-        <w:t xml:space="preserve"> at himself and Kriti. </w:t>
-      </w:r>
-      <w:r>
-        <w:rPr>
-          <w:rFonts w:ascii="Courier New" w:hAnsi="Courier New" w:cs="Courier New"/>
-        </w:rPr>
-        <w:t>He tries to move</w:t>
-      </w:r>
-      <w:r>
-        <w:rPr>
-          <w:rFonts w:ascii="Courier New" w:hAnsi="Courier New" w:cs="Courier New"/>
-        </w:rPr>
-        <w:t xml:space="preserve"> but cannot</w:t>
-      </w:r>
-      <w:r>
-        <w:rPr>
-          <w:rFonts w:ascii="Courier New" w:hAnsi="Courier New" w:cs="Courier New"/>
-        </w:rPr>
-        <w:t xml:space="preserve">. </w:t>
-      </w:r>
-      <w:r>
-        <w:rPr>
-          <w:rFonts w:ascii="Courier New" w:hAnsi="Courier New" w:cs="Courier New"/>
-        </w:rPr>
-        <w:t xml:space="preserve">He is the </w:t>
-      </w:r>
-      <w:r>
-        <w:rPr>
-          <w:rFonts w:ascii="Courier New" w:hAnsi="Courier New" w:cs="Courier New"/>
-        </w:rPr>
-        <w:t xml:space="preserve">shadow </w:t>
-      </w:r>
-      <w:r>
-        <w:rPr>
-          <w:rFonts w:ascii="Courier New" w:hAnsi="Courier New" w:cs="Courier New"/>
-        </w:rPr>
-        <w:t xml:space="preserve">figure from Scene-7. </w:t>
-      </w:r>
-      <w:r>
-        <w:rPr>
-          <w:rFonts w:ascii="Courier New" w:hAnsi="Courier New" w:cs="Courier New"/>
-        </w:rPr>
-        <w:t>With difficulty h</w:t>
-      </w:r>
-      <w:r>
-        <w:rPr>
-          <w:rFonts w:ascii="Courier New" w:hAnsi="Courier New" w:cs="Courier New"/>
-        </w:rPr>
-        <w:t xml:space="preserve">e </w:t>
-      </w:r>
-      <w:r>
-        <w:rPr>
-          <w:rFonts w:ascii="Courier New" w:hAnsi="Courier New" w:cs="Courier New"/>
-        </w:rPr>
-        <w:t xml:space="preserve">lifts </w:t>
-      </w:r>
-      <w:r>
-        <w:rPr>
-          <w:rFonts w:ascii="Courier New" w:hAnsi="Courier New" w:cs="Courier New"/>
-        </w:rPr>
-        <w:t>his hand</w:t>
-      </w:r>
-      <w:r>
-        <w:rPr>
-          <w:rFonts w:ascii="Courier New" w:hAnsi="Courier New" w:cs="Courier New"/>
-        </w:rPr>
-        <w:t xml:space="preserve">. </w:t>
-      </w:r>
-      <w:r>
-        <w:rPr>
-          <w:rFonts w:ascii="Courier New" w:hAnsi="Courier New" w:cs="Courier New"/>
-        </w:rPr>
-        <w:t>WHOOSH</w:t>
-      </w:r>
-      <w:r>
-        <w:rPr>
-          <w:rFonts w:ascii="Courier New" w:hAnsi="Courier New" w:cs="Courier New"/>
-        </w:rPr>
-        <w:t>!</w:t>
-      </w:r>
-      <w:r>
-        <w:rPr>
-          <w:rFonts w:ascii="Courier New" w:hAnsi="Courier New" w:cs="Courier New"/>
-        </w:rPr>
-        <w:t xml:space="preserve"> </w:t>
-      </w:r>
-      <w:r>
-        <w:rPr>
-          <w:rFonts w:ascii="Courier New" w:hAnsi="Courier New" w:cs="Courier New"/>
-        </w:rPr>
-        <w:t>A dark cloud h</w:t>
-      </w:r>
-      <w:r>
-        <w:rPr>
-          <w:rFonts w:ascii="Courier New" w:hAnsi="Courier New" w:cs="Courier New"/>
-        </w:rPr>
-        <w:t xml:space="preserve">is vision </w:t>
-      </w:r>
-      <w:r>
-        <w:rPr>
-          <w:rFonts w:ascii="Courier New" w:hAnsi="Courier New" w:cs="Courier New"/>
-        </w:rPr>
-        <w:t xml:space="preserve">making it </w:t>
-      </w:r>
-      <w:r>
-        <w:rPr>
-          <w:rFonts w:ascii="Courier New" w:hAnsi="Courier New" w:cs="Courier New"/>
-        </w:rPr>
-        <w:t>fade</w:t>
-      </w:r>
-      <w:r>
-        <w:rPr>
-          <w:rFonts w:ascii="Courier New" w:hAnsi="Courier New" w:cs="Courier New"/>
-        </w:rPr>
-        <w:t xml:space="preserve"> </w:t>
-      </w:r>
-      <w:r>
-        <w:rPr>
-          <w:rFonts w:ascii="Courier New" w:hAnsi="Courier New" w:cs="Courier New"/>
-        </w:rPr>
-        <w:t>away.</w:t>
-      </w:r>
-    </w:p>
-    <w:p>
-      <w:pPr>
-        <w:spacing w:line="240" w:lineRule="auto"/>
-        <w:jc w:val="right"/>
-        <w:rPr>
-          <w:rFonts w:ascii="Courier New" w:hAnsi="Courier New" w:cs="Courier New"/>
-          <w:b/>
-          <w:bCs/>
-        </w:rPr>
-      </w:pPr>
-      <w:r>
-        <w:rPr>
-          <w:rFonts w:ascii="Courier New" w:hAnsi="Courier New" w:cs="Courier New"/>
-          <w:b/>
-          <w:bCs/>
-        </w:rPr>
         <w:t>BLUR IRIS FADE CUT TO:</w:t>
       </w:r>
     </w:p>
@@ -25093,12 +25115,6 @@
           <w:rFonts w:ascii="Courier New" w:hAnsi="Courier New" w:cs="Courier New"/>
         </w:rPr>
         <w:br/>
-      </w:r>
-      <w:r>
-        <w:rPr>
-          <w:rFonts w:ascii="Courier New" w:hAnsi="Courier New" w:cs="Courier New"/>
-        </w:rPr>
-        <w:lastRenderedPageBreak/>
         <w:t>- Suddenly, the landline rings. He picks it up. On the call “Adi</w:t>
       </w:r>
       <w:r>
@@ -25245,6 +25261,7 @@
         <w:rPr>
           <w:rFonts w:ascii="Courier New" w:hAnsi="Courier New" w:cs="Courier New"/>
         </w:rPr>
+        <w:lastRenderedPageBreak/>
         <w:t xml:space="preserve">- </w:t>
       </w:r>
       <w:r>
@@ -26688,373 +26705,373 @@
           <w:b/>
           <w:bCs/>
         </w:rPr>
+        <w:t xml:space="preserve">    </w:t>
+      </w:r>
+      <w:r>
+        <w:rPr>
+          <w:rFonts w:ascii="Courier New" w:hAnsi="Courier New" w:cs="Courier New"/>
+          <w:b/>
+          <w:bCs/>
+        </w:rPr>
+        <w:t>ADI</w:t>
+      </w:r>
+      <w:r>
+        <w:rPr>
+          <w:rFonts w:ascii="Courier New" w:hAnsi="Courier New" w:cs="Courier New"/>
+          <w:b/>
+          <w:bCs/>
+        </w:rPr>
+        <w:t xml:space="preserve">: </w:t>
+      </w:r>
+      <w:r>
+        <w:rPr>
+          <w:rFonts w:ascii="Courier New" w:hAnsi="Courier New" w:cs="Courier New"/>
+        </w:rPr>
+        <w:t xml:space="preserve">Le </w:t>
+      </w:r>
+      <w:proofErr w:type="spellStart"/>
+      <w:r>
+        <w:rPr>
+          <w:rFonts w:ascii="Courier New" w:hAnsi="Courier New" w:cs="Courier New"/>
+        </w:rPr>
+        <w:t>esto</w:t>
+      </w:r>
+      <w:proofErr w:type="spellEnd"/>
+      <w:r>
+        <w:rPr>
+          <w:rFonts w:ascii="Courier New" w:hAnsi="Courier New" w:cs="Courier New"/>
+        </w:rPr>
+        <w:t xml:space="preserve"> </w:t>
+      </w:r>
+      <w:proofErr w:type="spellStart"/>
+      <w:r>
+        <w:rPr>
+          <w:rFonts w:ascii="Courier New" w:hAnsi="Courier New" w:cs="Courier New"/>
+        </w:rPr>
+        <w:t>kuditya</w:t>
+      </w:r>
+      <w:proofErr w:type="spellEnd"/>
+      <w:r>
+        <w:rPr>
+          <w:rFonts w:ascii="Courier New" w:hAnsi="Courier New" w:cs="Courier New"/>
+        </w:rPr>
+        <w:t>?</w:t>
+      </w:r>
+      <w:r>
+        <w:rPr>
+          <w:rFonts w:ascii="Courier New" w:hAnsi="Courier New" w:cs="Courier New"/>
+        </w:rPr>
+        <w:br/>
+      </w:r>
+      <w:r>
+        <w:rPr>
+          <w:rFonts w:ascii="Courier New" w:hAnsi="Courier New" w:cs="Courier New"/>
+          <w:b/>
+          <w:bCs/>
+        </w:rPr>
+        <w:t xml:space="preserve">    </w:t>
+      </w:r>
+      <w:r>
+        <w:rPr>
+          <w:rFonts w:ascii="Courier New" w:hAnsi="Courier New" w:cs="Courier New"/>
+          <w:b/>
+          <w:bCs/>
+        </w:rPr>
+        <w:t>GIRI</w:t>
+      </w:r>
+      <w:r>
+        <w:rPr>
+          <w:rFonts w:ascii="Courier New" w:hAnsi="Courier New" w:cs="Courier New"/>
+          <w:b/>
+          <w:bCs/>
+        </w:rPr>
+        <w:t>:</w:t>
+      </w:r>
+      <w:r>
+        <w:rPr>
+          <w:rFonts w:ascii="Courier New" w:hAnsi="Courier New" w:cs="Courier New"/>
+          <w:i/>
+          <w:iCs/>
+        </w:rPr>
+        <w:t>(laughs)</w:t>
+      </w:r>
+      <w:r>
+        <w:rPr>
+          <w:rFonts w:ascii="Courier New" w:hAnsi="Courier New" w:cs="Courier New"/>
+        </w:rPr>
+        <w:t xml:space="preserve"> </w:t>
+      </w:r>
+      <w:proofErr w:type="spellStart"/>
+      <w:r>
+        <w:rPr>
+          <w:rFonts w:ascii="Courier New" w:hAnsi="Courier New" w:cs="Courier New"/>
+        </w:rPr>
+        <w:t>ning</w:t>
+      </w:r>
+      <w:proofErr w:type="spellEnd"/>
+      <w:r>
+        <w:rPr>
+          <w:rFonts w:ascii="Courier New" w:hAnsi="Courier New" w:cs="Courier New"/>
+        </w:rPr>
+        <w:t xml:space="preserve"> </w:t>
+      </w:r>
+      <w:proofErr w:type="spellStart"/>
+      <w:r>
+        <w:rPr>
+          <w:rFonts w:ascii="Courier New" w:hAnsi="Courier New" w:cs="Courier New"/>
+        </w:rPr>
+        <w:t>a</w:t>
+      </w:r>
+      <w:r>
+        <w:rPr>
+          <w:rFonts w:ascii="Courier New" w:hAnsi="Courier New" w:cs="Courier New"/>
+        </w:rPr>
+        <w:t>rtha</w:t>
+      </w:r>
+      <w:proofErr w:type="spellEnd"/>
+      <w:r>
+        <w:rPr>
+          <w:rFonts w:ascii="Courier New" w:hAnsi="Courier New" w:cs="Courier New"/>
+        </w:rPr>
+        <w:t xml:space="preserve"> </w:t>
+      </w:r>
+      <w:proofErr w:type="spellStart"/>
+      <w:r>
+        <w:rPr>
+          <w:rFonts w:ascii="Courier New" w:hAnsi="Courier New" w:cs="Courier New"/>
+        </w:rPr>
+        <w:t>agala</w:t>
+      </w:r>
+      <w:proofErr w:type="spellEnd"/>
+      <w:r>
+        <w:rPr>
+          <w:rFonts w:ascii="Courier New" w:hAnsi="Courier New" w:cs="Courier New"/>
+        </w:rPr>
+        <w:t xml:space="preserve"> </w:t>
+      </w:r>
+      <w:proofErr w:type="spellStart"/>
+      <w:r>
+        <w:rPr>
+          <w:rFonts w:ascii="Courier New" w:hAnsi="Courier New" w:cs="Courier New"/>
+        </w:rPr>
+        <w:t>bido</w:t>
+      </w:r>
+      <w:proofErr w:type="spellEnd"/>
+      <w:r>
+        <w:rPr>
+          <w:rFonts w:ascii="Courier New" w:hAnsi="Courier New" w:cs="Courier New"/>
+        </w:rPr>
+        <w:br/>
+      </w:r>
+      <w:r>
+        <w:rPr>
+          <w:rFonts w:ascii="Courier New" w:hAnsi="Courier New" w:cs="Courier New"/>
+          <w:u w:val="single"/>
+        </w:rPr>
+        <w:t xml:space="preserve">OUT OF </w:t>
+      </w:r>
+      <w:r>
+        <w:rPr>
+          <w:rFonts w:ascii="Courier New" w:hAnsi="Courier New" w:cs="Courier New"/>
+          <w:u w:val="single"/>
+        </w:rPr>
+        <w:t>SEIZURE</w:t>
+      </w:r>
+      <w:r>
+        <w:rPr>
+          <w:rFonts w:ascii="Courier New" w:hAnsi="Courier New" w:cs="Courier New"/>
+          <w:u w:val="single"/>
+        </w:rPr>
+        <w:t xml:space="preserve"> </w:t>
+      </w:r>
+      <w:r>
+        <w:rPr>
+          <w:rFonts w:ascii="Courier New" w:hAnsi="Courier New" w:cs="Courier New"/>
+          <w:u w:val="single"/>
+        </w:rPr>
+        <w:t>MEMORY</w:t>
+      </w:r>
+      <w:r>
+        <w:rPr>
+          <w:rFonts w:ascii="Courier New" w:hAnsi="Courier New" w:cs="Courier New"/>
+        </w:rPr>
+        <w:t xml:space="preserve"> </w:t>
+      </w:r>
+      <w:r>
+        <w:rPr>
+          <w:rFonts w:ascii="Courier New" w:hAnsi="Courier New" w:cs="Courier New"/>
+        </w:rPr>
+        <w:t>- Adi is making a different gesture. Kriti is worried.</w:t>
+      </w:r>
+      <w:r>
+        <w:rPr>
+          <w:rFonts w:ascii="Courier New" w:hAnsi="Courier New" w:cs="Courier New"/>
+        </w:rPr>
+        <w:br/>
+      </w:r>
+      <w:r>
+        <w:rPr>
+          <w:rFonts w:ascii="Courier New" w:hAnsi="Courier New" w:cs="Courier New"/>
+          <w:b/>
+          <w:bCs/>
+        </w:rPr>
+        <w:t>2</w:t>
+      </w:r>
+      <w:r>
+        <w:rPr>
+          <w:rFonts w:ascii="Courier New" w:hAnsi="Courier New" w:cs="Courier New"/>
+          <w:b/>
+          <w:bCs/>
+        </w:rPr>
+        <w:t>1</w:t>
+      </w:r>
+      <w:r>
+        <w:rPr>
+          <w:rFonts w:ascii="Courier New" w:hAnsi="Courier New" w:cs="Courier New"/>
+          <w:b/>
+          <w:bCs/>
+        </w:rPr>
+        <w:t>B.</w:t>
+      </w:r>
+      <w:r>
+        <w:rPr>
+          <w:rFonts w:ascii="Courier New" w:hAnsi="Courier New" w:cs="Courier New"/>
+        </w:rPr>
+        <w:t xml:space="preserve"> Adi is teaching Ved how to tie his shoelace.</w:t>
+      </w:r>
+      <w:r>
+        <w:rPr>
+          <w:rFonts w:ascii="Courier New" w:hAnsi="Courier New" w:cs="Courier New"/>
+        </w:rPr>
+        <w:br/>
+      </w:r>
+      <w:r>
+        <w:rPr>
+          <w:rFonts w:ascii="Courier New" w:hAnsi="Courier New" w:cs="Courier New"/>
+          <w:b/>
+          <w:bCs/>
+        </w:rPr>
+        <w:t xml:space="preserve">    </w:t>
+      </w:r>
+      <w:r>
+        <w:rPr>
+          <w:rFonts w:ascii="Courier New" w:hAnsi="Courier New" w:cs="Courier New"/>
+          <w:b/>
+          <w:bCs/>
+        </w:rPr>
+        <w:t>ADI</w:t>
+      </w:r>
+      <w:r>
+        <w:rPr>
+          <w:rFonts w:ascii="Courier New" w:hAnsi="Courier New" w:cs="Courier New"/>
+          <w:b/>
+          <w:bCs/>
+        </w:rPr>
+        <w:t xml:space="preserve">: </w:t>
+      </w:r>
+      <w:r>
+        <w:rPr>
+          <w:rFonts w:ascii="Courier New" w:hAnsi="Courier New" w:cs="Courier New"/>
+        </w:rPr>
+        <w:t xml:space="preserve">Hing </w:t>
+      </w:r>
+      <w:proofErr w:type="spellStart"/>
+      <w:r>
+        <w:rPr>
+          <w:rFonts w:ascii="Courier New" w:hAnsi="Courier New" w:cs="Courier New"/>
+        </w:rPr>
+        <w:t>madi</w:t>
+      </w:r>
+      <w:proofErr w:type="spellEnd"/>
+      <w:r>
+        <w:rPr>
+          <w:rFonts w:ascii="Courier New" w:hAnsi="Courier New" w:cs="Courier New"/>
+        </w:rPr>
+        <w:t xml:space="preserve">! Hing </w:t>
+      </w:r>
+      <w:proofErr w:type="spellStart"/>
+      <w:r>
+        <w:rPr>
+          <w:rFonts w:ascii="Courier New" w:hAnsi="Courier New" w:cs="Courier New"/>
+        </w:rPr>
+        <w:t>madbek</w:t>
+      </w:r>
+      <w:proofErr w:type="spellEnd"/>
+      <w:r>
+        <w:rPr>
+          <w:rFonts w:ascii="Courier New" w:hAnsi="Courier New" w:cs="Courier New"/>
+        </w:rPr>
+        <w:t>!</w:t>
+      </w:r>
+      <w:r>
+        <w:rPr>
+          <w:rFonts w:ascii="Courier New" w:hAnsi="Courier New" w:cs="Courier New"/>
+        </w:rPr>
+        <w:t xml:space="preserve"> </w:t>
+      </w:r>
+      <w:r>
+        <w:rPr>
+          <w:rFonts w:ascii="Courier New" w:hAnsi="Courier New" w:cs="Courier New"/>
+        </w:rPr>
+        <w:t>Aste! Very Simple!</w:t>
+      </w:r>
+      <w:r>
+        <w:rPr>
+          <w:rFonts w:ascii="Courier New" w:hAnsi="Courier New" w:cs="Courier New"/>
+        </w:rPr>
+        <w:br/>
+      </w:r>
+      <w:r>
+        <w:rPr>
+          <w:rFonts w:ascii="Courier New" w:hAnsi="Courier New" w:cs="Courier New"/>
+          <w:u w:val="single"/>
+        </w:rPr>
+        <w:t xml:space="preserve">OUT OF SEIZURE </w:t>
+      </w:r>
+      <w:r>
+        <w:rPr>
+          <w:rFonts w:ascii="Courier New" w:hAnsi="Courier New" w:cs="Courier New"/>
+          <w:u w:val="single"/>
+        </w:rPr>
+        <w:t>MEMORY</w:t>
+      </w:r>
+      <w:r>
+        <w:rPr>
+          <w:rFonts w:ascii="Courier New" w:hAnsi="Courier New" w:cs="Courier New"/>
+        </w:rPr>
+        <w:t xml:space="preserve"> </w:t>
+      </w:r>
+      <w:r>
+        <w:rPr>
+          <w:rFonts w:ascii="Courier New" w:hAnsi="Courier New" w:cs="Courier New"/>
+        </w:rPr>
+        <w:t>- Adi is making a different gesture</w:t>
+      </w:r>
+      <w:r>
+        <w:rPr>
+          <w:rFonts w:ascii="Courier New" w:hAnsi="Courier New" w:cs="Courier New"/>
+        </w:rPr>
+        <w:t xml:space="preserve"> again</w:t>
+      </w:r>
+      <w:r>
+        <w:rPr>
+          <w:rFonts w:ascii="Courier New" w:hAnsi="Courier New" w:cs="Courier New"/>
+        </w:rPr>
+        <w:t>.</w:t>
+      </w:r>
+      <w:r>
+        <w:rPr>
+          <w:rFonts w:ascii="Courier New" w:hAnsi="Courier New" w:cs="Courier New"/>
+        </w:rPr>
+        <w:br/>
+      </w:r>
+      <w:r>
+        <w:rPr>
+          <w:rFonts w:ascii="Courier New" w:hAnsi="Courier New" w:cs="Courier New"/>
+          <w:b/>
+          <w:bCs/>
+        </w:rPr>
         <w:lastRenderedPageBreak/>
-        <w:t xml:space="preserve">    </w:t>
-      </w:r>
-      <w:r>
-        <w:rPr>
-          <w:rFonts w:ascii="Courier New" w:hAnsi="Courier New" w:cs="Courier New"/>
-          <w:b/>
-          <w:bCs/>
-        </w:rPr>
-        <w:t>ADI</w:t>
-      </w:r>
-      <w:r>
-        <w:rPr>
-          <w:rFonts w:ascii="Courier New" w:hAnsi="Courier New" w:cs="Courier New"/>
-          <w:b/>
-          <w:bCs/>
-        </w:rPr>
-        <w:t xml:space="preserve">: </w:t>
-      </w:r>
-      <w:r>
-        <w:rPr>
-          <w:rFonts w:ascii="Courier New" w:hAnsi="Courier New" w:cs="Courier New"/>
-        </w:rPr>
-        <w:t xml:space="preserve">Le </w:t>
-      </w:r>
-      <w:proofErr w:type="spellStart"/>
-      <w:r>
-        <w:rPr>
-          <w:rFonts w:ascii="Courier New" w:hAnsi="Courier New" w:cs="Courier New"/>
-        </w:rPr>
-        <w:t>esto</w:t>
-      </w:r>
-      <w:proofErr w:type="spellEnd"/>
-      <w:r>
-        <w:rPr>
-          <w:rFonts w:ascii="Courier New" w:hAnsi="Courier New" w:cs="Courier New"/>
-        </w:rPr>
-        <w:t xml:space="preserve"> </w:t>
-      </w:r>
-      <w:proofErr w:type="spellStart"/>
-      <w:r>
-        <w:rPr>
-          <w:rFonts w:ascii="Courier New" w:hAnsi="Courier New" w:cs="Courier New"/>
-        </w:rPr>
-        <w:t>kuditya</w:t>
-      </w:r>
-      <w:proofErr w:type="spellEnd"/>
-      <w:r>
-        <w:rPr>
-          <w:rFonts w:ascii="Courier New" w:hAnsi="Courier New" w:cs="Courier New"/>
-        </w:rPr>
-        <w:t>?</w:t>
-      </w:r>
-      <w:r>
-        <w:rPr>
-          <w:rFonts w:ascii="Courier New" w:hAnsi="Courier New" w:cs="Courier New"/>
-        </w:rPr>
-        <w:br/>
-      </w:r>
-      <w:r>
-        <w:rPr>
-          <w:rFonts w:ascii="Courier New" w:hAnsi="Courier New" w:cs="Courier New"/>
-          <w:b/>
-          <w:bCs/>
-        </w:rPr>
-        <w:t xml:space="preserve">    </w:t>
-      </w:r>
-      <w:r>
-        <w:rPr>
-          <w:rFonts w:ascii="Courier New" w:hAnsi="Courier New" w:cs="Courier New"/>
-          <w:b/>
-          <w:bCs/>
-        </w:rPr>
-        <w:t>GIRI</w:t>
-      </w:r>
-      <w:r>
-        <w:rPr>
-          <w:rFonts w:ascii="Courier New" w:hAnsi="Courier New" w:cs="Courier New"/>
-          <w:b/>
-          <w:bCs/>
-        </w:rPr>
-        <w:t>:</w:t>
-      </w:r>
-      <w:r>
-        <w:rPr>
-          <w:rFonts w:ascii="Courier New" w:hAnsi="Courier New" w:cs="Courier New"/>
-          <w:i/>
-          <w:iCs/>
-        </w:rPr>
-        <w:t>(laughs)</w:t>
-      </w:r>
-      <w:r>
-        <w:rPr>
-          <w:rFonts w:ascii="Courier New" w:hAnsi="Courier New" w:cs="Courier New"/>
-        </w:rPr>
-        <w:t xml:space="preserve"> </w:t>
-      </w:r>
-      <w:proofErr w:type="spellStart"/>
-      <w:r>
-        <w:rPr>
-          <w:rFonts w:ascii="Courier New" w:hAnsi="Courier New" w:cs="Courier New"/>
-        </w:rPr>
-        <w:t>ning</w:t>
-      </w:r>
-      <w:proofErr w:type="spellEnd"/>
-      <w:r>
-        <w:rPr>
-          <w:rFonts w:ascii="Courier New" w:hAnsi="Courier New" w:cs="Courier New"/>
-        </w:rPr>
-        <w:t xml:space="preserve"> </w:t>
-      </w:r>
-      <w:proofErr w:type="spellStart"/>
-      <w:r>
-        <w:rPr>
-          <w:rFonts w:ascii="Courier New" w:hAnsi="Courier New" w:cs="Courier New"/>
-        </w:rPr>
-        <w:t>a</w:t>
-      </w:r>
-      <w:r>
-        <w:rPr>
-          <w:rFonts w:ascii="Courier New" w:hAnsi="Courier New" w:cs="Courier New"/>
-        </w:rPr>
-        <w:t>rtha</w:t>
-      </w:r>
-      <w:proofErr w:type="spellEnd"/>
-      <w:r>
-        <w:rPr>
-          <w:rFonts w:ascii="Courier New" w:hAnsi="Courier New" w:cs="Courier New"/>
-        </w:rPr>
-        <w:t xml:space="preserve"> </w:t>
-      </w:r>
-      <w:proofErr w:type="spellStart"/>
-      <w:r>
-        <w:rPr>
-          <w:rFonts w:ascii="Courier New" w:hAnsi="Courier New" w:cs="Courier New"/>
-        </w:rPr>
-        <w:t>agala</w:t>
-      </w:r>
-      <w:proofErr w:type="spellEnd"/>
-      <w:r>
-        <w:rPr>
-          <w:rFonts w:ascii="Courier New" w:hAnsi="Courier New" w:cs="Courier New"/>
-        </w:rPr>
-        <w:t xml:space="preserve"> </w:t>
-      </w:r>
-      <w:proofErr w:type="spellStart"/>
-      <w:r>
-        <w:rPr>
-          <w:rFonts w:ascii="Courier New" w:hAnsi="Courier New" w:cs="Courier New"/>
-        </w:rPr>
-        <w:t>bido</w:t>
-      </w:r>
-      <w:proofErr w:type="spellEnd"/>
-      <w:r>
-        <w:rPr>
-          <w:rFonts w:ascii="Courier New" w:hAnsi="Courier New" w:cs="Courier New"/>
-        </w:rPr>
-        <w:br/>
-      </w:r>
-      <w:r>
-        <w:rPr>
-          <w:rFonts w:ascii="Courier New" w:hAnsi="Courier New" w:cs="Courier New"/>
-          <w:u w:val="single"/>
-        </w:rPr>
-        <w:t xml:space="preserve">OUT OF </w:t>
-      </w:r>
-      <w:r>
-        <w:rPr>
-          <w:rFonts w:ascii="Courier New" w:hAnsi="Courier New" w:cs="Courier New"/>
-          <w:u w:val="single"/>
-        </w:rPr>
-        <w:t>SEIZURE</w:t>
-      </w:r>
-      <w:r>
-        <w:rPr>
-          <w:rFonts w:ascii="Courier New" w:hAnsi="Courier New" w:cs="Courier New"/>
-          <w:u w:val="single"/>
-        </w:rPr>
-        <w:t xml:space="preserve"> </w:t>
-      </w:r>
-      <w:r>
-        <w:rPr>
-          <w:rFonts w:ascii="Courier New" w:hAnsi="Courier New" w:cs="Courier New"/>
-          <w:u w:val="single"/>
-        </w:rPr>
-        <w:t>MEMORY</w:t>
-      </w:r>
-      <w:r>
-        <w:rPr>
-          <w:rFonts w:ascii="Courier New" w:hAnsi="Courier New" w:cs="Courier New"/>
-        </w:rPr>
-        <w:t xml:space="preserve"> </w:t>
-      </w:r>
-      <w:r>
-        <w:rPr>
-          <w:rFonts w:ascii="Courier New" w:hAnsi="Courier New" w:cs="Courier New"/>
-        </w:rPr>
-        <w:t>- Adi is making a different gesture. Kriti is worried.</w:t>
-      </w:r>
-      <w:r>
-        <w:rPr>
-          <w:rFonts w:ascii="Courier New" w:hAnsi="Courier New" w:cs="Courier New"/>
-        </w:rPr>
-        <w:br/>
-      </w:r>
-      <w:r>
-        <w:rPr>
-          <w:rFonts w:ascii="Courier New" w:hAnsi="Courier New" w:cs="Courier New"/>
-          <w:b/>
-          <w:bCs/>
-        </w:rPr>
-        <w:t>2</w:t>
-      </w:r>
-      <w:r>
-        <w:rPr>
-          <w:rFonts w:ascii="Courier New" w:hAnsi="Courier New" w:cs="Courier New"/>
-          <w:b/>
-          <w:bCs/>
-        </w:rPr>
-        <w:t>1</w:t>
-      </w:r>
-      <w:r>
-        <w:rPr>
-          <w:rFonts w:ascii="Courier New" w:hAnsi="Courier New" w:cs="Courier New"/>
-          <w:b/>
-          <w:bCs/>
-        </w:rPr>
-        <w:t>B.</w:t>
-      </w:r>
-      <w:r>
-        <w:rPr>
-          <w:rFonts w:ascii="Courier New" w:hAnsi="Courier New" w:cs="Courier New"/>
-        </w:rPr>
-        <w:t xml:space="preserve"> Adi is teaching Ved how to tie his shoelace.</w:t>
-      </w:r>
-      <w:r>
-        <w:rPr>
-          <w:rFonts w:ascii="Courier New" w:hAnsi="Courier New" w:cs="Courier New"/>
-        </w:rPr>
-        <w:br/>
-      </w:r>
-      <w:r>
-        <w:rPr>
-          <w:rFonts w:ascii="Courier New" w:hAnsi="Courier New" w:cs="Courier New"/>
-          <w:b/>
-          <w:bCs/>
-        </w:rPr>
-        <w:t xml:space="preserve">    </w:t>
-      </w:r>
-      <w:r>
-        <w:rPr>
-          <w:rFonts w:ascii="Courier New" w:hAnsi="Courier New" w:cs="Courier New"/>
-          <w:b/>
-          <w:bCs/>
-        </w:rPr>
-        <w:t>ADI</w:t>
-      </w:r>
-      <w:r>
-        <w:rPr>
-          <w:rFonts w:ascii="Courier New" w:hAnsi="Courier New" w:cs="Courier New"/>
-          <w:b/>
-          <w:bCs/>
-        </w:rPr>
-        <w:t xml:space="preserve">: </w:t>
-      </w:r>
-      <w:r>
-        <w:rPr>
-          <w:rFonts w:ascii="Courier New" w:hAnsi="Courier New" w:cs="Courier New"/>
-        </w:rPr>
-        <w:t xml:space="preserve">Hing </w:t>
-      </w:r>
-      <w:proofErr w:type="spellStart"/>
-      <w:r>
-        <w:rPr>
-          <w:rFonts w:ascii="Courier New" w:hAnsi="Courier New" w:cs="Courier New"/>
-        </w:rPr>
-        <w:t>madi</w:t>
-      </w:r>
-      <w:proofErr w:type="spellEnd"/>
-      <w:r>
-        <w:rPr>
-          <w:rFonts w:ascii="Courier New" w:hAnsi="Courier New" w:cs="Courier New"/>
-        </w:rPr>
-        <w:t xml:space="preserve">! Hing </w:t>
-      </w:r>
-      <w:proofErr w:type="spellStart"/>
-      <w:r>
-        <w:rPr>
-          <w:rFonts w:ascii="Courier New" w:hAnsi="Courier New" w:cs="Courier New"/>
-        </w:rPr>
-        <w:t>madbek</w:t>
-      </w:r>
-      <w:proofErr w:type="spellEnd"/>
-      <w:r>
-        <w:rPr>
-          <w:rFonts w:ascii="Courier New" w:hAnsi="Courier New" w:cs="Courier New"/>
-        </w:rPr>
-        <w:t>!</w:t>
-      </w:r>
-      <w:r>
-        <w:rPr>
-          <w:rFonts w:ascii="Courier New" w:hAnsi="Courier New" w:cs="Courier New"/>
-        </w:rPr>
-        <w:t xml:space="preserve"> </w:t>
-      </w:r>
-      <w:r>
-        <w:rPr>
-          <w:rFonts w:ascii="Courier New" w:hAnsi="Courier New" w:cs="Courier New"/>
-        </w:rPr>
-        <w:t>Aste! Very Simple!</w:t>
-      </w:r>
-      <w:r>
-        <w:rPr>
-          <w:rFonts w:ascii="Courier New" w:hAnsi="Courier New" w:cs="Courier New"/>
-        </w:rPr>
-        <w:br/>
-      </w:r>
-      <w:r>
-        <w:rPr>
-          <w:rFonts w:ascii="Courier New" w:hAnsi="Courier New" w:cs="Courier New"/>
-          <w:u w:val="single"/>
-        </w:rPr>
-        <w:t xml:space="preserve">OUT OF SEIZURE </w:t>
-      </w:r>
-      <w:r>
-        <w:rPr>
-          <w:rFonts w:ascii="Courier New" w:hAnsi="Courier New" w:cs="Courier New"/>
-          <w:u w:val="single"/>
-        </w:rPr>
-        <w:t>MEMORY</w:t>
-      </w:r>
-      <w:r>
-        <w:rPr>
-          <w:rFonts w:ascii="Courier New" w:hAnsi="Courier New" w:cs="Courier New"/>
-        </w:rPr>
-        <w:t xml:space="preserve"> </w:t>
-      </w:r>
-      <w:r>
-        <w:rPr>
-          <w:rFonts w:ascii="Courier New" w:hAnsi="Courier New" w:cs="Courier New"/>
-        </w:rPr>
-        <w:t>- Adi is making a different gesture</w:t>
-      </w:r>
-      <w:r>
-        <w:rPr>
-          <w:rFonts w:ascii="Courier New" w:hAnsi="Courier New" w:cs="Courier New"/>
-        </w:rPr>
-        <w:t xml:space="preserve"> again</w:t>
-      </w:r>
-      <w:r>
-        <w:rPr>
-          <w:rFonts w:ascii="Courier New" w:hAnsi="Courier New" w:cs="Courier New"/>
-        </w:rPr>
-        <w:t>.</w:t>
-      </w:r>
-      <w:r>
-        <w:rPr>
-          <w:rFonts w:ascii="Courier New" w:hAnsi="Courier New" w:cs="Courier New"/>
-        </w:rPr>
-        <w:br/>
-      </w:r>
-      <w:r>
-        <w:rPr>
-          <w:rFonts w:ascii="Courier New" w:hAnsi="Courier New" w:cs="Courier New"/>
-          <w:b/>
-          <w:bCs/>
-        </w:rPr>
         <w:t>2</w:t>
       </w:r>
       <w:r>
@@ -28778,7 +28795,6 @@
           <w:b/>
           <w:bCs/>
         </w:rPr>
-        <w:lastRenderedPageBreak/>
         <w:t>ADI</w:t>
       </w:r>
       <w:r>
@@ -29082,6 +29098,7 @@
           <w:b/>
           <w:bCs/>
         </w:rPr>
+        <w:lastRenderedPageBreak/>
         <w:t>INT. THE BEDROOM</w:t>
       </w:r>
       <w:r>
@@ -30684,33 +30701,24 @@
     <w:p>
       <w:pPr>
         <w:spacing w:line="240" w:lineRule="auto"/>
-        <w:jc w:val="right"/>
-        <w:rPr>
-          <w:rFonts w:ascii="Courier New" w:hAnsi="Courier New" w:cs="Courier New"/>
-          <w:b/>
-          <w:bCs/>
-        </w:rPr>
-      </w:pPr>
-    </w:p>
-    <w:p>
-      <w:pPr>
-        <w:spacing w:line="240" w:lineRule="auto"/>
-        <w:jc w:val="right"/>
-        <w:rPr>
-          <w:rFonts w:ascii="Courier New" w:hAnsi="Courier New" w:cs="Courier New"/>
-          <w:b/>
-          <w:bCs/>
-        </w:rPr>
-      </w:pPr>
-    </w:p>
-    <w:p>
-      <w:pPr>
-        <w:spacing w:line="240" w:lineRule="auto"/>
-        <w:jc w:val="right"/>
-        <w:rPr>
-          <w:rFonts w:ascii="Courier New" w:hAnsi="Courier New" w:cs="Courier New"/>
-          <w:b/>
-          <w:bCs/>
+        <w:rPr>
+          <w:rFonts w:ascii="Courier New" w:hAnsi="Courier New" w:cs="Courier New"/>
+        </w:rPr>
+      </w:pPr>
+    </w:p>
+    <w:p>
+      <w:pPr>
+        <w:spacing w:line="240" w:lineRule="auto"/>
+        <w:rPr>
+          <w:rFonts w:ascii="Courier New" w:hAnsi="Courier New" w:cs="Courier New"/>
+        </w:rPr>
+      </w:pPr>
+    </w:p>
+    <w:p>
+      <w:pPr>
+        <w:spacing w:line="240" w:lineRule="auto"/>
+        <w:rPr>
+          <w:rFonts w:ascii="Courier New" w:hAnsi="Courier New" w:cs="Courier New"/>
         </w:rPr>
       </w:pPr>
     </w:p>
@@ -30742,6 +30750,7 @@
           <w:b/>
           <w:bCs/>
         </w:rPr>
+        <w:lastRenderedPageBreak/>
         <w:t xml:space="preserve">INT. </w:t>
       </w:r>
       <w:r>
@@ -31854,284 +31863,284 @@
         <w:rPr>
           <w:rFonts w:ascii="Courier New" w:hAnsi="Courier New" w:cs="Courier New"/>
         </w:rPr>
+        <w:t xml:space="preserve">He takes </w:t>
+      </w:r>
+      <w:r>
+        <w:rPr>
+          <w:rFonts w:ascii="Courier New" w:hAnsi="Courier New" w:cs="Courier New"/>
+        </w:rPr>
+        <w:t>a few steps back.</w:t>
+      </w:r>
+      <w:r>
+        <w:rPr>
+          <w:rFonts w:ascii="Courier New" w:hAnsi="Courier New" w:cs="Courier New"/>
+        </w:rPr>
+        <w:t xml:space="preserve"> </w:t>
+      </w:r>
+      <w:r>
+        <w:rPr>
+          <w:rFonts w:ascii="Courier New" w:hAnsi="Courier New" w:cs="Courier New"/>
+        </w:rPr>
+        <w:t xml:space="preserve">The lights go off. </w:t>
+      </w:r>
+      <w:r>
+        <w:rPr>
+          <w:rFonts w:ascii="Courier New" w:hAnsi="Courier New" w:cs="Courier New"/>
+        </w:rPr>
+        <w:t>Ther</w:t>
+      </w:r>
+      <w:r>
+        <w:rPr>
+          <w:rFonts w:ascii="Courier New" w:hAnsi="Courier New" w:cs="Courier New"/>
+        </w:rPr>
+        <w:t>e</w:t>
+      </w:r>
+      <w:r>
+        <w:rPr>
+          <w:rFonts w:ascii="Courier New" w:hAnsi="Courier New" w:cs="Courier New"/>
+        </w:rPr>
+        <w:t xml:space="preserve"> is no one around expect him. </w:t>
+      </w:r>
+    </w:p>
+    <w:p>
+      <w:pPr>
+        <w:spacing w:line="240" w:lineRule="auto"/>
+        <w:rPr>
+          <w:rFonts w:ascii="Courier New" w:hAnsi="Courier New" w:cs="Courier New"/>
+        </w:rPr>
+      </w:pPr>
+      <w:r>
+        <w:rPr>
+          <w:rFonts w:ascii="Courier New" w:hAnsi="Courier New" w:cs="Courier New"/>
+        </w:rPr>
+        <w:t>T</w:t>
+      </w:r>
+      <w:r>
+        <w:rPr>
+          <w:rFonts w:ascii="Courier New" w:hAnsi="Courier New" w:cs="Courier New"/>
+        </w:rPr>
+        <w:t xml:space="preserve">he lights </w:t>
+      </w:r>
+      <w:r>
+        <w:rPr>
+          <w:rFonts w:ascii="Courier New" w:hAnsi="Courier New" w:cs="Courier New"/>
+        </w:rPr>
+        <w:t>flash</w:t>
+      </w:r>
+      <w:r>
+        <w:rPr>
+          <w:rFonts w:ascii="Courier New" w:hAnsi="Courier New" w:cs="Courier New"/>
+        </w:rPr>
+        <w:t xml:space="preserve"> </w:t>
+      </w:r>
+      <w:r>
+        <w:rPr>
+          <w:rFonts w:ascii="Courier New" w:hAnsi="Courier New" w:cs="Courier New"/>
+        </w:rPr>
+        <w:t>on</w:t>
+      </w:r>
+      <w:r>
+        <w:rPr>
+          <w:rFonts w:ascii="Courier New" w:hAnsi="Courier New" w:cs="Courier New"/>
+        </w:rPr>
+        <w:t>…</w:t>
+      </w:r>
+      <w:r>
+        <w:rPr>
+          <w:rFonts w:ascii="Courier New" w:hAnsi="Courier New" w:cs="Courier New"/>
+        </w:rPr>
+        <w:t xml:space="preserve"> off</w:t>
+      </w:r>
+      <w:r>
+        <w:rPr>
+          <w:rFonts w:ascii="Courier New" w:hAnsi="Courier New" w:cs="Courier New"/>
+        </w:rPr>
+        <w:t>… on… off… on… off</w:t>
+      </w:r>
+      <w:r>
+        <w:rPr>
+          <w:rFonts w:ascii="Courier New" w:hAnsi="Courier New" w:cs="Courier New"/>
+        </w:rPr>
+        <w:t xml:space="preserve"> with the sharp echo of switch</w:t>
+      </w:r>
+      <w:r>
+        <w:rPr>
+          <w:rFonts w:ascii="Courier New" w:hAnsi="Courier New" w:cs="Courier New"/>
+        </w:rPr>
+        <w:t xml:space="preserve"> clicks</w:t>
+      </w:r>
+      <w:r>
+        <w:rPr>
+          <w:rFonts w:ascii="Courier New" w:hAnsi="Courier New" w:cs="Courier New"/>
+        </w:rPr>
+        <w:t>.</w:t>
+      </w:r>
+    </w:p>
+    <w:p>
+      <w:pPr>
+        <w:spacing w:line="240" w:lineRule="auto"/>
+        <w:rPr>
+          <w:rFonts w:ascii="Courier New" w:hAnsi="Courier New" w:cs="Courier New"/>
+        </w:rPr>
+      </w:pPr>
+      <w:r>
+        <w:rPr>
+          <w:rFonts w:ascii="Courier New" w:hAnsi="Courier New" w:cs="Courier New"/>
+        </w:rPr>
+        <w:t xml:space="preserve">He </w:t>
+      </w:r>
+      <w:r>
+        <w:rPr>
+          <w:rFonts w:ascii="Courier New" w:hAnsi="Courier New" w:cs="Courier New"/>
+        </w:rPr>
+        <w:t xml:space="preserve">slowly turns to the sound behind him. </w:t>
+      </w:r>
+      <w:r>
+        <w:rPr>
+          <w:rFonts w:ascii="Courier New" w:hAnsi="Courier New" w:cs="Courier New"/>
+        </w:rPr>
+        <w:t>Ved</w:t>
+      </w:r>
+      <w:r>
+        <w:rPr>
+          <w:rFonts w:ascii="Courier New" w:hAnsi="Courier New" w:cs="Courier New"/>
+        </w:rPr>
+        <w:t xml:space="preserve"> </w:t>
+      </w:r>
+      <w:r>
+        <w:rPr>
+          <w:rFonts w:ascii="Courier New" w:hAnsi="Courier New" w:cs="Courier New"/>
+        </w:rPr>
+        <w:t xml:space="preserve">stands </w:t>
+      </w:r>
+      <w:r>
+        <w:rPr>
+          <w:rFonts w:ascii="Courier New" w:hAnsi="Courier New" w:cs="Courier New"/>
+        </w:rPr>
+        <w:t>with his head</w:t>
+      </w:r>
+      <w:r>
+        <w:rPr>
+          <w:rFonts w:ascii="Courier New" w:hAnsi="Courier New" w:cs="Courier New"/>
+        </w:rPr>
+        <w:t xml:space="preserve"> </w:t>
+      </w:r>
+      <w:r>
+        <w:rPr>
+          <w:rFonts w:ascii="Courier New" w:hAnsi="Courier New" w:cs="Courier New"/>
+        </w:rPr>
+        <w:t>down</w:t>
+      </w:r>
+      <w:r>
+        <w:rPr>
+          <w:rFonts w:ascii="Courier New" w:hAnsi="Courier New" w:cs="Courier New"/>
+        </w:rPr>
+        <w:t xml:space="preserve"> at an angle, his</w:t>
+      </w:r>
+      <w:r>
+        <w:rPr>
+          <w:rFonts w:ascii="Courier New" w:hAnsi="Courier New" w:cs="Courier New"/>
+        </w:rPr>
+        <w:t xml:space="preserve"> hand on the switchboard </w:t>
+      </w:r>
+      <w:r>
+        <w:rPr>
+          <w:rFonts w:ascii="Courier New" w:hAnsi="Courier New" w:cs="Courier New"/>
+        </w:rPr>
+        <w:t xml:space="preserve">toggling </w:t>
+      </w:r>
+      <w:r>
+        <w:rPr>
+          <w:rFonts w:ascii="Courier New" w:hAnsi="Courier New" w:cs="Courier New"/>
+        </w:rPr>
+        <w:t xml:space="preserve">the </w:t>
+      </w:r>
+      <w:r>
+        <w:rPr>
+          <w:rFonts w:ascii="Courier New" w:hAnsi="Courier New" w:cs="Courier New"/>
+        </w:rPr>
+        <w:t>switch</w:t>
+      </w:r>
+      <w:r>
+        <w:rPr>
+          <w:rFonts w:ascii="Courier New" w:hAnsi="Courier New" w:cs="Courier New"/>
+        </w:rPr>
+        <w:t>.</w:t>
+      </w:r>
+    </w:p>
+    <w:p>
+      <w:pPr>
+        <w:spacing w:line="240" w:lineRule="auto"/>
+        <w:jc w:val="center"/>
+        <w:rPr>
+          <w:rFonts w:ascii="Courier New" w:hAnsi="Courier New" w:cs="Courier New"/>
+        </w:rPr>
+      </w:pPr>
+      <w:r>
+        <w:rPr>
+          <w:rFonts w:ascii="Courier New" w:hAnsi="Courier New" w:cs="Courier New"/>
+          <w:b/>
+          <w:bCs/>
+        </w:rPr>
+        <w:t>ADI</w:t>
+      </w:r>
+      <w:r>
+        <w:rPr>
+          <w:rFonts w:ascii="Courier New" w:hAnsi="Courier New" w:cs="Courier New"/>
+          <w:b/>
+          <w:bCs/>
+        </w:rPr>
+        <w:t xml:space="preserve"> </w:t>
+      </w:r>
+      <w:r>
+        <w:rPr>
+          <w:rFonts w:ascii="Courier New" w:hAnsi="Courier New" w:cs="Courier New"/>
+          <w:i/>
+          <w:iCs/>
+        </w:rPr>
+        <w:t>(breathing heavily)</w:t>
+      </w:r>
+      <w:r>
+        <w:rPr>
+          <w:rFonts w:ascii="Courier New" w:hAnsi="Courier New" w:cs="Courier New"/>
+          <w:i/>
+          <w:iCs/>
+        </w:rPr>
+        <w:br/>
+      </w:r>
+      <w:r>
+        <w:rPr>
+          <w:rFonts w:ascii="Courier New" w:hAnsi="Courier New" w:cs="Courier New"/>
+          <w:i/>
+          <w:iCs/>
+        </w:rPr>
+        <w:t xml:space="preserve">(confused) </w:t>
+      </w:r>
+      <w:r>
+        <w:rPr>
+          <w:rFonts w:ascii="Courier New" w:hAnsi="Courier New" w:cs="Courier New"/>
+        </w:rPr>
+        <w:t>Ved</w:t>
+      </w:r>
+      <w:r>
+        <w:rPr>
+          <w:rFonts w:ascii="Courier New" w:hAnsi="Courier New" w:cs="Courier New"/>
+        </w:rPr>
+        <w:t>!?</w:t>
+      </w:r>
+    </w:p>
+    <w:p>
+      <w:pPr>
+        <w:spacing w:line="240" w:lineRule="auto"/>
+        <w:rPr>
+          <w:rFonts w:ascii="Courier New" w:hAnsi="Courier New" w:cs="Courier New"/>
+        </w:rPr>
+      </w:pPr>
+      <w:r>
+        <w:rPr>
+          <w:rFonts w:ascii="Courier New" w:hAnsi="Courier New" w:cs="Courier New"/>
+        </w:rPr>
         <w:lastRenderedPageBreak/>
-        <w:t xml:space="preserve">He takes </w:t>
-      </w:r>
-      <w:r>
-        <w:rPr>
-          <w:rFonts w:ascii="Courier New" w:hAnsi="Courier New" w:cs="Courier New"/>
-        </w:rPr>
-        <w:t>a few steps back.</w:t>
-      </w:r>
-      <w:r>
-        <w:rPr>
-          <w:rFonts w:ascii="Courier New" w:hAnsi="Courier New" w:cs="Courier New"/>
-        </w:rPr>
-        <w:t xml:space="preserve"> </w:t>
-      </w:r>
-      <w:r>
-        <w:rPr>
-          <w:rFonts w:ascii="Courier New" w:hAnsi="Courier New" w:cs="Courier New"/>
-        </w:rPr>
-        <w:t xml:space="preserve">The lights go off. </w:t>
-      </w:r>
-      <w:r>
-        <w:rPr>
-          <w:rFonts w:ascii="Courier New" w:hAnsi="Courier New" w:cs="Courier New"/>
-        </w:rPr>
-        <w:t>Ther</w:t>
-      </w:r>
-      <w:r>
-        <w:rPr>
-          <w:rFonts w:ascii="Courier New" w:hAnsi="Courier New" w:cs="Courier New"/>
-        </w:rPr>
-        <w:t>e</w:t>
-      </w:r>
-      <w:r>
-        <w:rPr>
-          <w:rFonts w:ascii="Courier New" w:hAnsi="Courier New" w:cs="Courier New"/>
-        </w:rPr>
-        <w:t xml:space="preserve"> is no one around expect him. </w:t>
-      </w:r>
-    </w:p>
-    <w:p>
-      <w:pPr>
-        <w:spacing w:line="240" w:lineRule="auto"/>
-        <w:rPr>
-          <w:rFonts w:ascii="Courier New" w:hAnsi="Courier New" w:cs="Courier New"/>
-        </w:rPr>
-      </w:pPr>
-      <w:r>
-        <w:rPr>
-          <w:rFonts w:ascii="Courier New" w:hAnsi="Courier New" w:cs="Courier New"/>
-        </w:rPr>
-        <w:t>T</w:t>
-      </w:r>
-      <w:r>
-        <w:rPr>
-          <w:rFonts w:ascii="Courier New" w:hAnsi="Courier New" w:cs="Courier New"/>
-        </w:rPr>
-        <w:t xml:space="preserve">he lights </w:t>
-      </w:r>
-      <w:r>
-        <w:rPr>
-          <w:rFonts w:ascii="Courier New" w:hAnsi="Courier New" w:cs="Courier New"/>
-        </w:rPr>
-        <w:t>flash</w:t>
-      </w:r>
-      <w:r>
-        <w:rPr>
-          <w:rFonts w:ascii="Courier New" w:hAnsi="Courier New" w:cs="Courier New"/>
-        </w:rPr>
-        <w:t xml:space="preserve"> </w:t>
-      </w:r>
-      <w:r>
-        <w:rPr>
-          <w:rFonts w:ascii="Courier New" w:hAnsi="Courier New" w:cs="Courier New"/>
-        </w:rPr>
-        <w:t>on</w:t>
-      </w:r>
-      <w:r>
-        <w:rPr>
-          <w:rFonts w:ascii="Courier New" w:hAnsi="Courier New" w:cs="Courier New"/>
-        </w:rPr>
-        <w:t>…</w:t>
-      </w:r>
-      <w:r>
-        <w:rPr>
-          <w:rFonts w:ascii="Courier New" w:hAnsi="Courier New" w:cs="Courier New"/>
-        </w:rPr>
-        <w:t xml:space="preserve"> off</w:t>
-      </w:r>
-      <w:r>
-        <w:rPr>
-          <w:rFonts w:ascii="Courier New" w:hAnsi="Courier New" w:cs="Courier New"/>
-        </w:rPr>
-        <w:t>… on… off… on… off</w:t>
-      </w:r>
-      <w:r>
-        <w:rPr>
-          <w:rFonts w:ascii="Courier New" w:hAnsi="Courier New" w:cs="Courier New"/>
-        </w:rPr>
-        <w:t xml:space="preserve"> with the sharp echo of switch</w:t>
-      </w:r>
-      <w:r>
-        <w:rPr>
-          <w:rFonts w:ascii="Courier New" w:hAnsi="Courier New" w:cs="Courier New"/>
-        </w:rPr>
-        <w:t xml:space="preserve"> clicks</w:t>
-      </w:r>
-      <w:r>
-        <w:rPr>
-          <w:rFonts w:ascii="Courier New" w:hAnsi="Courier New" w:cs="Courier New"/>
-        </w:rPr>
-        <w:t>.</w:t>
-      </w:r>
-    </w:p>
-    <w:p>
-      <w:pPr>
-        <w:spacing w:line="240" w:lineRule="auto"/>
-        <w:rPr>
-          <w:rFonts w:ascii="Courier New" w:hAnsi="Courier New" w:cs="Courier New"/>
-        </w:rPr>
-      </w:pPr>
-      <w:r>
-        <w:rPr>
-          <w:rFonts w:ascii="Courier New" w:hAnsi="Courier New" w:cs="Courier New"/>
-        </w:rPr>
-        <w:t xml:space="preserve">He </w:t>
-      </w:r>
-      <w:r>
-        <w:rPr>
-          <w:rFonts w:ascii="Courier New" w:hAnsi="Courier New" w:cs="Courier New"/>
-        </w:rPr>
-        <w:t xml:space="preserve">slowly turns to the sound behind him. </w:t>
-      </w:r>
-      <w:r>
-        <w:rPr>
-          <w:rFonts w:ascii="Courier New" w:hAnsi="Courier New" w:cs="Courier New"/>
-        </w:rPr>
-        <w:t>Ved</w:t>
-      </w:r>
-      <w:r>
-        <w:rPr>
-          <w:rFonts w:ascii="Courier New" w:hAnsi="Courier New" w:cs="Courier New"/>
-        </w:rPr>
-        <w:t xml:space="preserve"> </w:t>
-      </w:r>
-      <w:r>
-        <w:rPr>
-          <w:rFonts w:ascii="Courier New" w:hAnsi="Courier New" w:cs="Courier New"/>
-        </w:rPr>
-        <w:t xml:space="preserve">stands </w:t>
-      </w:r>
-      <w:r>
-        <w:rPr>
-          <w:rFonts w:ascii="Courier New" w:hAnsi="Courier New" w:cs="Courier New"/>
-        </w:rPr>
-        <w:t>with his head</w:t>
-      </w:r>
-      <w:r>
-        <w:rPr>
-          <w:rFonts w:ascii="Courier New" w:hAnsi="Courier New" w:cs="Courier New"/>
-        </w:rPr>
-        <w:t xml:space="preserve"> </w:t>
-      </w:r>
-      <w:r>
-        <w:rPr>
-          <w:rFonts w:ascii="Courier New" w:hAnsi="Courier New" w:cs="Courier New"/>
-        </w:rPr>
-        <w:t>down</w:t>
-      </w:r>
-      <w:r>
-        <w:rPr>
-          <w:rFonts w:ascii="Courier New" w:hAnsi="Courier New" w:cs="Courier New"/>
-        </w:rPr>
-        <w:t xml:space="preserve"> at an angle, his</w:t>
-      </w:r>
-      <w:r>
-        <w:rPr>
-          <w:rFonts w:ascii="Courier New" w:hAnsi="Courier New" w:cs="Courier New"/>
-        </w:rPr>
-        <w:t xml:space="preserve"> hand on the switchboard </w:t>
-      </w:r>
-      <w:r>
-        <w:rPr>
-          <w:rFonts w:ascii="Courier New" w:hAnsi="Courier New" w:cs="Courier New"/>
-        </w:rPr>
-        <w:t xml:space="preserve">toggling </w:t>
-      </w:r>
-      <w:r>
-        <w:rPr>
-          <w:rFonts w:ascii="Courier New" w:hAnsi="Courier New" w:cs="Courier New"/>
-        </w:rPr>
-        <w:t xml:space="preserve">the </w:t>
-      </w:r>
-      <w:r>
-        <w:rPr>
-          <w:rFonts w:ascii="Courier New" w:hAnsi="Courier New" w:cs="Courier New"/>
-        </w:rPr>
-        <w:t>switch</w:t>
-      </w:r>
-      <w:r>
-        <w:rPr>
-          <w:rFonts w:ascii="Courier New" w:hAnsi="Courier New" w:cs="Courier New"/>
-        </w:rPr>
-        <w:t>.</w:t>
-      </w:r>
-    </w:p>
-    <w:p>
-      <w:pPr>
-        <w:spacing w:line="240" w:lineRule="auto"/>
-        <w:jc w:val="center"/>
-        <w:rPr>
-          <w:rFonts w:ascii="Courier New" w:hAnsi="Courier New" w:cs="Courier New"/>
-        </w:rPr>
-      </w:pPr>
-      <w:r>
-        <w:rPr>
-          <w:rFonts w:ascii="Courier New" w:hAnsi="Courier New" w:cs="Courier New"/>
-          <w:b/>
-          <w:bCs/>
-        </w:rPr>
-        <w:t>ADI</w:t>
-      </w:r>
-      <w:r>
-        <w:rPr>
-          <w:rFonts w:ascii="Courier New" w:hAnsi="Courier New" w:cs="Courier New"/>
-          <w:b/>
-          <w:bCs/>
-        </w:rPr>
-        <w:t xml:space="preserve"> </w:t>
-      </w:r>
-      <w:r>
-        <w:rPr>
-          <w:rFonts w:ascii="Courier New" w:hAnsi="Courier New" w:cs="Courier New"/>
-          <w:i/>
-          <w:iCs/>
-        </w:rPr>
-        <w:t>(breathing heavily)</w:t>
-      </w:r>
-      <w:r>
-        <w:rPr>
-          <w:rFonts w:ascii="Courier New" w:hAnsi="Courier New" w:cs="Courier New"/>
-          <w:i/>
-          <w:iCs/>
-        </w:rPr>
-        <w:br/>
-      </w:r>
-      <w:r>
-        <w:rPr>
-          <w:rFonts w:ascii="Courier New" w:hAnsi="Courier New" w:cs="Courier New"/>
-          <w:i/>
-          <w:iCs/>
-        </w:rPr>
-        <w:t xml:space="preserve">(confused) </w:t>
-      </w:r>
-      <w:r>
-        <w:rPr>
-          <w:rFonts w:ascii="Courier New" w:hAnsi="Courier New" w:cs="Courier New"/>
-        </w:rPr>
-        <w:t>Ved</w:t>
-      </w:r>
-      <w:r>
-        <w:rPr>
-          <w:rFonts w:ascii="Courier New" w:hAnsi="Courier New" w:cs="Courier New"/>
-        </w:rPr>
-        <w:t>!?</w:t>
-      </w:r>
-    </w:p>
-    <w:p>
-      <w:pPr>
-        <w:spacing w:line="240" w:lineRule="auto"/>
-        <w:rPr>
-          <w:rFonts w:ascii="Courier New" w:hAnsi="Courier New" w:cs="Courier New"/>
-        </w:rPr>
-      </w:pPr>
-      <w:r>
-        <w:rPr>
-          <w:rFonts w:ascii="Courier New" w:hAnsi="Courier New" w:cs="Courier New"/>
-        </w:rPr>
         <w:t xml:space="preserve">Each flash of light reveals Ved’s face twisting abnormally. </w:t>
       </w:r>
     </w:p>
@@ -32194,7 +32203,56 @@
         <w:rPr>
           <w:rFonts w:ascii="Courier New" w:hAnsi="Courier New" w:cs="Courier New"/>
         </w:rPr>
-        <w:t>Ved! Nin</w:t>
+        <w:t xml:space="preserve">Ved! </w:t>
+      </w:r>
+    </w:p>
+    <w:p>
+      <w:pPr>
+        <w:spacing w:line="240" w:lineRule="auto"/>
+        <w:rPr>
+          <w:rFonts w:ascii="Courier New" w:hAnsi="Courier New" w:cs="Courier New"/>
+        </w:rPr>
+      </w:pPr>
+      <w:r>
+        <w:rPr>
+          <w:rFonts w:ascii="Courier New" w:hAnsi="Courier New" w:cs="Courier New"/>
+        </w:rPr>
+        <w:t>LIGHTS OFF.</w:t>
+      </w:r>
+    </w:p>
+    <w:p>
+      <w:pPr>
+        <w:spacing w:line="240" w:lineRule="auto"/>
+        <w:jc w:val="center"/>
+        <w:rPr>
+          <w:rFonts w:ascii="Courier New" w:hAnsi="Courier New" w:cs="Courier New"/>
+        </w:rPr>
+      </w:pPr>
+      <w:r>
+        <w:rPr>
+          <w:rFonts w:ascii="Courier New" w:hAnsi="Courier New" w:cs="Courier New"/>
+          <w:b/>
+          <w:bCs/>
+        </w:rPr>
+        <w:t>VED</w:t>
+      </w:r>
+      <w:r>
+        <w:rPr>
+          <w:rFonts w:ascii="Courier New" w:hAnsi="Courier New" w:cs="Courier New"/>
+        </w:rPr>
+        <w:br/>
+      </w:r>
+      <w:r>
+        <w:rPr>
+          <w:rFonts w:ascii="Courier New" w:hAnsi="Courier New" w:cs="Courier New"/>
+        </w:rPr>
+        <w:t>Nin</w:t>
+      </w:r>
+      <w:r>
+        <w:rPr>
+          <w:rFonts w:ascii="Courier New" w:hAnsi="Courier New" w:cs="Courier New"/>
+        </w:rPr>
+        <w:t>na</w:t>
       </w:r>
       <w:r>
         <w:rPr>
@@ -32214,7 +32272,161 @@
         <w:rPr>
           <w:rFonts w:ascii="Courier New" w:hAnsi="Courier New" w:cs="Courier New"/>
         </w:rPr>
-        <w:t>The light goes off</w:t>
+        <w:t>LIGHTS ON- OFF.</w:t>
+      </w:r>
+    </w:p>
+    <w:p>
+      <w:pPr>
+        <w:spacing w:line="240" w:lineRule="auto"/>
+        <w:jc w:val="center"/>
+        <w:rPr>
+          <w:rFonts w:ascii="Courier New" w:hAnsi="Courier New" w:cs="Courier New"/>
+        </w:rPr>
+      </w:pPr>
+      <w:r>
+        <w:rPr>
+          <w:rFonts w:ascii="Courier New" w:hAnsi="Courier New" w:cs="Courier New"/>
+          <w:b/>
+          <w:bCs/>
+        </w:rPr>
+        <w:t xml:space="preserve">KRITI </w:t>
+      </w:r>
+      <w:r>
+        <w:rPr>
+          <w:rFonts w:ascii="Courier New" w:hAnsi="Courier New" w:cs="Courier New"/>
+          <w:i/>
+          <w:iCs/>
+        </w:rPr>
+        <w:t>(</w:t>
+      </w:r>
+      <w:r>
+        <w:rPr>
+          <w:rFonts w:ascii="Courier New" w:hAnsi="Courier New" w:cs="Courier New"/>
+          <w:i/>
+          <w:iCs/>
+        </w:rPr>
+        <w:t>smiles, Demonic Voice</w:t>
+      </w:r>
+      <w:r>
+        <w:rPr>
+          <w:rFonts w:ascii="Courier New" w:hAnsi="Courier New" w:cs="Courier New"/>
+          <w:i/>
+          <w:iCs/>
+        </w:rPr>
+        <w:t>)</w:t>
+      </w:r>
+      <w:r>
+        <w:rPr>
+          <w:rFonts w:ascii="Courier New" w:hAnsi="Courier New" w:cs="Courier New"/>
+          <w:b/>
+          <w:bCs/>
+        </w:rPr>
+        <w:br/>
+      </w:r>
+      <w:r>
+        <w:rPr>
+          <w:rFonts w:ascii="Courier New" w:hAnsi="Courier New" w:cs="Courier New"/>
+        </w:rPr>
+        <w:t>Kriti!</w:t>
+      </w:r>
+    </w:p>
+    <w:p>
+      <w:pPr>
+        <w:spacing w:line="240" w:lineRule="auto"/>
+        <w:rPr>
+          <w:rFonts w:ascii="Courier New" w:hAnsi="Courier New" w:cs="Courier New"/>
+        </w:rPr>
+      </w:pPr>
+      <w:r>
+        <w:rPr>
+          <w:rFonts w:ascii="Courier New" w:hAnsi="Courier New" w:cs="Courier New"/>
+        </w:rPr>
+        <w:t>LIGHTS ON. Kriti is standing in place of Ved now holding the switch.</w:t>
+      </w:r>
+    </w:p>
+    <w:p>
+      <w:pPr>
+        <w:spacing w:line="240" w:lineRule="auto"/>
+        <w:rPr>
+          <w:rFonts w:ascii="Courier New" w:hAnsi="Courier New" w:cs="Courier New"/>
+        </w:rPr>
+      </w:pPr>
+      <w:r>
+        <w:rPr>
+          <w:rFonts w:ascii="Courier New" w:hAnsi="Courier New" w:cs="Courier New"/>
+        </w:rPr>
+        <w:t>LIGHTS OFF.</w:t>
+      </w:r>
+    </w:p>
+    <w:p>
+      <w:pPr>
+        <w:spacing w:line="240" w:lineRule="auto"/>
+        <w:jc w:val="center"/>
+        <w:rPr>
+          <w:rFonts w:ascii="Courier New" w:hAnsi="Courier New" w:cs="Courier New"/>
+        </w:rPr>
+      </w:pPr>
+      <w:r>
+        <w:rPr>
+          <w:rFonts w:ascii="Courier New" w:hAnsi="Courier New" w:cs="Courier New"/>
+          <w:b/>
+          <w:bCs/>
+        </w:rPr>
+        <w:t>KRITI</w:t>
+      </w:r>
+      <w:r>
+        <w:rPr>
+          <w:rFonts w:ascii="Courier New" w:hAnsi="Courier New" w:cs="Courier New"/>
+          <w:b/>
+          <w:bCs/>
+        </w:rPr>
+        <w:br/>
+      </w:r>
+      <w:r>
+        <w:rPr>
+          <w:rFonts w:ascii="Courier New" w:hAnsi="Courier New" w:cs="Courier New"/>
+        </w:rPr>
+        <w:t>Nin</w:t>
+      </w:r>
+      <w:r>
+        <w:rPr>
+          <w:rFonts w:ascii="Courier New" w:hAnsi="Courier New" w:cs="Courier New"/>
+        </w:rPr>
+        <w:t>na</w:t>
+      </w:r>
+      <w:r>
+        <w:rPr>
+          <w:rFonts w:ascii="Courier New" w:hAnsi="Courier New" w:cs="Courier New"/>
+        </w:rPr>
+        <w:t xml:space="preserve"> </w:t>
+      </w:r>
+      <w:proofErr w:type="spellStart"/>
+      <w:r>
+        <w:rPr>
+          <w:rFonts w:ascii="Courier New" w:hAnsi="Courier New" w:cs="Courier New"/>
+        </w:rPr>
+        <w:t>Pathni</w:t>
+      </w:r>
+      <w:proofErr w:type="spellEnd"/>
+      <w:r>
+        <w:rPr>
+          <w:rFonts w:ascii="Courier New" w:hAnsi="Courier New" w:cs="Courier New"/>
+        </w:rPr>
+        <w:t>!</w:t>
+      </w:r>
+    </w:p>
+    <w:p>
+      <w:pPr>
+        <w:spacing w:line="240" w:lineRule="auto"/>
+        <w:rPr>
+          <w:rFonts w:ascii="Courier New" w:hAnsi="Courier New" w:cs="Courier New"/>
+        </w:rPr>
+      </w:pPr>
+      <w:r>
+        <w:rPr>
+          <w:rFonts w:ascii="Courier New" w:hAnsi="Courier New" w:cs="Courier New"/>
+        </w:rPr>
+        <w:t>LIGHTS OFF</w:t>
       </w:r>
       <w:r>
         <w:rPr>
@@ -32245,6 +32457,14 @@
           <w:b/>
           <w:bCs/>
         </w:rPr>
+        <w:t xml:space="preserve"> &amp; KRITI</w:t>
+      </w:r>
+      <w:r>
+        <w:rPr>
+          <w:rFonts w:ascii="Courier New" w:hAnsi="Courier New" w:cs="Courier New"/>
+          <w:b/>
+          <w:bCs/>
+        </w:rPr>
         <w:t xml:space="preserve"> </w:t>
       </w:r>
       <w:r>
@@ -32296,7 +32516,7 @@
         <w:rPr>
           <w:rFonts w:ascii="Courier New" w:hAnsi="Courier New" w:cs="Courier New"/>
         </w:rPr>
-        <w:t>The light turns back on.</w:t>
+        <w:t>The light turns on.</w:t>
       </w:r>
       <w:r>
         <w:rPr>
@@ -32320,6 +32540,12 @@
         <w:rPr>
           <w:rFonts w:ascii="Courier New" w:hAnsi="Courier New" w:cs="Courier New"/>
         </w:rPr>
+        <w:t xml:space="preserve"> or Kriti</w:t>
+      </w:r>
+      <w:r>
+        <w:rPr>
+          <w:rFonts w:ascii="Courier New" w:hAnsi="Courier New" w:cs="Courier New"/>
+        </w:rPr>
         <w:t xml:space="preserve">. Adi </w:t>
       </w:r>
       <w:r>
@@ -32409,31 +32635,53 @@
         </w:rPr>
         <w:br/>
       </w:r>
-      <w:r>
-        <w:rPr>
-          <w:rFonts w:ascii="Courier New" w:hAnsi="Courier New" w:cs="Courier New"/>
-        </w:rPr>
-        <w:t xml:space="preserve">Naan </w:t>
-      </w:r>
-      <w:proofErr w:type="spellStart"/>
-      <w:r>
-        <w:rPr>
-          <w:rFonts w:ascii="Courier New" w:hAnsi="Courier New" w:cs="Courier New"/>
-        </w:rPr>
-        <w:t>ni</w:t>
-      </w:r>
-      <w:r>
-        <w:rPr>
-          <w:rFonts w:ascii="Courier New" w:hAnsi="Courier New" w:cs="Courier New"/>
-        </w:rPr>
-        <w:t>n</w:t>
-      </w:r>
-      <w:proofErr w:type="spellEnd"/>
-      <w:r>
-        <w:rPr>
-          <w:rFonts w:ascii="Courier New" w:hAnsi="Courier New" w:cs="Courier New"/>
-        </w:rPr>
-        <w:t xml:space="preserve"> maga alla!</w:t>
+      <w:proofErr w:type="spellStart"/>
+      <w:r>
+        <w:rPr>
+          <w:rFonts w:ascii="Courier New" w:hAnsi="Courier New" w:cs="Courier New"/>
+        </w:rPr>
+        <w:t>Avr</w:t>
+      </w:r>
+      <w:proofErr w:type="spellEnd"/>
+      <w:r>
+        <w:rPr>
+          <w:rFonts w:ascii="Courier New" w:hAnsi="Courier New" w:cs="Courier New"/>
+        </w:rPr>
+        <w:t xml:space="preserve"> </w:t>
+      </w:r>
+      <w:proofErr w:type="spellStart"/>
+      <w:r>
+        <w:rPr>
+          <w:rFonts w:ascii="Courier New" w:hAnsi="Courier New" w:cs="Courier New"/>
+        </w:rPr>
+        <w:t>nin</w:t>
+      </w:r>
+      <w:proofErr w:type="spellEnd"/>
+      <w:r>
+        <w:rPr>
+          <w:rFonts w:ascii="Courier New" w:hAnsi="Courier New" w:cs="Courier New"/>
+        </w:rPr>
+        <w:t xml:space="preserve"> </w:t>
+      </w:r>
+      <w:proofErr w:type="spellStart"/>
+      <w:r>
+        <w:rPr>
+          <w:rFonts w:ascii="Courier New" w:hAnsi="Courier New" w:cs="Courier New"/>
+        </w:rPr>
+        <w:t>avr</w:t>
+      </w:r>
+      <w:proofErr w:type="spellEnd"/>
+      <w:r>
+        <w:rPr>
+          <w:rFonts w:ascii="Courier New" w:hAnsi="Courier New" w:cs="Courier New"/>
+        </w:rPr>
+        <w:t xml:space="preserve"> alla</w:t>
+      </w:r>
+      <w:r>
+        <w:rPr>
+          <w:rFonts w:ascii="Courier New" w:hAnsi="Courier New" w:cs="Courier New"/>
+        </w:rPr>
+        <w:t>!</w:t>
       </w:r>
     </w:p>
     <w:p>
@@ -32725,38 +32973,6 @@
         </w:rPr>
         <w:t>.</w:t>
       </w:r>
-      <w:r>
-        <w:rPr>
-          <w:rFonts w:ascii="Courier New" w:hAnsi="Courier New" w:cs="Courier New"/>
-          <w:i/>
-          <w:iCs/>
-        </w:rPr>
-        <w:t xml:space="preserve"> </w:t>
-      </w:r>
-    </w:p>
-    <w:p>
-      <w:pPr>
-        <w:spacing w:line="240" w:lineRule="auto"/>
-        <w:rPr>
-          <w:rFonts w:ascii="Courier New" w:hAnsi="Courier New" w:cs="Courier New"/>
-          <w:i/>
-          <w:iCs/>
-        </w:rPr>
-      </w:pPr>
-      <w:r>
-        <w:rPr>
-          <w:rFonts w:ascii="Courier New" w:hAnsi="Courier New" w:cs="Courier New"/>
-        </w:rPr>
-        <w:t>He opens the door</w:t>
-      </w:r>
-      <w:r>
-        <w:rPr>
-          <w:rFonts w:ascii="Courier New" w:hAnsi="Courier New" w:cs="Courier New"/>
-          <w:i/>
-          <w:iCs/>
-        </w:rPr>
-        <w:t>- Each time, in a different place. This occurs repeatedly.</w:t>
-      </w:r>
     </w:p>
     <w:p>
       <w:pPr>
@@ -32781,13 +32997,43 @@
         <w:rPr>
           <w:rFonts w:ascii="Courier New" w:hAnsi="Courier New" w:cs="Courier New"/>
         </w:rPr>
-        <w:t xml:space="preserve">opens </w:t>
-      </w:r>
-      <w:r>
-        <w:rPr>
-          <w:rFonts w:ascii="Courier New" w:hAnsi="Courier New" w:cs="Courier New"/>
-        </w:rPr>
-        <w:t xml:space="preserve">the door. The door opens into a dark </w:t>
+        <w:t xml:space="preserve">struggles to </w:t>
+      </w:r>
+      <w:r>
+        <w:rPr>
+          <w:rFonts w:ascii="Courier New" w:hAnsi="Courier New" w:cs="Courier New"/>
+        </w:rPr>
+        <w:t>open</w:t>
+      </w:r>
+      <w:r>
+        <w:rPr>
+          <w:rFonts w:ascii="Courier New" w:hAnsi="Courier New" w:cs="Courier New"/>
+        </w:rPr>
+        <w:t xml:space="preserve"> </w:t>
+      </w:r>
+      <w:r>
+        <w:rPr>
+          <w:rFonts w:ascii="Courier New" w:hAnsi="Courier New" w:cs="Courier New"/>
+        </w:rPr>
+        <w:t xml:space="preserve">the door. </w:t>
+      </w:r>
+      <w:r>
+        <w:rPr>
+          <w:rFonts w:ascii="Courier New" w:hAnsi="Courier New" w:cs="Courier New"/>
+        </w:rPr>
+        <w:br/>
+      </w:r>
+      <w:r>
+        <w:rPr>
+          <w:rFonts w:ascii="Courier New" w:hAnsi="Courier New" w:cs="Courier New"/>
+        </w:rPr>
+        <w:t>Finally, he opens t</w:t>
+      </w:r>
+      <w:r>
+        <w:rPr>
+          <w:rFonts w:ascii="Courier New" w:hAnsi="Courier New" w:cs="Courier New"/>
+        </w:rPr>
+        <w:t xml:space="preserve">he door into a dark </w:t>
       </w:r>
       <w:r>
         <w:rPr>
@@ -32799,13 +33045,25 @@
         <w:rPr>
           <w:rFonts w:ascii="Courier New" w:hAnsi="Courier New" w:cs="Courier New"/>
         </w:rPr>
-        <w:t xml:space="preserve"> and he narrowly escapes falling into it.</w:t>
-      </w:r>
-      <w:r>
-        <w:rPr>
-          <w:rFonts w:ascii="Courier New" w:hAnsi="Courier New" w:cs="Courier New"/>
-        </w:rPr>
-        <w:t xml:space="preserve"> The void is filled with door loops.</w:t>
+        <w:t xml:space="preserve"> narrowly </w:t>
+      </w:r>
+      <w:r>
+        <w:rPr>
+          <w:rFonts w:ascii="Courier New" w:hAnsi="Courier New" w:cs="Courier New"/>
+        </w:rPr>
+        <w:t>escaping,</w:t>
+      </w:r>
+      <w:r>
+        <w:rPr>
+          <w:rFonts w:ascii="Courier New" w:hAnsi="Courier New" w:cs="Courier New"/>
+        </w:rPr>
+        <w:t xml:space="preserve"> </w:t>
+      </w:r>
+      <w:r>
+        <w:rPr>
+          <w:rFonts w:ascii="Courier New" w:hAnsi="Courier New" w:cs="Courier New"/>
+        </w:rPr>
+        <w:t>falling into it.</w:t>
       </w:r>
     </w:p>
     <w:p>
@@ -32843,7 +33101,7 @@
         <w:rPr>
           <w:rFonts w:ascii="Courier New" w:hAnsi="Courier New" w:cs="Courier New"/>
         </w:rPr>
-        <w:t>. S</w:t>
+        <w:t>- S</w:t>
       </w:r>
       <w:r>
         <w:rPr>
@@ -33326,6 +33584,7 @@
           <w:b/>
           <w:bCs/>
         </w:rPr>
+        <w:lastRenderedPageBreak/>
         <w:t xml:space="preserve">OLD WOMAN </w:t>
       </w:r>
       <w:r>
@@ -33459,7 +33718,6 @@
           <w:b/>
           <w:bCs/>
         </w:rPr>
-        <w:lastRenderedPageBreak/>
         <w:t xml:space="preserve">OLD WOMAN </w:t>
       </w:r>
       <w:r>
@@ -34241,6 +34499,36 @@
         <w:rPr>
           <w:rFonts w:ascii="Courier New" w:hAnsi="Courier New" w:cs="Courier New"/>
         </w:rPr>
+        <w:t xml:space="preserve"> </w:t>
+      </w:r>
+      <w:r>
+        <w:rPr>
+          <w:rFonts w:ascii="Courier New" w:hAnsi="Courier New" w:cs="Courier New"/>
+          <w:i/>
+          <w:iCs/>
+        </w:rPr>
+        <w:t>(ghostly like preta</w:t>
+      </w:r>
+      <w:r>
+        <w:rPr>
+          <w:rFonts w:ascii="Courier New" w:hAnsi="Courier New" w:cs="Courier New"/>
+          <w:i/>
+          <w:iCs/>
+        </w:rPr>
+        <w:t xml:space="preserve"> echo</w:t>
+      </w:r>
+      <w:r>
+        <w:rPr>
+          <w:rFonts w:ascii="Courier New" w:hAnsi="Courier New" w:cs="Courier New"/>
+          <w:i/>
+          <w:iCs/>
+        </w:rPr>
+        <w:t xml:space="preserve">) </w:t>
+      </w:r>
+      <w:r>
+        <w:rPr>
+          <w:rFonts w:ascii="Courier New" w:hAnsi="Courier New" w:cs="Courier New"/>
+        </w:rPr>
         <w:t>Neeru</w:t>
       </w:r>
       <w:r>
@@ -35193,6 +35481,7 @@
           <w:b/>
           <w:bCs/>
         </w:rPr>
+        <w:lastRenderedPageBreak/>
         <w:t>EXT. TULASI KATTE - NIGHT</w:t>
       </w:r>
     </w:p>
@@ -35207,7 +35496,6 @@
         <w:rPr>
           <w:rFonts w:ascii="Courier New" w:hAnsi="Courier New" w:cs="Courier New"/>
         </w:rPr>
-        <w:lastRenderedPageBreak/>
         <w:t xml:space="preserve">Through the light he sees a </w:t>
       </w:r>
       <w:r>
@@ -36766,20 +37054,21 @@
         <w:rPr>
           <w:rFonts w:ascii="Courier New" w:hAnsi="Courier New" w:cs="Courier New"/>
         </w:rPr>
-        <w:t xml:space="preserve">. </w:t>
-      </w:r>
-    </w:p>
-    <w:p>
-      <w:pPr>
-        <w:spacing w:line="240" w:lineRule="auto"/>
-        <w:rPr>
-          <w:rFonts w:ascii="Courier New" w:hAnsi="Courier New" w:cs="Courier New"/>
-        </w:rPr>
-      </w:pPr>
-      <w:r>
-        <w:rPr>
-          <w:rFonts w:ascii="Courier New" w:hAnsi="Courier New" w:cs="Courier New"/>
-        </w:rPr>
+        <w:t>.</w:t>
+      </w:r>
+    </w:p>
+    <w:p>
+      <w:pPr>
+        <w:spacing w:line="240" w:lineRule="auto"/>
+        <w:rPr>
+          <w:rFonts w:ascii="Courier New" w:hAnsi="Courier New" w:cs="Courier New"/>
+        </w:rPr>
+      </w:pPr>
+      <w:r>
+        <w:rPr>
+          <w:rFonts w:ascii="Courier New" w:hAnsi="Courier New" w:cs="Courier New"/>
+        </w:rPr>
+        <w:lastRenderedPageBreak/>
         <w:t xml:space="preserve">Through his fingers, </w:t>
       </w:r>
       <w:r>
@@ -36824,7 +37113,6 @@
         <w:rPr>
           <w:rFonts w:ascii="Courier New" w:hAnsi="Courier New" w:cs="Courier New"/>
         </w:rPr>
-        <w:lastRenderedPageBreak/>
         <w:t>He hears faint chants</w:t>
       </w:r>
       <w:r>
@@ -38959,6 +39247,7 @@
         <w:rPr>
           <w:rFonts w:ascii="Courier New" w:hAnsi="Courier New" w:cs="Courier New"/>
         </w:rPr>
+        <w:lastRenderedPageBreak/>
         <w:t xml:space="preserve">A </w:t>
       </w:r>
       <w:r>
@@ -39000,7 +39289,6 @@
           <w:b/>
           <w:bCs/>
         </w:rPr>
-        <w:lastRenderedPageBreak/>
         <w:t>FATHER</w:t>
       </w:r>
       <w:r>
@@ -45507,39 +45795,6 @@
     </w:p>
     <w:p>
       <w:pPr>
-        <w:spacing w:line="240" w:lineRule="auto"/>
-        <w:jc w:val="right"/>
-        <w:rPr>
-          <w:rFonts w:ascii="Courier New" w:hAnsi="Courier New" w:cs="Courier New"/>
-          <w:b/>
-          <w:bCs/>
-        </w:rPr>
-      </w:pPr>
-    </w:p>
-    <w:p>
-      <w:pPr>
-        <w:spacing w:line="240" w:lineRule="auto"/>
-        <w:jc w:val="right"/>
-        <w:rPr>
-          <w:rFonts w:ascii="Courier New" w:hAnsi="Courier New" w:cs="Courier New"/>
-          <w:b/>
-          <w:bCs/>
-        </w:rPr>
-      </w:pPr>
-    </w:p>
-    <w:p>
-      <w:pPr>
-        <w:spacing w:line="240" w:lineRule="auto"/>
-        <w:rPr>
-          <w:rFonts w:ascii="Courier New" w:hAnsi="Courier New" w:cs="Courier New"/>
-          <w:b/>
-          <w:bCs/>
-          <w:u w:val="single"/>
-        </w:rPr>
-      </w:pPr>
-    </w:p>
-    <w:p>
-      <w:pPr>
         <w:pStyle w:val="ListParagraph"/>
         <w:numPr>
           <w:ilvl w:val="0"/>
@@ -46427,7 +46682,7 @@
         <w:rPr>
           <w:rFonts w:ascii="Courier New" w:hAnsi="Courier New" w:cs="Courier New"/>
         </w:rPr>
-        <w:t xml:space="preserve"> </w:t>
+        <w:br/>
       </w:r>
       <w:proofErr w:type="spellStart"/>
       <w:r>
@@ -47330,171 +47585,178 @@
         <w:rPr>
           <w:rFonts w:ascii="Courier New" w:hAnsi="Courier New" w:cs="Courier New"/>
         </w:rPr>
+        <w:t xml:space="preserve">He </w:t>
+      </w:r>
+      <w:r>
+        <w:rPr>
+          <w:rFonts w:ascii="Courier New" w:hAnsi="Courier New" w:cs="Courier New"/>
+        </w:rPr>
+        <w:t>is a</w:t>
+      </w:r>
+      <w:r>
+        <w:rPr>
+          <w:rFonts w:ascii="Courier New" w:hAnsi="Courier New" w:cs="Courier New"/>
+        </w:rPr>
+        <w:t xml:space="preserve"> dark muscular</w:t>
+      </w:r>
+      <w:r>
+        <w:rPr>
+          <w:rFonts w:ascii="Courier New" w:hAnsi="Courier New" w:cs="Courier New"/>
+          <w:b/>
+          <w:bCs/>
+        </w:rPr>
+        <w:t xml:space="preserve"> </w:t>
+      </w:r>
+      <w:r>
+        <w:rPr>
+          <w:rFonts w:ascii="Courier New" w:hAnsi="Courier New" w:cs="Courier New"/>
+        </w:rPr>
+        <w:t xml:space="preserve">creature </w:t>
+      </w:r>
+      <w:r>
+        <w:rPr>
+          <w:rFonts w:ascii="Courier New" w:hAnsi="Courier New" w:cs="Courier New"/>
+        </w:rPr>
+        <w:t>with</w:t>
+      </w:r>
+      <w:r>
+        <w:rPr>
+          <w:rFonts w:ascii="Courier New" w:hAnsi="Courier New" w:cs="Courier New"/>
+          <w:b/>
+          <w:bCs/>
+        </w:rPr>
+        <w:t xml:space="preserve"> l</w:t>
+      </w:r>
+      <w:r>
+        <w:rPr>
+          <w:rFonts w:ascii="Courier New" w:hAnsi="Courier New" w:cs="Courier New"/>
+          <w:b/>
+          <w:bCs/>
+        </w:rPr>
+        <w:t>ong</w:t>
+      </w:r>
+      <w:r>
+        <w:rPr>
+          <w:rFonts w:ascii="Courier New" w:hAnsi="Courier New" w:cs="Courier New"/>
+        </w:rPr>
+        <w:t xml:space="preserve"> </w:t>
+      </w:r>
+      <w:r>
+        <w:rPr>
+          <w:rFonts w:ascii="Courier New" w:hAnsi="Courier New" w:cs="Courier New"/>
+          <w:b/>
+          <w:bCs/>
+        </w:rPr>
+        <w:t xml:space="preserve">curly </w:t>
+      </w:r>
+      <w:r>
+        <w:rPr>
+          <w:rFonts w:ascii="Courier New" w:hAnsi="Courier New" w:cs="Courier New"/>
+          <w:b/>
+          <w:bCs/>
+        </w:rPr>
+        <w:t>hair</w:t>
+      </w:r>
+      <w:r>
+        <w:rPr>
+          <w:rFonts w:ascii="Courier New" w:hAnsi="Courier New" w:cs="Courier New"/>
+          <w:b/>
+          <w:bCs/>
+        </w:rPr>
+        <w:t xml:space="preserve"> </w:t>
+      </w:r>
+      <w:r>
+        <w:rPr>
+          <w:rFonts w:ascii="Courier New" w:hAnsi="Courier New" w:cs="Courier New"/>
+        </w:rPr>
+        <w:t xml:space="preserve">and </w:t>
+      </w:r>
+      <w:r>
+        <w:rPr>
+          <w:rFonts w:ascii="Courier New" w:hAnsi="Courier New" w:cs="Courier New"/>
+        </w:rPr>
+        <w:t>yellow-</w:t>
+      </w:r>
+      <w:r>
+        <w:rPr>
+          <w:rFonts w:ascii="Courier New" w:hAnsi="Courier New" w:cs="Courier New"/>
+        </w:rPr>
+        <w:t>r</w:t>
+      </w:r>
+      <w:r>
+        <w:rPr>
+          <w:rFonts w:ascii="Courier New" w:hAnsi="Courier New" w:cs="Courier New"/>
+        </w:rPr>
+        <w:t>ed glowing eyes</w:t>
+      </w:r>
+      <w:r>
+        <w:rPr>
+          <w:rFonts w:ascii="Courier New" w:hAnsi="Courier New" w:cs="Courier New"/>
+          <w:b/>
+          <w:bCs/>
+        </w:rPr>
+        <w:t xml:space="preserve">, </w:t>
+      </w:r>
+      <w:r>
+        <w:rPr>
+          <w:rFonts w:ascii="Courier New" w:hAnsi="Courier New" w:cs="Courier New"/>
+        </w:rPr>
+        <w:t>covered in</w:t>
+      </w:r>
+      <w:r>
+        <w:rPr>
+          <w:rFonts w:ascii="Courier New" w:hAnsi="Courier New" w:cs="Courier New"/>
+          <w:b/>
+          <w:bCs/>
+        </w:rPr>
+        <w:t xml:space="preserve"> s</w:t>
+      </w:r>
+      <w:r>
+        <w:rPr>
+          <w:rFonts w:ascii="Courier New" w:hAnsi="Courier New" w:cs="Courier New"/>
+          <w:b/>
+          <w:bCs/>
+        </w:rPr>
+        <w:t>ilver</w:t>
+      </w:r>
+      <w:r>
+        <w:rPr>
+          <w:rFonts w:ascii="Courier New" w:hAnsi="Courier New" w:cs="Courier New"/>
+          <w:b/>
+          <w:bCs/>
+        </w:rPr>
+        <w:t xml:space="preserve"> ornaments</w:t>
+      </w:r>
+      <w:bookmarkEnd w:id="13"/>
+      <w:r>
+        <w:rPr>
+          <w:rFonts w:ascii="Courier New" w:hAnsi="Courier New" w:cs="Courier New"/>
+        </w:rPr>
+        <w:t>.</w:t>
+      </w:r>
+    </w:p>
+    <w:p>
+      <w:pPr>
+        <w:rPr>
+          <w:rFonts w:ascii="Courier New" w:hAnsi="Courier New" w:cs="Courier New"/>
+        </w:rPr>
+      </w:pPr>
+    </w:p>
+    <w:p>
+      <w:pPr>
+        <w:spacing w:line="240" w:lineRule="auto"/>
+        <w:jc w:val="center"/>
+        <w:rPr>
+          <w:rFonts w:ascii="Courier New" w:hAnsi="Courier New" w:cs="Courier New"/>
+        </w:rPr>
+      </w:pPr>
+      <w:r>
+        <w:rPr>
+          <w:rFonts w:ascii="Courier New" w:hAnsi="Courier New" w:cs="Courier New"/>
+          <w:b/>
+          <w:bCs/>
+        </w:rPr>
         <w:lastRenderedPageBreak/>
-        <w:t xml:space="preserve">He </w:t>
-      </w:r>
-      <w:r>
-        <w:rPr>
-          <w:rFonts w:ascii="Courier New" w:hAnsi="Courier New" w:cs="Courier New"/>
-        </w:rPr>
-        <w:t>is a</w:t>
-      </w:r>
-      <w:r>
-        <w:rPr>
-          <w:rFonts w:ascii="Courier New" w:hAnsi="Courier New" w:cs="Courier New"/>
-        </w:rPr>
-        <w:t xml:space="preserve"> dark muscular</w:t>
-      </w:r>
-      <w:r>
-        <w:rPr>
-          <w:rFonts w:ascii="Courier New" w:hAnsi="Courier New" w:cs="Courier New"/>
-          <w:b/>
-          <w:bCs/>
-        </w:rPr>
-        <w:t xml:space="preserve"> </w:t>
-      </w:r>
-      <w:r>
-        <w:rPr>
-          <w:rFonts w:ascii="Courier New" w:hAnsi="Courier New" w:cs="Courier New"/>
-        </w:rPr>
-        <w:t xml:space="preserve">creature </w:t>
-      </w:r>
-      <w:r>
-        <w:rPr>
-          <w:rFonts w:ascii="Courier New" w:hAnsi="Courier New" w:cs="Courier New"/>
-        </w:rPr>
-        <w:t>with</w:t>
-      </w:r>
-      <w:r>
-        <w:rPr>
-          <w:rFonts w:ascii="Courier New" w:hAnsi="Courier New" w:cs="Courier New"/>
-          <w:b/>
-          <w:bCs/>
-        </w:rPr>
-        <w:t xml:space="preserve"> l</w:t>
-      </w:r>
-      <w:r>
-        <w:rPr>
-          <w:rFonts w:ascii="Courier New" w:hAnsi="Courier New" w:cs="Courier New"/>
-          <w:b/>
-          <w:bCs/>
-        </w:rPr>
-        <w:t>ong</w:t>
-      </w:r>
-      <w:r>
-        <w:rPr>
-          <w:rFonts w:ascii="Courier New" w:hAnsi="Courier New" w:cs="Courier New"/>
-        </w:rPr>
-        <w:t xml:space="preserve"> </w:t>
-      </w:r>
-      <w:r>
-        <w:rPr>
-          <w:rFonts w:ascii="Courier New" w:hAnsi="Courier New" w:cs="Courier New"/>
-          <w:b/>
-          <w:bCs/>
-        </w:rPr>
-        <w:t xml:space="preserve">curly </w:t>
-      </w:r>
-      <w:r>
-        <w:rPr>
-          <w:rFonts w:ascii="Courier New" w:hAnsi="Courier New" w:cs="Courier New"/>
-          <w:b/>
-          <w:bCs/>
-        </w:rPr>
-        <w:t>hair</w:t>
-      </w:r>
-      <w:r>
-        <w:rPr>
-          <w:rFonts w:ascii="Courier New" w:hAnsi="Courier New" w:cs="Courier New"/>
-          <w:b/>
-          <w:bCs/>
-        </w:rPr>
-        <w:t xml:space="preserve"> </w:t>
-      </w:r>
-      <w:r>
-        <w:rPr>
-          <w:rFonts w:ascii="Courier New" w:hAnsi="Courier New" w:cs="Courier New"/>
-        </w:rPr>
-        <w:t xml:space="preserve">and </w:t>
-      </w:r>
-      <w:r>
-        <w:rPr>
-          <w:rFonts w:ascii="Courier New" w:hAnsi="Courier New" w:cs="Courier New"/>
-        </w:rPr>
-        <w:t>yellow-</w:t>
-      </w:r>
-      <w:r>
-        <w:rPr>
-          <w:rFonts w:ascii="Courier New" w:hAnsi="Courier New" w:cs="Courier New"/>
-        </w:rPr>
-        <w:t>r</w:t>
-      </w:r>
-      <w:r>
-        <w:rPr>
-          <w:rFonts w:ascii="Courier New" w:hAnsi="Courier New" w:cs="Courier New"/>
-        </w:rPr>
-        <w:t>ed glowing eyes</w:t>
-      </w:r>
-      <w:r>
-        <w:rPr>
-          <w:rFonts w:ascii="Courier New" w:hAnsi="Courier New" w:cs="Courier New"/>
-          <w:b/>
-          <w:bCs/>
-        </w:rPr>
-        <w:t xml:space="preserve">, </w:t>
-      </w:r>
-      <w:r>
-        <w:rPr>
-          <w:rFonts w:ascii="Courier New" w:hAnsi="Courier New" w:cs="Courier New"/>
-        </w:rPr>
-        <w:t>covered in</w:t>
-      </w:r>
-      <w:r>
-        <w:rPr>
-          <w:rFonts w:ascii="Courier New" w:hAnsi="Courier New" w:cs="Courier New"/>
-          <w:b/>
-          <w:bCs/>
-        </w:rPr>
-        <w:t xml:space="preserve"> s</w:t>
-      </w:r>
-      <w:r>
-        <w:rPr>
-          <w:rFonts w:ascii="Courier New" w:hAnsi="Courier New" w:cs="Courier New"/>
-          <w:b/>
-          <w:bCs/>
-        </w:rPr>
-        <w:t>ilver</w:t>
-      </w:r>
-      <w:r>
-        <w:rPr>
-          <w:rFonts w:ascii="Courier New" w:hAnsi="Courier New" w:cs="Courier New"/>
-          <w:b/>
-          <w:bCs/>
-        </w:rPr>
-        <w:t xml:space="preserve"> ornaments</w:t>
-      </w:r>
-      <w:bookmarkEnd w:id="13"/>
-      <w:r>
-        <w:rPr>
-          <w:rFonts w:ascii="Courier New" w:hAnsi="Courier New" w:cs="Courier New"/>
-        </w:rPr>
-        <w:t>.</w:t>
-      </w:r>
-    </w:p>
-    <w:p>
-      <w:pPr>
-        <w:spacing w:line="240" w:lineRule="auto"/>
-        <w:jc w:val="center"/>
-        <w:rPr>
-          <w:rFonts w:ascii="Courier New" w:hAnsi="Courier New" w:cs="Courier New"/>
-        </w:rPr>
-      </w:pPr>
-      <w:r>
-        <w:rPr>
-          <w:rFonts w:ascii="Courier New" w:hAnsi="Courier New" w:cs="Courier New"/>
-          <w:b/>
-          <w:bCs/>
-        </w:rPr>
         <w:t>YAMADHOOTHA</w:t>
       </w:r>
       <w:r>
@@ -49752,148 +50014,148 @@
           <w:b/>
           <w:bCs/>
         </w:rPr>
+        <w:t xml:space="preserve">ADI </w:t>
+      </w:r>
+      <w:r>
+        <w:rPr>
+          <w:rFonts w:ascii="Courier New" w:hAnsi="Courier New" w:cs="Courier New"/>
+          <w:i/>
+          <w:iCs/>
+        </w:rPr>
+        <w:t>(looking at the mirror)</w:t>
+      </w:r>
+      <w:r>
+        <w:rPr>
+          <w:rFonts w:ascii="Courier New" w:hAnsi="Courier New" w:cs="Courier New"/>
+          <w:i/>
+          <w:iCs/>
+        </w:rPr>
+        <w:br/>
+      </w:r>
+      <w:r>
+        <w:rPr>
+          <w:rFonts w:ascii="Courier New" w:hAnsi="Courier New" w:cs="Courier New"/>
+        </w:rPr>
+        <w:t>Kriti! Ved!</w:t>
+      </w:r>
+      <w:r>
+        <w:rPr>
+          <w:rFonts w:ascii="Courier New" w:hAnsi="Courier New" w:cs="Courier New"/>
+          <w:i/>
+          <w:iCs/>
+        </w:rPr>
+        <w:t xml:space="preserve"> </w:t>
+      </w:r>
+      <w:r>
+        <w:rPr>
+          <w:rFonts w:ascii="Courier New" w:hAnsi="Courier New" w:cs="Courier New"/>
+          <w:i/>
+          <w:iCs/>
+        </w:rPr>
+        <w:t>(</w:t>
+      </w:r>
+      <w:r>
+        <w:rPr>
+          <w:rFonts w:ascii="Courier New" w:hAnsi="Courier New" w:cs="Courier New"/>
+          <w:i/>
+          <w:iCs/>
+        </w:rPr>
+        <w:t>full of courage</w:t>
+      </w:r>
+      <w:r>
+        <w:rPr>
+          <w:rFonts w:ascii="Courier New" w:hAnsi="Courier New" w:cs="Courier New"/>
+          <w:i/>
+          <w:iCs/>
+        </w:rPr>
+        <w:t>)</w:t>
+      </w:r>
+      <w:r>
+        <w:rPr>
+          <w:rFonts w:ascii="Courier New" w:hAnsi="Courier New" w:cs="Courier New"/>
+        </w:rPr>
+        <w:br/>
+      </w:r>
+      <w:r>
+        <w:rPr>
+          <w:rFonts w:ascii="Courier New" w:hAnsi="Courier New" w:cs="Courier New"/>
+        </w:rPr>
+        <w:t>Naan</w:t>
+      </w:r>
+      <w:r>
+        <w:rPr>
+          <w:rFonts w:ascii="Courier New" w:hAnsi="Courier New" w:cs="Courier New"/>
+        </w:rPr>
+        <w:t xml:space="preserve">… naan </w:t>
+      </w:r>
+      <w:proofErr w:type="spellStart"/>
+      <w:r>
+        <w:rPr>
+          <w:rFonts w:ascii="Courier New" w:hAnsi="Courier New" w:cs="Courier New"/>
+        </w:rPr>
+        <w:t>nimna</w:t>
+      </w:r>
+      <w:proofErr w:type="spellEnd"/>
+      <w:r>
+        <w:rPr>
+          <w:rFonts w:ascii="Courier New" w:hAnsi="Courier New" w:cs="Courier New"/>
+        </w:rPr>
+        <w:t xml:space="preserve"> </w:t>
+      </w:r>
+      <w:proofErr w:type="spellStart"/>
+      <w:r>
+        <w:rPr>
+          <w:rFonts w:ascii="Courier New" w:hAnsi="Courier New" w:cs="Courier New"/>
+        </w:rPr>
+        <w:t>bittu</w:t>
+      </w:r>
+      <w:proofErr w:type="spellEnd"/>
+      <w:r>
+        <w:rPr>
+          <w:rFonts w:ascii="Courier New" w:hAnsi="Courier New" w:cs="Courier New"/>
+        </w:rPr>
+        <w:t xml:space="preserve"> </w:t>
+      </w:r>
+      <w:proofErr w:type="spellStart"/>
+      <w:r>
+        <w:rPr>
+          <w:rFonts w:ascii="Courier New" w:hAnsi="Courier New" w:cs="Courier New"/>
+        </w:rPr>
+        <w:t>elligu</w:t>
+      </w:r>
+      <w:proofErr w:type="spellEnd"/>
+      <w:r>
+        <w:rPr>
+          <w:rFonts w:ascii="Courier New" w:hAnsi="Courier New" w:cs="Courier New"/>
+        </w:rPr>
+        <w:t xml:space="preserve"> </w:t>
+      </w:r>
+      <w:proofErr w:type="spellStart"/>
+      <w:r>
+        <w:rPr>
+          <w:rFonts w:ascii="Courier New" w:hAnsi="Courier New" w:cs="Courier New"/>
+        </w:rPr>
+        <w:t>hogalla</w:t>
+      </w:r>
+      <w:proofErr w:type="spellEnd"/>
+    </w:p>
+    <w:p>
+      <w:pPr>
+        <w:spacing w:line="240" w:lineRule="auto"/>
+        <w:jc w:val="center"/>
+        <w:rPr>
+          <w:rFonts w:ascii="Courier New" w:hAnsi="Courier New" w:cs="Courier New"/>
+          <w:i/>
+          <w:iCs/>
+        </w:rPr>
+      </w:pPr>
+      <w:r>
+        <w:rPr>
+          <w:rFonts w:ascii="Courier New" w:hAnsi="Courier New" w:cs="Courier New"/>
+          <w:b/>
+          <w:bCs/>
+        </w:rPr>
         <w:lastRenderedPageBreak/>
-        <w:t xml:space="preserve">ADI </w:t>
-      </w:r>
-      <w:r>
-        <w:rPr>
-          <w:rFonts w:ascii="Courier New" w:hAnsi="Courier New" w:cs="Courier New"/>
-          <w:i/>
-          <w:iCs/>
-        </w:rPr>
-        <w:t>(looking at the mirror)</w:t>
-      </w:r>
-      <w:r>
-        <w:rPr>
-          <w:rFonts w:ascii="Courier New" w:hAnsi="Courier New" w:cs="Courier New"/>
-          <w:i/>
-          <w:iCs/>
-        </w:rPr>
-        <w:br/>
-      </w:r>
-      <w:r>
-        <w:rPr>
-          <w:rFonts w:ascii="Courier New" w:hAnsi="Courier New" w:cs="Courier New"/>
-        </w:rPr>
-        <w:t>Kriti! Ved!</w:t>
-      </w:r>
-      <w:r>
-        <w:rPr>
-          <w:rFonts w:ascii="Courier New" w:hAnsi="Courier New" w:cs="Courier New"/>
-          <w:i/>
-          <w:iCs/>
-        </w:rPr>
-        <w:t xml:space="preserve"> </w:t>
-      </w:r>
-      <w:r>
-        <w:rPr>
-          <w:rFonts w:ascii="Courier New" w:hAnsi="Courier New" w:cs="Courier New"/>
-          <w:i/>
-          <w:iCs/>
-        </w:rPr>
-        <w:t>(</w:t>
-      </w:r>
-      <w:r>
-        <w:rPr>
-          <w:rFonts w:ascii="Courier New" w:hAnsi="Courier New" w:cs="Courier New"/>
-          <w:i/>
-          <w:iCs/>
-        </w:rPr>
-        <w:t>full of courage</w:t>
-      </w:r>
-      <w:r>
-        <w:rPr>
-          <w:rFonts w:ascii="Courier New" w:hAnsi="Courier New" w:cs="Courier New"/>
-          <w:i/>
-          <w:iCs/>
-        </w:rPr>
-        <w:t>)</w:t>
-      </w:r>
-      <w:r>
-        <w:rPr>
-          <w:rFonts w:ascii="Courier New" w:hAnsi="Courier New" w:cs="Courier New"/>
-        </w:rPr>
-        <w:br/>
-      </w:r>
-      <w:r>
-        <w:rPr>
-          <w:rFonts w:ascii="Courier New" w:hAnsi="Courier New" w:cs="Courier New"/>
-        </w:rPr>
-        <w:t>Naan</w:t>
-      </w:r>
-      <w:r>
-        <w:rPr>
-          <w:rFonts w:ascii="Courier New" w:hAnsi="Courier New" w:cs="Courier New"/>
-        </w:rPr>
-        <w:t xml:space="preserve">… naan </w:t>
-      </w:r>
-      <w:proofErr w:type="spellStart"/>
-      <w:r>
-        <w:rPr>
-          <w:rFonts w:ascii="Courier New" w:hAnsi="Courier New" w:cs="Courier New"/>
-        </w:rPr>
-        <w:t>nimna</w:t>
-      </w:r>
-      <w:proofErr w:type="spellEnd"/>
-      <w:r>
-        <w:rPr>
-          <w:rFonts w:ascii="Courier New" w:hAnsi="Courier New" w:cs="Courier New"/>
-        </w:rPr>
-        <w:t xml:space="preserve"> </w:t>
-      </w:r>
-      <w:proofErr w:type="spellStart"/>
-      <w:r>
-        <w:rPr>
-          <w:rFonts w:ascii="Courier New" w:hAnsi="Courier New" w:cs="Courier New"/>
-        </w:rPr>
-        <w:t>bittu</w:t>
-      </w:r>
-      <w:proofErr w:type="spellEnd"/>
-      <w:r>
-        <w:rPr>
-          <w:rFonts w:ascii="Courier New" w:hAnsi="Courier New" w:cs="Courier New"/>
-        </w:rPr>
-        <w:t xml:space="preserve"> </w:t>
-      </w:r>
-      <w:proofErr w:type="spellStart"/>
-      <w:r>
-        <w:rPr>
-          <w:rFonts w:ascii="Courier New" w:hAnsi="Courier New" w:cs="Courier New"/>
-        </w:rPr>
-        <w:t>elligu</w:t>
-      </w:r>
-      <w:proofErr w:type="spellEnd"/>
-      <w:r>
-        <w:rPr>
-          <w:rFonts w:ascii="Courier New" w:hAnsi="Courier New" w:cs="Courier New"/>
-        </w:rPr>
-        <w:t xml:space="preserve"> </w:t>
-      </w:r>
-      <w:proofErr w:type="spellStart"/>
-      <w:r>
-        <w:rPr>
-          <w:rFonts w:ascii="Courier New" w:hAnsi="Courier New" w:cs="Courier New"/>
-        </w:rPr>
-        <w:t>hogalla</w:t>
-      </w:r>
-      <w:proofErr w:type="spellEnd"/>
-    </w:p>
-    <w:p>
-      <w:pPr>
-        <w:spacing w:line="240" w:lineRule="auto"/>
-        <w:jc w:val="center"/>
-        <w:rPr>
-          <w:rFonts w:ascii="Courier New" w:hAnsi="Courier New" w:cs="Courier New"/>
-          <w:i/>
-          <w:iCs/>
-        </w:rPr>
-      </w:pPr>
-      <w:r>
-        <w:rPr>
-          <w:rFonts w:ascii="Courier New" w:hAnsi="Courier New" w:cs="Courier New"/>
-          <w:b/>
-          <w:bCs/>
-        </w:rPr>
         <w:t>YAMADHOOTHA</w:t>
       </w:r>
       <w:r>
@@ -51951,7 +52213,6 @@
           <w:b/>
           <w:bCs/>
         </w:rPr>
-        <w:lastRenderedPageBreak/>
         <w:t>YAMADHOOTHA</w:t>
       </w:r>
       <w:r>
@@ -52053,6 +52314,7 @@
         <w:rPr>
           <w:rFonts w:ascii="Courier New" w:hAnsi="Courier New" w:cs="Courier New"/>
         </w:rPr>
+        <w:lastRenderedPageBreak/>
         <w:t xml:space="preserve">In the real world, Ved notices the photo of Adi shake. </w:t>
       </w:r>
       <w:r>

</xml_diff>